<commit_message>
add ranking and peichart
</commit_message>
<xml_diff>
--- a/demo/Mô tả chức năng.docx
+++ b/demo/Mô tả chức năng.docx
@@ -6699,17 +6699,2822 @@
     </w:p>
     <w:p>
       <w:pPr>
-        <w:ind w:left="720"/>
-        <w:rPr>
-          <w:lang w:val="vi-VN"/>
-        </w:rPr>
-      </w:pPr>
-    </w:p>
-    <w:p>
-      <w:pPr>
-        <w:rPr>
-          <w:lang w:val="vi-VN"/>
-        </w:rPr>
+        <w:rPr>
+          <w:lang w:val="vi-VN"/>
+        </w:rPr>
+      </w:pPr>
+      <w:r>
+        <w:rPr>
+          <w:lang w:val="vi-VN"/>
+        </w:rPr>
+        <w:br w:type="page"/>
+      </w:r>
+    </w:p>
+    <w:p>
+      <w:pPr>
+        <w:pStyle w:val="Heading1"/>
+        <w:pBdr>
+          <w:bottom w:val="double" w:sz="6" w:space="1" w:color="auto"/>
+        </w:pBdr>
+      </w:pPr>
+      <w:r>
+        <w:lastRenderedPageBreak/>
+        <w:t>MODULE 09 - DASHBOARD STATISTICS</w:t>
+      </w:r>
+    </w:p>
+    <w:p>
+      <w:pPr>
+        <w:ind w:left="720"/>
+        <w:rPr>
+          <w:b/>
+          <w:bCs/>
+        </w:rPr>
+      </w:pPr>
+      <w:r>
+        <w:rPr>
+          <w:b/>
+          <w:bCs/>
+        </w:rPr>
+        <w:t>MỤC TIÊU</w:t>
+      </w:r>
+    </w:p>
+    <w:p>
+      <w:pPr>
+        <w:ind w:left="720"/>
+      </w:pPr>
+      <w:r>
+        <w:t>Hiển thị số liệu tổng quan của hệ thống.</w:t>
+      </w:r>
+    </w:p>
+    <w:p>
+      <w:pPr>
+        <w:tabs>
+          <w:tab w:val="num" w:pos="720"/>
+        </w:tabs>
+        <w:ind w:left="720"/>
+      </w:pPr>
+      <w:r>
+        <w:t xml:space="preserve">Ví dụ:Tổng sinh </w:t>
+      </w:r>
+      <w:r>
+        <w:t>viên</w:t>
+      </w:r>
+      <w:r>
+        <w:rPr>
+          <w:lang w:val="vi-VN"/>
+        </w:rPr>
+        <w:t xml:space="preserve">, </w:t>
+      </w:r>
+      <w:r>
+        <w:t xml:space="preserve">Điểm trung </w:t>
+      </w:r>
+      <w:r>
+        <w:t>bình</w:t>
+      </w:r>
+      <w:r>
+        <w:rPr>
+          <w:lang w:val="vi-VN"/>
+        </w:rPr>
+        <w:t xml:space="preserve">, </w:t>
+      </w:r>
+      <w:r>
+        <w:t xml:space="preserve">Số sinh viên </w:t>
+      </w:r>
+      <w:r>
+        <w:t>giỏi</w:t>
+      </w:r>
+      <w:r>
+        <w:rPr>
+          <w:lang w:val="vi-VN"/>
+        </w:rPr>
+        <w:t xml:space="preserve">, </w:t>
+      </w:r>
+      <w:r>
+        <w:t>Điểm cao nhất</w:t>
+      </w:r>
+    </w:p>
+    <w:p>
+      <w:pPr>
+        <w:ind w:left="720"/>
+        <w:rPr>
+          <w:lang w:val="vi-VN"/>
+        </w:rPr>
+      </w:pPr>
+      <w:r>
+        <w:t>Tư duy Senior:</w:t>
+      </w:r>
+      <w:r>
+        <w:rPr>
+          <w:lang w:val="vi-VN"/>
+        </w:rPr>
+        <w:t xml:space="preserve"> </w:t>
+      </w:r>
+      <w:r>
+        <w:rPr>
+          <w:color w:val="EE0000"/>
+        </w:rPr>
+        <w:t>Không lấy toàn bộ dữ liệu rồi xử lý bằng Java.</w:t>
+      </w:r>
+      <w:r>
+        <w:rPr>
+          <w:color w:val="EE0000"/>
+          <w:lang w:val="vi-VN"/>
+        </w:rPr>
+        <w:t xml:space="preserve"> </w:t>
+      </w:r>
+      <w:r>
+        <w:rPr>
+          <w:color w:val="EE0000"/>
+          <w:lang w:val="vi-VN"/>
+        </w:rPr>
+        <w:t>Đẩy việc thống kê xuống Database.</w:t>
+      </w:r>
+      <w:r>
+        <w:rPr>
+          <w:color w:val="EE0000"/>
+          <w:lang w:val="vi-VN"/>
+        </w:rPr>
+        <w:t xml:space="preserve"> </w:t>
+      </w:r>
+      <w:r>
+        <w:rPr>
+          <w:color w:val="EE0000"/>
+        </w:rPr>
+        <w:t>Database tính toán.</w:t>
+      </w:r>
+      <w:r>
+        <w:rPr>
+          <w:color w:val="EE0000"/>
+          <w:lang w:val="vi-VN"/>
+        </w:rPr>
+        <w:t xml:space="preserve"> </w:t>
+      </w:r>
+      <w:r>
+        <w:t>Java chỉ nhận kết quả cuối.</w:t>
+      </w:r>
+    </w:p>
+    <w:p>
+      <w:pPr>
+        <w:pStyle w:val="Heading2"/>
+        <w:numPr>
+          <w:ilvl w:val="0"/>
+          <w:numId w:val="20"/>
+        </w:numPr>
+      </w:pPr>
+      <w:r>
+        <w:t>PHẦN 1 - BACKEND</w:t>
+      </w:r>
+    </w:p>
+    <w:p>
+      <w:pPr>
+        <w:pStyle w:val="Heading3"/>
+        <w:numPr>
+          <w:ilvl w:val="0"/>
+          <w:numId w:val="21"/>
+        </w:numPr>
+      </w:pPr>
+      <w:r>
+        <w:t>DashboardResponse</w:t>
+      </w:r>
+    </w:p>
+    <w:p>
+      <w:pPr>
+        <w:ind w:left="720"/>
+      </w:pPr>
+      <w:r>
+        <w:t>Chức năng:</w:t>
+      </w:r>
+      <w:r>
+        <w:rPr>
+          <w:lang w:val="vi-VN"/>
+        </w:rPr>
+        <w:t xml:space="preserve"> </w:t>
+      </w:r>
+      <w:r>
+        <w:t>Chứa dữ liệu thống kê trả về cho Frontend.</w:t>
+      </w:r>
+    </w:p>
+    <w:p>
+      <w:pPr>
+        <w:ind w:left="720"/>
+      </w:pPr>
+      <w:r>
+        <w:t>Field:</w:t>
+      </w:r>
+      <w:r>
+        <w:rPr>
+          <w:lang w:val="vi-VN"/>
+        </w:rPr>
+        <w:t xml:space="preserve"> </w:t>
+      </w:r>
+      <w:r>
+        <w:t>Long to</w:t>
+      </w:r>
+      <w:r>
+        <w:t>ngSinhVien</w:t>
+      </w:r>
+      <w:r>
+        <w:rPr>
+          <w:lang w:val="vi-VN"/>
+        </w:rPr>
+        <w:t xml:space="preserve">, </w:t>
+      </w:r>
+      <w:r>
+        <w:t xml:space="preserve">Double </w:t>
+      </w:r>
+      <w:r>
+        <w:t>dtb</w:t>
+      </w:r>
+      <w:r>
+        <w:rPr>
+          <w:lang w:val="vi-VN"/>
+        </w:rPr>
+        <w:t xml:space="preserve">, </w:t>
+      </w:r>
+      <w:r>
+        <w:t>Long si</w:t>
+      </w:r>
+      <w:r>
+        <w:t>nhVienGioi</w:t>
+      </w:r>
+      <w:r>
+        <w:rPr>
+          <w:lang w:val="vi-VN"/>
+        </w:rPr>
+        <w:t xml:space="preserve">, </w:t>
+      </w:r>
+      <w:r>
+        <w:t>Double diemCaoNhat</w:t>
+      </w:r>
+    </w:p>
+    <w:p>
+      <w:pPr>
+        <w:ind w:left="720"/>
+        <w:rPr>
+          <w:lang w:val="vi-VN"/>
+        </w:rPr>
+      </w:pPr>
+      <w:r>
+        <w:pict w14:anchorId="2E175240">
+          <v:rect id="_x0000_i1048" style="width:0;height:1.5pt" o:hralign="center" o:hrstd="t" o:hr="t" fillcolor="#a0a0a0" stroked="f"/>
+        </w:pict>
+      </w:r>
+    </w:p>
+    <w:p>
+      <w:pPr>
+        <w:pStyle w:val="Heading3"/>
+      </w:pPr>
+      <w:r>
+        <w:t>SinhVienRepository</w:t>
+      </w:r>
+    </w:p>
+    <w:p>
+      <w:pPr>
+        <w:ind w:left="720"/>
+      </w:pPr>
+      <w:r>
+        <w:t>Mục tiêu:</w:t>
+      </w:r>
+      <w:r>
+        <w:rPr>
+          <w:lang w:val="vi-VN"/>
+        </w:rPr>
+        <w:t xml:space="preserve"> </w:t>
+      </w:r>
+      <w:r>
+        <w:t>Viết Aggregate Query.</w:t>
+      </w:r>
+    </w:p>
+    <w:p>
+      <w:pPr>
+        <w:ind w:left="720"/>
+      </w:pPr>
+      <w:r>
+        <w:t>a. Tổng sinh viên</w:t>
+      </w:r>
+    </w:p>
+    <w:p>
+      <w:pPr>
+        <w:ind w:left="720"/>
+      </w:pPr>
+      <w:r>
+        <w:t>Method:</w:t>
+      </w:r>
+      <w:r>
+        <w:rPr>
+          <w:lang w:val="vi-VN"/>
+        </w:rPr>
+        <w:t xml:space="preserve"> </w:t>
+      </w:r>
+      <w:r>
+        <w:t>count()</w:t>
+      </w:r>
+    </w:p>
+    <w:p>
+      <w:pPr>
+        <w:ind w:left="720"/>
+      </w:pPr>
+      <w:r>
+        <w:t>Spring Data JPA có sẵn.</w:t>
+      </w:r>
+    </w:p>
+    <w:p>
+      <w:pPr>
+        <w:ind w:left="720"/>
+      </w:pPr>
+      <w:r>
+        <w:pict w14:anchorId="4FBB3552">
+          <v:rect id="_x0000_i1049" style="width:0;height:1.5pt" o:hralign="center" o:hrstd="t" o:hr="t" fillcolor="#a0a0a0" stroked="f"/>
+        </w:pict>
+      </w:r>
+    </w:p>
+    <w:p>
+      <w:pPr>
+        <w:ind w:left="720"/>
+        <w:rPr>
+          <w:lang w:val="de-DE"/>
+        </w:rPr>
+      </w:pPr>
+      <w:r>
+        <w:rPr>
+          <w:lang w:val="de-DE"/>
+        </w:rPr>
+        <w:t>b. Điểm trung bình</w:t>
+      </w:r>
+    </w:p>
+    <w:p>
+      <w:pPr>
+        <w:ind w:left="720"/>
+        <w:rPr>
+          <w:lang w:val="de-DE"/>
+        </w:rPr>
+      </w:pPr>
+      <w:r>
+        <w:rPr>
+          <w:lang w:val="de-DE"/>
+        </w:rPr>
+        <w:t>Method:</w:t>
+      </w:r>
+    </w:p>
+    <w:p>
+      <w:pPr>
+        <w:ind w:left="720"/>
+      </w:pPr>
+      <w:r>
+        <w:t>@Query("""</w:t>
+      </w:r>
+      <w:r>
+        <w:br/>
+        <w:t>SELECT AVG(s.dtb)</w:t>
+      </w:r>
+      <w:r>
+        <w:br/>
+        <w:t>FROM SinhVienEntity s</w:t>
+      </w:r>
+      <w:r>
+        <w:br/>
+        <w:t>""")</w:t>
+      </w:r>
+      <w:r>
+        <w:br/>
+        <w:t>Double getAvgSinhVien();</w:t>
+      </w:r>
+    </w:p>
+    <w:p>
+      <w:pPr>
+        <w:ind w:left="720"/>
+      </w:pPr>
+      <w:r>
+        <w:t>Từ khóa:</w:t>
+      </w:r>
+      <w:r>
+        <w:rPr>
+          <w:lang w:val="vi-VN"/>
+        </w:rPr>
+        <w:t xml:space="preserve"> </w:t>
+      </w:r>
+      <w:r>
+        <w:t>AVG()</w:t>
+      </w:r>
+    </w:p>
+    <w:p>
+      <w:pPr>
+        <w:ind w:left="720"/>
+      </w:pPr>
+      <w:r>
+        <w:pict w14:anchorId="5BF95CFC">
+          <v:rect id="_x0000_i1050" style="width:0;height:1.5pt" o:hralign="center" o:hrstd="t" o:hr="t" fillcolor="#a0a0a0" stroked="f"/>
+        </w:pict>
+      </w:r>
+    </w:p>
+    <w:p>
+      <w:pPr>
+        <w:ind w:left="720"/>
+      </w:pPr>
+      <w:r>
+        <w:t>c. Sinh viên giỏi</w:t>
+      </w:r>
+    </w:p>
+    <w:p>
+      <w:pPr>
+        <w:ind w:left="720"/>
+      </w:pPr>
+      <w:r>
+        <w:t>Điều kiện:</w:t>
+      </w:r>
+    </w:p>
+    <w:p>
+      <w:pPr>
+        <w:ind w:left="720"/>
+      </w:pPr>
+      <w:r>
+        <w:t>dtb &gt;= 8</w:t>
+      </w:r>
+    </w:p>
+    <w:p>
+      <w:pPr>
+        <w:ind w:left="720"/>
+      </w:pPr>
+      <w:r>
+        <w:t>Method:</w:t>
+      </w:r>
+    </w:p>
+    <w:p>
+      <w:pPr>
+        <w:ind w:left="720"/>
+      </w:pPr>
+      <w:r>
+        <w:lastRenderedPageBreak/>
+        <w:t>@Query("""</w:t>
+      </w:r>
+      <w:r>
+        <w:br/>
+        <w:t>SELECT COUNT(s)</w:t>
+      </w:r>
+      <w:r>
+        <w:br/>
+        <w:t>FROM SinhVienEntity s</w:t>
+      </w:r>
+      <w:r>
+        <w:br/>
+        <w:t>WHERE s.dtb &gt;= 8</w:t>
+      </w:r>
+      <w:r>
+        <w:br/>
+        <w:t>""")</w:t>
+      </w:r>
+      <w:r>
+        <w:br/>
+        <w:t>Long getSinhVienGioi();</w:t>
+      </w:r>
+    </w:p>
+    <w:p>
+      <w:pPr>
+        <w:ind w:left="720"/>
+      </w:pPr>
+      <w:r>
+        <w:t>Từ khóa:</w:t>
+      </w:r>
+      <w:r>
+        <w:rPr>
+          <w:lang w:val="vi-VN"/>
+        </w:rPr>
+        <w:t xml:space="preserve"> </w:t>
+      </w:r>
+      <w:r>
+        <w:t>COUNT()</w:t>
+      </w:r>
+      <w:r>
+        <w:rPr>
+          <w:lang w:val="vi-VN"/>
+        </w:rPr>
+        <w:t xml:space="preserve"> </w:t>
+      </w:r>
+      <w:r>
+        <w:t>WHERE</w:t>
+      </w:r>
+    </w:p>
+    <w:p>
+      <w:pPr>
+        <w:ind w:left="720"/>
+      </w:pPr>
+      <w:r>
+        <w:pict w14:anchorId="0871135B">
+          <v:rect id="_x0000_i1051" style="width:0;height:1.5pt" o:hralign="center" o:hrstd="t" o:hr="t" fillcolor="#a0a0a0" stroked="f"/>
+        </w:pict>
+      </w:r>
+    </w:p>
+    <w:p>
+      <w:pPr>
+        <w:ind w:left="720"/>
+      </w:pPr>
+      <w:r>
+        <w:t>d. Điểm cao nhất</w:t>
+      </w:r>
+    </w:p>
+    <w:p>
+      <w:pPr>
+        <w:ind w:left="720"/>
+      </w:pPr>
+      <w:r>
+        <w:t>Method:</w:t>
+      </w:r>
+    </w:p>
+    <w:p>
+      <w:pPr>
+        <w:ind w:left="720"/>
+      </w:pPr>
+      <w:r>
+        <w:t>@Query("""</w:t>
+      </w:r>
+      <w:r>
+        <w:br/>
+        <w:t>SELECT MAX(s.dtb)</w:t>
+      </w:r>
+      <w:r>
+        <w:br/>
+        <w:t>FROM SinhVienEntity s</w:t>
+      </w:r>
+      <w:r>
+        <w:br/>
+        <w:t>""")</w:t>
+      </w:r>
+      <w:r>
+        <w:br/>
+        <w:t>Double getDiemCaoNhat();</w:t>
+      </w:r>
+    </w:p>
+    <w:p>
+      <w:pPr>
+        <w:ind w:left="720"/>
+        <w:rPr>
+          <w:lang w:val="vi-VN"/>
+        </w:rPr>
+      </w:pPr>
+      <w:r>
+        <w:t>Từ khóa:</w:t>
+      </w:r>
+      <w:r>
+        <w:rPr>
+          <w:lang w:val="vi-VN"/>
+        </w:rPr>
+        <w:t xml:space="preserve"> </w:t>
+      </w:r>
+      <w:r>
+        <w:t>MAX()</w:t>
+      </w:r>
+    </w:p>
+    <w:p>
+      <w:pPr>
+        <w:pStyle w:val="Heading3"/>
+      </w:pPr>
+      <w:r>
+        <w:t>SinhVienServiceImpl</w:t>
+      </w:r>
+    </w:p>
+    <w:p>
+      <w:pPr>
+        <w:ind w:left="720"/>
+      </w:pPr>
+      <w:r>
+        <w:t>Method:</w:t>
+      </w:r>
+      <w:r>
+        <w:rPr>
+          <w:lang w:val="vi-VN"/>
+        </w:rPr>
+        <w:t xml:space="preserve"> </w:t>
+      </w:r>
+      <w:r>
+        <w:t>dashBoard()</w:t>
+      </w:r>
+    </w:p>
+    <w:p>
+      <w:pPr>
+        <w:ind w:left="720"/>
+      </w:pPr>
+      <w:r>
+        <w:t>Flow:</w:t>
+      </w:r>
+      <w:r>
+        <w:rPr>
+          <w:lang w:val="vi-VN"/>
+        </w:rPr>
+        <w:t xml:space="preserve"> </w:t>
+      </w:r>
+      <w:r>
+        <w:t>Repository</w:t>
+      </w:r>
+      <w:r>
+        <w:rPr>
+          <w:lang w:val="vi-VN"/>
+        </w:rPr>
+        <w:t>-&gt;</w:t>
+      </w:r>
+      <w:r>
+        <w:t>COUNT</w:t>
+      </w:r>
+      <w:r>
+        <w:rPr>
+          <w:lang w:val="vi-VN"/>
+        </w:rPr>
+        <w:t>-&gt;</w:t>
+      </w:r>
+      <w:r>
+        <w:t>AVG</w:t>
+      </w:r>
+      <w:r>
+        <w:rPr>
+          <w:lang w:val="vi-VN"/>
+        </w:rPr>
+        <w:t>-&gt;</w:t>
+      </w:r>
+      <w:r>
+        <w:t>MAX</w:t>
+      </w:r>
+      <w:r>
+        <w:rPr>
+          <w:lang w:val="vi-VN"/>
+        </w:rPr>
+        <w:t>-&gt;</w:t>
+      </w:r>
+      <w:r>
+        <w:t>Dashboa</w:t>
+      </w:r>
+      <w:r>
+        <w:t>rdResponse</w:t>
+      </w:r>
+      <w:r>
+        <w:rPr>
+          <w:lang w:val="vi-VN"/>
+        </w:rPr>
+        <w:t>-&gt;</w:t>
+      </w:r>
+      <w:r>
+        <w:t>ApiResponse</w:t>
+      </w:r>
+    </w:p>
+    <w:p>
+      <w:pPr>
+        <w:ind w:left="720"/>
+      </w:pPr>
+      <w:r>
+        <w:t>Code tư duy:</w:t>
+      </w:r>
+    </w:p>
+    <w:p>
+      <w:pPr>
+        <w:ind w:left="720"/>
+      </w:pPr>
+      <w:r>
+        <w:t>response.setTongSinhVien(...)</w:t>
+      </w:r>
+    </w:p>
+    <w:p>
+      <w:pPr>
+        <w:ind w:left="720"/>
+      </w:pPr>
+      <w:r>
+        <w:t>response.setDtb(...)</w:t>
+      </w:r>
+    </w:p>
+    <w:p>
+      <w:pPr>
+        <w:ind w:left="720"/>
+      </w:pPr>
+      <w:r>
+        <w:t>response.setSinhVienGioi(...)</w:t>
+      </w:r>
+    </w:p>
+    <w:p>
+      <w:pPr>
+        <w:ind w:left="720"/>
+      </w:pPr>
+      <w:r>
+        <w:t>response.setDiemCaoNhat(...)</w:t>
+      </w:r>
+    </w:p>
+    <w:p>
+      <w:pPr>
+        <w:ind w:left="720"/>
+      </w:pPr>
+      <w:r>
+        <w:pict w14:anchorId="75003B6F">
+          <v:rect id="_x0000_i1052" style="width:0;height:1.5pt" o:hralign="center" o:hrstd="t" o:hr="t" fillcolor="#a0a0a0" stroked="f"/>
+        </w:pict>
+      </w:r>
+    </w:p>
+    <w:p>
+      <w:pPr>
+        <w:ind w:left="720"/>
+      </w:pPr>
+      <w:r>
+        <w:t>Lưu ý:</w:t>
+      </w:r>
+    </w:p>
+    <w:p>
+      <w:pPr>
+        <w:ind w:left="720"/>
+      </w:pPr>
+      <w:r>
+        <w:t>COUNT()</w:t>
+      </w:r>
+      <w:r>
+        <w:rPr>
+          <w:lang w:val="vi-VN"/>
+        </w:rPr>
+        <w:t xml:space="preserve"> </w:t>
+      </w:r>
+      <w:r>
+        <w:t>không trả null</w:t>
+      </w:r>
+    </w:p>
+    <w:p>
+      <w:pPr>
+        <w:ind w:left="720"/>
+      </w:pPr>
+      <w:r>
+        <w:t>AVG()</w:t>
+      </w:r>
+      <w:r>
+        <w:rPr>
+          <w:lang w:val="vi-VN"/>
+        </w:rPr>
+        <w:t xml:space="preserve"> </w:t>
+      </w:r>
+      <w:r>
+        <w:t>có thể trả null</w:t>
+      </w:r>
+    </w:p>
+    <w:p>
+      <w:pPr>
+        <w:ind w:left="720"/>
+      </w:pPr>
+      <w:r>
+        <w:t>MAX()</w:t>
+      </w:r>
+      <w:r>
+        <w:rPr>
+          <w:lang w:val="vi-VN"/>
+        </w:rPr>
+        <w:t xml:space="preserve"> </w:t>
+      </w:r>
+      <w:r>
+        <w:t>có thể trả null</w:t>
+      </w:r>
+    </w:p>
+    <w:p>
+      <w:pPr>
+        <w:pBdr>
+          <w:bottom w:val="double" w:sz="6" w:space="1" w:color="auto"/>
+        </w:pBdr>
+        <w:ind w:left="720"/>
+        <w:rPr>
+          <w:lang w:val="vi-VN"/>
+        </w:rPr>
+      </w:pPr>
+      <w:r>
+        <w:t>Nên:</w:t>
+      </w:r>
+      <w:r>
+        <w:rPr>
+          <w:lang w:val="vi-VN"/>
+        </w:rPr>
+        <w:t xml:space="preserve"> </w:t>
+      </w:r>
+      <w:r>
+        <w:t>AVG và MAX cần xử lý null.</w:t>
+      </w:r>
+    </w:p>
+    <w:p>
+      <w:pPr>
+        <w:pStyle w:val="Heading3"/>
+      </w:pPr>
+      <w:r>
+        <w:t>Controller</w:t>
+      </w:r>
+    </w:p>
+    <w:p>
+      <w:pPr>
+        <w:ind w:left="720"/>
+      </w:pPr>
+      <w:r>
+        <w:t>API:</w:t>
+      </w:r>
+      <w:r>
+        <w:rPr>
+          <w:lang w:val="vi-VN"/>
+        </w:rPr>
+        <w:t xml:space="preserve"> </w:t>
+      </w:r>
+      <w:r>
+        <w:t>GET /sinhvien/dashboard</w:t>
+      </w:r>
+    </w:p>
+    <w:p>
+      <w:pPr>
+        <w:pBdr>
+          <w:bottom w:val="double" w:sz="6" w:space="1" w:color="auto"/>
+        </w:pBdr>
+        <w:ind w:left="720"/>
+        <w:rPr>
+          <w:lang w:val="vi-VN"/>
+        </w:rPr>
+      </w:pPr>
+      <w:r>
+        <w:lastRenderedPageBreak/>
+        <w:t>Flow:</w:t>
+      </w:r>
+      <w:r>
+        <w:rPr>
+          <w:lang w:val="vi-VN"/>
+        </w:rPr>
+        <w:t xml:space="preserve"> </w:t>
+      </w:r>
+      <w:r>
+        <w:t>Frontend</w:t>
+      </w:r>
+      <w:r>
+        <w:rPr>
+          <w:lang w:val="vi-VN"/>
+        </w:rPr>
+        <w:t>-&gt;</w:t>
+      </w:r>
+      <w:r>
+        <w:t>Controller</w:t>
+      </w:r>
+      <w:r>
+        <w:rPr>
+          <w:lang w:val="vi-VN"/>
+        </w:rPr>
+        <w:t>-&gt;</w:t>
+      </w:r>
+      <w:r>
+        <w:t>Service</w:t>
+      </w:r>
+      <w:r>
+        <w:rPr>
+          <w:lang w:val="vi-VN"/>
+        </w:rPr>
+        <w:t>-&gt;</w:t>
+      </w:r>
+      <w:r>
+        <w:t>Repository</w:t>
+      </w:r>
+      <w:r>
+        <w:rPr>
+          <w:lang w:val="vi-VN"/>
+        </w:rPr>
+        <w:t>-&gt;</w:t>
+      </w:r>
+      <w:r>
+        <w:t>Database</w:t>
+      </w:r>
+    </w:p>
+    <w:p>
+      <w:pPr>
+        <w:pStyle w:val="Heading2"/>
+      </w:pPr>
+      <w:r>
+        <w:t>PHẦN 2 - FRONTEND</w:t>
+      </w:r>
+    </w:p>
+    <w:p>
+      <w:pPr>
+        <w:pStyle w:val="Heading3"/>
+      </w:pPr>
+      <w:r>
+        <w:t>dashboardService.js</w:t>
+      </w:r>
+    </w:p>
+    <w:p>
+      <w:pPr>
+        <w:ind w:left="720"/>
+      </w:pPr>
+      <w:r>
+        <w:t>Chức năng:</w:t>
+      </w:r>
+      <w:r>
+        <w:rPr>
+          <w:lang w:val="vi-VN"/>
+        </w:rPr>
+        <w:t xml:space="preserve"> </w:t>
+      </w:r>
+      <w:r>
+        <w:t>Gọi API Dashboard.</w:t>
+      </w:r>
+    </w:p>
+    <w:p>
+      <w:pPr>
+        <w:ind w:left="720"/>
+      </w:pPr>
+      <w:r>
+        <w:t>Method:</w:t>
+      </w:r>
+      <w:r>
+        <w:rPr>
+          <w:lang w:val="vi-VN"/>
+        </w:rPr>
+        <w:t xml:space="preserve"> </w:t>
+      </w:r>
+      <w:r>
+        <w:t>getDashboard()</w:t>
+      </w:r>
+    </w:p>
+    <w:p>
+      <w:pPr>
+        <w:pBdr>
+          <w:bottom w:val="double" w:sz="6" w:space="1" w:color="auto"/>
+        </w:pBdr>
+        <w:ind w:left="720"/>
+        <w:rPr>
+          <w:lang w:val="vi-VN"/>
+        </w:rPr>
+      </w:pPr>
+      <w:r>
+        <w:t>Flow:</w:t>
+      </w:r>
+      <w:r>
+        <w:rPr>
+          <w:lang w:val="vi-VN"/>
+        </w:rPr>
+        <w:t xml:space="preserve"> </w:t>
+      </w:r>
+      <w:r>
+        <w:t>React</w:t>
+      </w:r>
+      <w:r>
+        <w:rPr>
+          <w:lang w:val="vi-VN"/>
+        </w:rPr>
+        <w:t xml:space="preserve"> -&gt; </w:t>
+      </w:r>
+      <w:r>
+        <w:t>Axios</w:t>
+      </w:r>
+      <w:r>
+        <w:rPr>
+          <w:lang w:val="vi-VN"/>
+        </w:rPr>
+        <w:t xml:space="preserve"> -&gt; </w:t>
+      </w:r>
+      <w:r>
+        <w:t>GET /sinhvien/dashboard</w:t>
+      </w:r>
+    </w:p>
+    <w:p>
+      <w:pPr>
+        <w:pStyle w:val="Heading3"/>
+      </w:pPr>
+      <w:r>
+        <w:t>useDashboardQuery</w:t>
+      </w:r>
+    </w:p>
+    <w:p>
+      <w:pPr>
+        <w:ind w:left="720"/>
+      </w:pPr>
+      <w:r>
+        <w:t>Chức năng:</w:t>
+      </w:r>
+      <w:r>
+        <w:rPr>
+          <w:lang w:val="vi-VN"/>
+        </w:rPr>
+        <w:t xml:space="preserve"> </w:t>
+      </w:r>
+      <w:r>
+        <w:t>React Query lấy dữ liệu Dashboard.</w:t>
+      </w:r>
+    </w:p>
+    <w:p>
+      <w:pPr>
+        <w:ind w:left="720"/>
+      </w:pPr>
+      <w:r>
+        <w:t>Query Key:['dashboard']</w:t>
+      </w:r>
+    </w:p>
+    <w:p>
+      <w:pPr>
+        <w:ind w:left="720"/>
+      </w:pPr>
+      <w:r>
+        <w:t>Tư duy:</w:t>
+      </w:r>
+      <w:r>
+        <w:rPr>
+          <w:lang w:val="vi-VN"/>
+        </w:rPr>
+        <w:t xml:space="preserve"> </w:t>
+      </w:r>
+      <w:r>
+        <w:t>Dashboard không có:</w:t>
+      </w:r>
+      <w:r>
+        <w:rPr>
+          <w:lang w:val="vi-VN"/>
+        </w:rPr>
+        <w:t xml:space="preserve"> </w:t>
+      </w:r>
+      <w:r>
+        <w:t>page</w:t>
+      </w:r>
+      <w:r>
+        <w:rPr>
+          <w:lang w:val="vi-VN"/>
+        </w:rPr>
+        <w:t xml:space="preserve">, </w:t>
+      </w:r>
+      <w:r>
+        <w:t>size</w:t>
+      </w:r>
+      <w:r>
+        <w:rPr>
+          <w:lang w:val="vi-VN"/>
+        </w:rPr>
+        <w:t xml:space="preserve">, </w:t>
+      </w:r>
+      <w:r>
+        <w:t>keyword</w:t>
+      </w:r>
+    </w:p>
+    <w:p>
+      <w:pPr>
+        <w:pBdr>
+          <w:bottom w:val="double" w:sz="6" w:space="1" w:color="auto"/>
+        </w:pBdr>
+        <w:ind w:left="720"/>
+        <w:rPr>
+          <w:lang w:val="vi-VN"/>
+        </w:rPr>
+      </w:pPr>
+      <w:r>
+        <w:t>Nên chỉ cần:['dashboard']</w:t>
+      </w:r>
+    </w:p>
+    <w:p>
+      <w:pPr>
+        <w:pStyle w:val="Heading3"/>
+      </w:pPr>
+      <w:r>
+        <w:t>AdminPage</w:t>
+      </w:r>
+    </w:p>
+    <w:p>
+      <w:pPr>
+        <w:ind w:left="720"/>
+      </w:pPr>
+      <w:r>
+        <w:t>Flow:</w:t>
+      </w:r>
+      <w:r>
+        <w:rPr>
+          <w:lang w:val="vi-VN"/>
+        </w:rPr>
+        <w:t xml:space="preserve"> </w:t>
+      </w:r>
+      <w:r>
+        <w:t>useDashboardQuery()</w:t>
+      </w:r>
+      <w:r>
+        <w:rPr>
+          <w:lang w:val="vi-VN"/>
+        </w:rPr>
+        <w:t>-&gt;</w:t>
+      </w:r>
+      <w:r>
+        <w:t>data</w:t>
+      </w:r>
+      <w:r>
+        <w:rPr>
+          <w:lang w:val="vi-VN"/>
+        </w:rPr>
+        <w:t>-&gt;</w:t>
+      </w:r>
+      <w:r>
+        <w:t>cards[]</w:t>
+      </w:r>
+      <w:r>
+        <w:rPr>
+          <w:lang w:val="vi-VN"/>
+        </w:rPr>
+        <w:t>-&gt;</w:t>
+      </w:r>
+      <w:r>
+        <w:t>map()</w:t>
+      </w:r>
+      <w:r>
+        <w:rPr>
+          <w:lang w:val="vi-VN"/>
+        </w:rPr>
+        <w:t>-&gt;</w:t>
+      </w:r>
+      <w:r>
+        <w:t>DashboardCard</w:t>
+      </w:r>
+    </w:p>
+    <w:p>
+      <w:pPr>
+        <w:ind w:left="720"/>
+      </w:pPr>
+      <w:r>
+        <w:t>Tư duy Senior:</w:t>
+      </w:r>
+    </w:p>
+    <w:p>
+      <w:pPr>
+        <w:ind w:left="720"/>
+      </w:pPr>
+      <w:r>
+        <w:t>Không viết:</w:t>
+      </w:r>
+      <w:r>
+        <w:rPr>
+          <w:lang w:val="vi-VN"/>
+        </w:rPr>
+        <w:t xml:space="preserve"> </w:t>
+      </w:r>
+      <w:r>
+        <w:t>Nhiều lần.</w:t>
+      </w:r>
+    </w:p>
+    <w:p>
+      <w:pPr>
+        <w:ind w:left="720"/>
+      </w:pPr>
+      <w:r>
+        <w:t>Nên tạo:</w:t>
+      </w:r>
+      <w:r>
+        <w:rPr>
+          <w:lang w:val="vi-VN"/>
+        </w:rPr>
+        <w:t xml:space="preserve"> </w:t>
+      </w:r>
+      <w:r>
+        <w:t>const cards = [...]</w:t>
+      </w:r>
+    </w:p>
+    <w:p>
+      <w:pPr>
+        <w:pBdr>
+          <w:bottom w:val="double" w:sz="6" w:space="1" w:color="auto"/>
+        </w:pBdr>
+        <w:ind w:left="720"/>
+      </w:pPr>
+      <w:r>
+        <w:t>rồi:</w:t>
+      </w:r>
+      <w:r>
+        <w:rPr>
+          <w:lang w:val="vi-VN"/>
+        </w:rPr>
+        <w:t xml:space="preserve"> </w:t>
+      </w:r>
+      <w:r>
+        <w:t>cards.map(...)</w:t>
+      </w:r>
+    </w:p>
+    <w:p>
+      <w:pPr>
+        <w:pStyle w:val="Heading3"/>
+      </w:pPr>
+      <w:r>
+        <w:t>DashboardCard</w:t>
+      </w:r>
+    </w:p>
+    <w:p>
+      <w:pPr>
+        <w:ind w:left="720"/>
+      </w:pPr>
+      <w:r>
+        <w:t>Props:</w:t>
+      </w:r>
+      <w:r>
+        <w:rPr>
+          <w:lang w:val="vi-VN"/>
+        </w:rPr>
+        <w:t xml:space="preserve"> </w:t>
+      </w:r>
+      <w:r>
+        <w:t>title</w:t>
+      </w:r>
+      <w:r>
+        <w:rPr>
+          <w:lang w:val="vi-VN"/>
+        </w:rPr>
+        <w:t xml:space="preserve">, </w:t>
+      </w:r>
+      <w:r>
+        <w:t>value</w:t>
+      </w:r>
+      <w:r>
+        <w:rPr>
+          <w:lang w:val="vi-VN"/>
+        </w:rPr>
+        <w:t xml:space="preserve">, </w:t>
+      </w:r>
+      <w:r>
+        <w:t>icon</w:t>
+      </w:r>
+      <w:r>
+        <w:rPr>
+          <w:lang w:val="vi-VN"/>
+        </w:rPr>
+        <w:t xml:space="preserve">, </w:t>
+      </w:r>
+      <w:r>
+        <w:t>color</w:t>
+      </w:r>
+    </w:p>
+    <w:p>
+      <w:pPr>
+        <w:ind w:left="720"/>
+      </w:pPr>
+      <w:r>
+        <w:t>Ví dụ:</w:t>
+      </w:r>
+    </w:p>
+    <w:p>
+      <w:pPr>
+        <w:pBdr>
+          <w:bottom w:val="double" w:sz="6" w:space="1" w:color="auto"/>
+        </w:pBdr>
+        <w:ind w:left="720"/>
+      </w:pPr>
+      <w:r>
+        <w:t>&lt;DashboardCard</w:t>
+      </w:r>
+      <w:r>
+        <w:br/>
+        <w:t>title="Tổng số sinh viên"</w:t>
+      </w:r>
+      <w:r>
+        <w:br/>
+        <w:t>value={11}</w:t>
+      </w:r>
+      <w:r>
+        <w:br/>
+        <w:t>icon={}</w:t>
+      </w:r>
+      <w:r>
+        <w:br/>
+        <w:t>color="#3b82f6"</w:t>
+      </w:r>
+      <w:r>
+        <w:br/>
+        <w:t>/&gt;</w:t>
+      </w:r>
+    </w:p>
+    <w:p>
+      <w:pPr>
+        <w:pStyle w:val="Heading3"/>
+      </w:pPr>
+      <w:r>
+        <w:t>Dashboard Grid</w:t>
+      </w:r>
+    </w:p>
+    <w:p>
+      <w:pPr>
+        <w:spacing w:after="120" w:line="240" w:lineRule="auto"/>
+        <w:ind w:left="720"/>
+      </w:pPr>
+      <w:r>
+        <w:t>CSS:</w:t>
+      </w:r>
+    </w:p>
+    <w:p>
+      <w:pPr>
+        <w:spacing w:after="120" w:line="240" w:lineRule="auto"/>
+        <w:ind w:left="720"/>
+      </w:pPr>
+      <w:r>
+        <w:t>display:grid</w:t>
+      </w:r>
+    </w:p>
+    <w:p>
+      <w:pPr>
+        <w:spacing w:after="120" w:line="240" w:lineRule="auto"/>
+        <w:ind w:left="720"/>
+      </w:pPr>
+      <w:r>
+        <w:t>grid-template-columns:</w:t>
+      </w:r>
+      <w:r>
+        <w:t xml:space="preserve"> </w:t>
+      </w:r>
+      <w:r>
+        <w:t>repeat(auto-fit,minmax(260px,1fr))</w:t>
+      </w:r>
+    </w:p>
+    <w:p>
+      <w:pPr>
+        <w:spacing w:after="120" w:line="240" w:lineRule="auto"/>
+        <w:ind w:left="720"/>
+      </w:pPr>
+      <w:r>
+        <w:t>gap:24px</w:t>
+      </w:r>
+    </w:p>
+    <w:p>
+      <w:pPr>
+        <w:spacing w:after="120" w:line="240" w:lineRule="auto"/>
+        <w:ind w:left="720"/>
+      </w:pPr>
+      <w:r>
+        <w:lastRenderedPageBreak/>
+        <w:t>Tư duy:</w:t>
+      </w:r>
+    </w:p>
+    <w:p>
+      <w:pPr>
+        <w:spacing w:after="120" w:line="240" w:lineRule="auto"/>
+        <w:ind w:left="720"/>
+      </w:pPr>
+      <w:r>
+        <w:t>Desktop:</w:t>
+      </w:r>
+      <w:r>
+        <w:t xml:space="preserve"> </w:t>
+      </w:r>
+      <w:r>
+        <w:t>4 card</w:t>
+      </w:r>
+    </w:p>
+    <w:p>
+      <w:pPr>
+        <w:spacing w:after="120" w:line="240" w:lineRule="auto"/>
+        <w:ind w:left="720"/>
+      </w:pPr>
+      <w:r>
+        <w:t>Laptop:</w:t>
+      </w:r>
+      <w:r>
+        <w:t xml:space="preserve"> </w:t>
+      </w:r>
+      <w:r>
+        <w:t>2 card</w:t>
+      </w:r>
+    </w:p>
+    <w:p>
+      <w:pPr>
+        <w:spacing w:after="120" w:line="240" w:lineRule="auto"/>
+        <w:ind w:left="720"/>
+      </w:pPr>
+      <w:r>
+        <w:t>Mobile:</w:t>
+      </w:r>
+      <w:r>
+        <w:t xml:space="preserve"> </w:t>
+      </w:r>
+      <w:r>
+        <w:t>1 card</w:t>
+      </w:r>
+    </w:p>
+    <w:p>
+      <w:pPr>
+        <w:pBdr>
+          <w:bottom w:val="double" w:sz="6" w:space="1" w:color="auto"/>
+        </w:pBdr>
+        <w:spacing w:after="120" w:line="240" w:lineRule="auto"/>
+        <w:ind w:left="720"/>
+      </w:pPr>
+      <w:r>
+        <w:t>Không cần media query.</w:t>
+      </w:r>
+    </w:p>
+    <w:p>
+      <w:pPr>
+        <w:pStyle w:val="Heading2"/>
+      </w:pPr>
+      <w:r>
+        <w:t>NHỮNG ĐIỀU</w:t>
+      </w:r>
+      <w:r>
+        <w:rPr>
+          <w:lang w:val="vi-VN"/>
+        </w:rPr>
+        <w:t xml:space="preserve"> </w:t>
+      </w:r>
+      <w:r>
+        <w:t>LUÔN NHỚ</w:t>
+      </w:r>
+    </w:p>
+    <w:p>
+      <w:pPr>
+        <w:pStyle w:val="Heading3"/>
+        <w:numPr>
+          <w:ilvl w:val="0"/>
+          <w:numId w:val="22"/>
+        </w:numPr>
+      </w:pPr>
+      <w:r>
+        <w:t>COUNT</w:t>
+      </w:r>
+      <w:r>
+        <w:rPr>
+          <w:lang w:val="vi-VN"/>
+        </w:rPr>
+        <w:t xml:space="preserve"> </w:t>
+      </w:r>
+      <w:r>
+        <w:t>SUM</w:t>
+      </w:r>
+      <w:r>
+        <w:rPr>
+          <w:lang w:val="vi-VN"/>
+        </w:rPr>
+        <w:t xml:space="preserve"> </w:t>
+      </w:r>
+      <w:r>
+        <w:t>AVG</w:t>
+      </w:r>
+      <w:r>
+        <w:rPr>
+          <w:lang w:val="vi-VN"/>
+        </w:rPr>
+        <w:t xml:space="preserve"> </w:t>
+      </w:r>
+      <w:r>
+        <w:t>MIN</w:t>
+      </w:r>
+      <w:r>
+        <w:rPr>
+          <w:lang w:val="vi-VN"/>
+        </w:rPr>
+        <w:t xml:space="preserve"> </w:t>
+      </w:r>
+      <w:r>
+        <w:t>MAX</w:t>
+      </w:r>
+    </w:p>
+    <w:p>
+      <w:pPr>
+        <w:ind w:left="720"/>
+      </w:pPr>
+      <w:r>
+        <w:t>=&gt; Để Database xử lý.</w:t>
+      </w:r>
+    </w:p>
+    <w:p>
+      <w:pPr>
+        <w:ind w:left="720"/>
+      </w:pPr>
+      <w:r>
+        <w:t>Không load toàn bộ dữ liệu về Java.</w:t>
+      </w:r>
+    </w:p>
+    <w:p>
+      <w:pPr>
+        <w:ind w:left="720"/>
+      </w:pPr>
+      <w:r>
+        <w:pict w14:anchorId="24F50611">
+          <v:rect id="_x0000_i1053" style="width:0;height:1.5pt" o:hralign="center" o:hrstd="t" o:hr="t" fillcolor="#a0a0a0" stroked="f"/>
+        </w:pict>
+      </w:r>
+    </w:p>
+    <w:p>
+      <w:pPr>
+        <w:pStyle w:val="Heading3"/>
+      </w:pPr>
+      <w:r>
+        <w:t>Dashboard là nơi học Aggregate Query tốt nhất.</w:t>
+      </w:r>
+    </w:p>
+    <w:p>
+      <w:pPr>
+        <w:ind w:left="720"/>
+      </w:pPr>
+      <w:r>
+        <w:pict w14:anchorId="66F66DA6">
+          <v:rect id="_x0000_i1054" style="width:0;height:1.5pt" o:hralign="center" o:hrstd="t" o:hr="t" fillcolor="#a0a0a0" stroked="f"/>
+        </w:pict>
+      </w:r>
+    </w:p>
+    <w:p>
+      <w:pPr>
+        <w:pStyle w:val="Heading3"/>
+      </w:pPr>
+      <w:r>
+        <w:t>Frontend chỉ hiển thị</w:t>
+      </w:r>
+      <w:r>
+        <w:rPr>
+          <w:lang w:val="vi-VN"/>
+        </w:rPr>
+        <w:t xml:space="preserve"> </w:t>
+      </w:r>
+      <w:r>
+        <w:t>Backend mới là nơi tính toán.</w:t>
+      </w:r>
+    </w:p>
+    <w:p>
+      <w:pPr>
+        <w:ind w:left="720"/>
+      </w:pPr>
+      <w:r>
+        <w:pict w14:anchorId="16D97158">
+          <v:rect id="_x0000_i1055" style="width:0;height:1.5pt" o:hralign="center" o:hrstd="t" o:hr="t" fillcolor="#a0a0a0" stroked="f"/>
+        </w:pict>
+      </w:r>
+    </w:p>
+    <w:p>
+      <w:pPr>
+        <w:pStyle w:val="Heading3"/>
+      </w:pPr>
+      <w:r>
+        <w:t>Repository</w:t>
+      </w:r>
+      <w:r>
+        <w:rPr>
+          <w:lang w:val="vi-VN"/>
+        </w:rPr>
+        <w:t>-&gt;</w:t>
+      </w:r>
+      <w:r>
+        <w:t>Service</w:t>
+      </w:r>
+      <w:r>
+        <w:rPr>
+          <w:lang w:val="vi-VN"/>
+        </w:rPr>
+        <w:t>-&gt;</w:t>
+      </w:r>
+      <w:r>
+        <w:t>Controller</w:t>
+      </w:r>
+      <w:r>
+        <w:rPr>
+          <w:lang w:val="vi-VN"/>
+        </w:rPr>
+        <w:t>-&gt;</w:t>
+      </w:r>
+      <w:r>
+        <w:t>Axios</w:t>
+      </w:r>
+      <w:r>
+        <w:rPr>
+          <w:lang w:val="vi-VN"/>
+        </w:rPr>
+        <w:t>-&gt;</w:t>
+      </w:r>
+      <w:r>
+        <w:t xml:space="preserve">React </w:t>
+      </w:r>
+      <w:r>
+        <w:t>Query</w:t>
+      </w:r>
+      <w:r>
+        <w:rPr>
+          <w:lang w:val="vi-VN"/>
+        </w:rPr>
+        <w:t>-&gt;</w:t>
+      </w:r>
+      <w:r>
+        <w:t>Page</w:t>
+      </w:r>
+      <w:r>
+        <w:rPr>
+          <w:lang w:val="vi-VN"/>
+        </w:rPr>
+        <w:t>-&gt;</w:t>
+      </w:r>
+      <w:r>
+        <w:t>Component</w:t>
+      </w:r>
+    </w:p>
+    <w:p>
+      <w:pPr>
+        <w:ind w:left="720"/>
+      </w:pPr>
+      <w:r>
+        <w:pict w14:anchorId="2EDDEFFF">
+          <v:rect id="_x0000_i1056" style="width:0;height:1.5pt" o:hralign="center" o:hrstd="t" o:hr="t" fillcolor="#a0a0a0" stroked="f"/>
+        </w:pict>
+      </w:r>
+    </w:p>
+    <w:p>
+      <w:pPr>
+        <w:pStyle w:val="Heading3"/>
+      </w:pPr>
+      <w:r>
+        <w:t>Map dữ liệu tốt hơn copy nhiều component giống nhau.</w:t>
+      </w:r>
+    </w:p>
+    <w:p>
+      <w:pPr>
+        <w:ind w:left="720"/>
+      </w:pPr>
+      <w:r>
+        <w:pict w14:anchorId="134CD7DD">
+          <v:rect id="_x0000_i1057" style="width:0;height:1.5pt" o:hralign="center" o:hrstd="t" o:hr="t" fillcolor="#a0a0a0" stroked="f"/>
+        </w:pict>
+      </w:r>
+    </w:p>
+    <w:p>
+      <w:pPr>
+        <w:pStyle w:val="Heading3"/>
+        <w:pBdr>
+          <w:bottom w:val="double" w:sz="6" w:space="1" w:color="auto"/>
+        </w:pBdr>
+      </w:pPr>
+      <w:r>
+        <w:t>DashboardCard là Component.cards là Data.Không trộn Data và UI vào nhau.</w:t>
+      </w:r>
+    </w:p>
+    <w:p>
+      <w:pPr>
+        <w:pStyle w:val="Heading2"/>
+      </w:pPr>
+      <w:r>
+        <w:t>SƠ ĐỒ NHỚ NHANH</w:t>
+      </w:r>
+    </w:p>
+    <w:p>
+      <w:pPr>
+        <w:ind w:left="720"/>
+      </w:pPr>
+      <w:r>
+        <w:t>Database</w:t>
+      </w:r>
+      <w:r>
+        <w:rPr>
+          <w:lang w:val="vi-VN"/>
+        </w:rPr>
+        <w:t>-&gt;</w:t>
+      </w:r>
+      <w:r>
+        <w:t>COUNT</w:t>
+      </w:r>
+      <w:r>
+        <w:rPr>
+          <w:lang w:val="vi-VN"/>
+        </w:rPr>
+        <w:t>,</w:t>
+      </w:r>
+      <w:r>
+        <w:t>AVG</w:t>
+      </w:r>
+      <w:r>
+        <w:rPr>
+          <w:lang w:val="vi-VN"/>
+        </w:rPr>
+        <w:t>,</w:t>
+      </w:r>
+      <w:r>
+        <w:t>MAX</w:t>
+      </w:r>
+      <w:r>
+        <w:rPr>
+          <w:lang w:val="vi-VN"/>
+        </w:rPr>
+        <w:t>-&gt;</w:t>
+      </w:r>
+      <w:r>
+        <w:t>Repository</w:t>
+      </w:r>
+      <w:r>
+        <w:rPr>
+          <w:lang w:val="vi-VN"/>
+        </w:rPr>
+        <w:t>-&gt;</w:t>
+      </w:r>
+      <w:r>
+        <w:t>Dashboa</w:t>
+      </w:r>
+      <w:r>
+        <w:t>rdResponse</w:t>
+      </w:r>
+      <w:r>
+        <w:rPr>
+          <w:lang w:val="vi-VN"/>
+        </w:rPr>
+        <w:t>-&gt;</w:t>
+      </w:r>
+      <w:r>
+        <w:t>GET /sinhvien/</w:t>
+      </w:r>
+      <w:r>
+        <w:t>dashboard</w:t>
+      </w:r>
+      <w:r>
+        <w:rPr>
+          <w:lang w:val="vi-VN"/>
+        </w:rPr>
+        <w:t>-&gt;</w:t>
+      </w:r>
+      <w:r>
+        <w:t>dashbo</w:t>
+      </w:r>
+      <w:r>
+        <w:t>ardService</w:t>
+      </w:r>
+      <w:r>
+        <w:rPr>
+          <w:lang w:val="vi-VN"/>
+        </w:rPr>
+        <w:t>-&gt;</w:t>
+      </w:r>
+      <w:r>
+        <w:t>useDash</w:t>
+      </w:r>
+      <w:r>
+        <w:t>boardQuery</w:t>
+      </w:r>
+      <w:r>
+        <w:rPr>
+          <w:lang w:val="vi-VN"/>
+        </w:rPr>
+        <w:t>-&gt;</w:t>
+      </w:r>
+      <w:r>
+        <w:t>cards[]</w:t>
+      </w:r>
+      <w:r>
+        <w:rPr>
+          <w:lang w:val="vi-VN"/>
+        </w:rPr>
+        <w:t>-&gt;</w:t>
+      </w:r>
+      <w:r>
+        <w:t>map()</w:t>
+      </w:r>
+      <w:r>
+        <w:rPr>
+          <w:lang w:val="vi-VN"/>
+        </w:rPr>
+        <w:t xml:space="preserve">-&gt; </w:t>
+      </w:r>
+      <w:r>
+        <w:t>Das</w:t>
+      </w:r>
+      <w:r>
+        <w:t>hboardCard</w:t>
+      </w:r>
+      <w:r>
+        <w:rPr>
+          <w:lang w:val="vi-VN"/>
+        </w:rPr>
+        <w:t>-&gt;</w:t>
+      </w:r>
+      <w:r>
+        <w:t>Dashboard UI</w:t>
+      </w:r>
+    </w:p>
+    <w:p>
+      <w:r>
+        <w:br w:type="page"/>
+      </w:r>
+    </w:p>
+    <w:p>
+      <w:pPr>
+        <w:pStyle w:val="Heading1"/>
+      </w:pPr>
+      <w:r>
+        <w:lastRenderedPageBreak/>
+        <w:t>DASHBOARD LAYOUT</w:t>
+      </w:r>
+    </w:p>
+    <w:p>
+      <w:pPr>
+        <w:ind w:left="720"/>
+      </w:pPr>
+      <w:r>
+        <w:t>1.Link</w:t>
+      </w:r>
+      <w:r>
+        <w:rPr>
+          <w:lang w:val="vi-VN"/>
+        </w:rPr>
+        <w:t xml:space="preserve"> : </w:t>
+      </w:r>
+      <w:r>
+        <w:t>Không biết menu nào active</w:t>
+      </w:r>
+    </w:p>
+    <w:p>
+      <w:pPr>
+        <w:ind w:left="720"/>
+      </w:pPr>
+      <w:r>
+        <w:t>2.NavLink</w:t>
+      </w:r>
+      <w:r>
+        <w:rPr>
+          <w:lang w:val="vi-VN"/>
+        </w:rPr>
+        <w:t xml:space="preserve"> : </w:t>
+      </w:r>
+      <w:r>
+        <w:t>Tự biết active route</w:t>
+      </w:r>
+    </w:p>
+    <w:p>
+      <w:pPr>
+        <w:ind w:left="720"/>
+      </w:pPr>
+      <w:r>
+        <w:t>3.</w:t>
+      </w:r>
+      <w:r>
+        <w:t>Sidebar</w:t>
+      </w:r>
+      <w:r>
+        <w:rPr>
+          <w:lang w:val="vi-VN"/>
+        </w:rPr>
+        <w:t xml:space="preserve">: </w:t>
+      </w:r>
+      <w:r>
+        <w:t>Icon + Text</w:t>
+      </w:r>
+    </w:p>
+    <w:p>
+      <w:pPr>
+        <w:ind w:left="720"/>
+      </w:pPr>
+      <w:r>
+        <w:t>4.Menu</w:t>
+      </w:r>
+      <w:r>
+        <w:rPr>
+          <w:lang w:val="vi-VN"/>
+        </w:rPr>
+        <w:t xml:space="preserve"> : </w:t>
+      </w:r>
+      <w:r>
+        <w:t>Hover</w:t>
+      </w:r>
+    </w:p>
+    <w:p>
+      <w:pPr>
+        <w:ind w:left="720"/>
+      </w:pPr>
+      <w:r>
+        <w:t>5.Menu</w:t>
+      </w:r>
+      <w:r>
+        <w:rPr>
+          <w:lang w:val="vi-VN"/>
+        </w:rPr>
+        <w:t xml:space="preserve"> </w:t>
+      </w:r>
+      <w:r>
+        <w:t>Active State</w:t>
+      </w:r>
+    </w:p>
+    <w:p>
+      <w:pPr>
+        <w:ind w:left="720"/>
+        <w:rPr>
+          <w:lang w:val="vi-VN"/>
+        </w:rPr>
+      </w:pPr>
+      <w:r>
+        <w:t>=&gt; Chuẩn dashboard admin</w:t>
+      </w:r>
+    </w:p>
+    <w:p>
+      <w:pPr>
+        <w:pStyle w:val="Heading1"/>
+      </w:pPr>
+      <w:r>
+        <w:t>DASHBOARD - TOP 5 SINH VIÊN</w:t>
+      </w:r>
+    </w:p>
+    <w:p>
+      <w:pPr>
+        <w:numPr>
+          <w:ilvl w:val="0"/>
+          <w:numId w:val="2"/>
+        </w:numPr>
+      </w:pPr>
+      <w:r>
+        <w:rPr>
+          <w:b/>
+          <w:bCs/>
+        </w:rPr>
+        <w:t>Mục tiêu</w:t>
+      </w:r>
+      <w:r>
+        <w:rPr>
+          <w:b/>
+          <w:bCs/>
+          <w:lang w:val="vi-VN"/>
+        </w:rPr>
+        <w:t xml:space="preserve"> : </w:t>
+      </w:r>
+      <w:r>
+        <w:t>Hiển thị 5 sinh viên có điểm trung bình cao nhất trên Dashboard.</w:t>
+      </w:r>
+    </w:p>
+    <w:p>
+      <w:pPr>
+        <w:ind w:left="720"/>
+      </w:pPr>
+      <w:r>
+        <w:pict w14:anchorId="014FA217">
+          <v:rect id="_x0000_i1136" style="width:0;height:1.5pt" o:hralign="center" o:hrstd="t" o:hr="t" fillcolor="#a0a0a0" stroked="f"/>
+        </w:pict>
+      </w:r>
+    </w:p>
+    <w:p>
+      <w:pPr>
+        <w:pStyle w:val="Heading2"/>
+      </w:pPr>
+      <w:r>
+        <w:t>Backend</w:t>
+      </w:r>
+    </w:p>
+    <w:p>
+      <w:pPr>
+        <w:pStyle w:val="Heading3"/>
+        <w:numPr>
+          <w:ilvl w:val="0"/>
+          <w:numId w:val="23"/>
+        </w:numPr>
+      </w:pPr>
+      <w:r>
+        <w:t>Repository</w:t>
+      </w:r>
+    </w:p>
+    <w:p>
+      <w:pPr>
+        <w:ind w:left="720"/>
+      </w:pPr>
+      <w:r>
+        <w:t>List&lt;SinhVienEntity&gt; findTop5ByOrderByDtbDesc();</w:t>
+      </w:r>
+    </w:p>
+    <w:p>
+      <w:pPr>
+        <w:ind w:left="720"/>
+      </w:pPr>
+      <w:r>
+        <w:t>Ý nghĩa:</w:t>
+      </w:r>
+      <w:r>
+        <w:rPr>
+          <w:lang w:val="vi-VN"/>
+        </w:rPr>
+        <w:t xml:space="preserve"> </w:t>
+      </w:r>
+      <w:r>
+        <w:t xml:space="preserve">Top </w:t>
+      </w:r>
+      <w:r>
+        <w:t>5</w:t>
+      </w:r>
+      <w:r>
+        <w:rPr>
+          <w:lang w:val="vi-VN"/>
+        </w:rPr>
+        <w:t>-&gt;</w:t>
+      </w:r>
+      <w:r>
+        <w:t xml:space="preserve">Sắp xếp DTB giảm </w:t>
+      </w:r>
+      <w:r>
+        <w:t>dần</w:t>
+      </w:r>
+      <w:r>
+        <w:rPr>
+          <w:lang w:val="vi-VN"/>
+        </w:rPr>
+        <w:t>-&gt;</w:t>
+      </w:r>
+      <w:r>
+        <w:t>Lấy 5 bản ghi đầu tiên</w:t>
+      </w:r>
+    </w:p>
+    <w:p>
+      <w:pPr>
+        <w:ind w:left="720"/>
+      </w:pPr>
+      <w:r>
+        <w:pict w14:anchorId="6709EA66">
+          <v:rect id="_x0000_i1137" style="width:0;height:1.5pt" o:hralign="center" o:hrstd="t" o:hr="t" fillcolor="#a0a0a0" stroked="f"/>
+        </w:pict>
+      </w:r>
+    </w:p>
+    <w:p>
+      <w:pPr>
+        <w:pStyle w:val="Heading3"/>
+      </w:pPr>
+      <w:r>
+        <w:t>DTO</w:t>
+      </w:r>
+    </w:p>
+    <w:p>
+      <w:pPr>
+        <w:ind w:left="720"/>
+      </w:pPr>
+      <w:r>
+        <w:t>TopSinhVienResponse</w:t>
+      </w:r>
+    </w:p>
+    <w:p>
+      <w:pPr>
+        <w:ind w:left="720"/>
+      </w:pPr>
+      <w:r>
+        <w:t>private String ten;</w:t>
+      </w:r>
+    </w:p>
+    <w:p>
+      <w:pPr>
+        <w:ind w:left="720"/>
+      </w:pPr>
+      <w:r>
+        <w:t>private Double dtb;</w:t>
+      </w:r>
+    </w:p>
+    <w:p>
+      <w:pPr>
+        <w:ind w:left="720"/>
+      </w:pPr>
+      <w:r>
+        <w:pict w14:anchorId="0272450B">
+          <v:rect id="_x0000_i1138" style="width:0;height:1.5pt" o:hralign="center" o:hrstd="t" o:hr="t" fillcolor="#a0a0a0" stroked="f"/>
+        </w:pict>
+      </w:r>
+    </w:p>
+    <w:p>
+      <w:pPr>
+        <w:pStyle w:val="Heading3"/>
+      </w:pPr>
+      <w:r>
+        <w:t>Service</w:t>
+      </w:r>
+    </w:p>
+    <w:p>
+      <w:pPr>
+        <w:ind w:left="720"/>
+      </w:pPr>
+      <w:r>
+        <w:t>Flow:</w:t>
+      </w:r>
+    </w:p>
+    <w:p>
+      <w:pPr>
+        <w:ind w:left="720"/>
+      </w:pPr>
+      <w:r>
+        <w:t>Repository</w:t>
+      </w:r>
+      <w:r>
+        <w:rPr>
+          <w:lang w:val="vi-VN"/>
+        </w:rPr>
+        <w:t>-&gt;</w:t>
+      </w:r>
+      <w:r>
+        <w:t>findTop5ByOrderByDtbDesc()</w:t>
+      </w:r>
+      <w:r>
+        <w:rPr>
+          <w:lang w:val="vi-VN"/>
+        </w:rPr>
+        <w:t>-&gt;</w:t>
+      </w:r>
+      <w:r>
+        <w:t>List&lt;SinhVienEntity&gt;</w:t>
+      </w:r>
+      <w:r>
+        <w:rPr>
+          <w:lang w:val="vi-VN"/>
+        </w:rPr>
+        <w:t>-&gt;</w:t>
+      </w:r>
+      <w:r>
+        <w:t>Map sang TopSinhVi</w:t>
+      </w:r>
+      <w:r>
+        <w:t>enResponse</w:t>
+      </w:r>
+      <w:r>
+        <w:rPr>
+          <w:lang w:val="vi-VN"/>
+        </w:rPr>
+        <w:t>-&gt;</w:t>
+      </w:r>
+      <w:r>
+        <w:t>DashboardResponse</w:t>
+      </w:r>
+    </w:p>
+    <w:p>
+      <w:pPr>
+        <w:ind w:left="720"/>
+      </w:pPr>
+      <w:r>
+        <w:pict w14:anchorId="74CF6AD8">
+          <v:rect id="_x0000_i1139" style="width:0;height:1.5pt" o:hralign="center" o:hrstd="t" o:hr="t" fillcolor="#a0a0a0" stroked="f"/>
+        </w:pict>
+      </w:r>
+    </w:p>
+    <w:p>
+      <w:pPr>
+        <w:pStyle w:val="Heading3"/>
+      </w:pPr>
+      <w:r>
+        <w:t>DashboardResponse</w:t>
+      </w:r>
+    </w:p>
+    <w:p>
+      <w:pPr>
+        <w:ind w:left="720"/>
+      </w:pPr>
+      <w:r>
+        <w:t>private List&lt;TopSinhVienResponse&gt; topSinhVien;</w:t>
+      </w:r>
+    </w:p>
+    <w:p>
+      <w:pPr>
+        <w:ind w:left="720"/>
+      </w:pPr>
+      <w:r>
+        <w:pict w14:anchorId="5442D4FC">
+          <v:rect id="_x0000_i1140" style="width:0;height:1.5pt" o:hralign="center" o:hrstd="t" o:hr="t" fillcolor="#a0a0a0" stroked="f"/>
+        </w:pict>
+      </w:r>
+    </w:p>
+    <w:p>
+      <w:pPr>
+        <w:pStyle w:val="Heading2"/>
+      </w:pPr>
+      <w:r>
+        <w:lastRenderedPageBreak/>
+        <w:t>Frontend</w:t>
+      </w:r>
+    </w:p>
+    <w:p>
+      <w:pPr>
+        <w:pStyle w:val="Heading3"/>
+        <w:numPr>
+          <w:ilvl w:val="0"/>
+          <w:numId w:val="24"/>
+        </w:numPr>
+      </w:pPr>
+      <w:r>
+        <w:t>Dashboard Query</w:t>
+      </w:r>
+    </w:p>
+    <w:p>
+      <w:pPr>
+        <w:ind w:left="720"/>
+      </w:pPr>
+      <w:r>
+        <w:t>GET /sinhvien/</w:t>
+      </w:r>
+      <w:r>
+        <w:t>dashboard</w:t>
+      </w:r>
+      <w:r>
+        <w:rPr>
+          <w:lang w:val="vi-VN"/>
+        </w:rPr>
+        <w:t>-&gt;</w:t>
+      </w:r>
+      <w:r>
+        <w:t>Dashboa</w:t>
+      </w:r>
+      <w:r>
+        <w:t>rdResponse</w:t>
+      </w:r>
+      <w:r>
+        <w:rPr>
+          <w:lang w:val="vi-VN"/>
+        </w:rPr>
+        <w:t>-&gt;</w:t>
+      </w:r>
+      <w:r>
+        <w:t>topSinhVien[]</w:t>
+      </w:r>
+    </w:p>
+    <w:p>
+      <w:pPr>
+        <w:ind w:left="720"/>
+      </w:pPr>
+      <w:r>
+        <w:pict w14:anchorId="22F1A356">
+          <v:rect id="_x0000_i1141" style="width:0;height:1.5pt" o:hralign="center" o:hrstd="t" o:hr="t" fillcolor="#a0a0a0" stroked="f"/>
+        </w:pict>
+      </w:r>
+    </w:p>
+    <w:p>
+      <w:pPr>
+        <w:pStyle w:val="Heading3"/>
+      </w:pPr>
+      <w:r>
+        <w:t>AdminPage</w:t>
+      </w:r>
+    </w:p>
+    <w:p>
+      <w:pPr>
+        <w:ind w:left="720"/>
+      </w:pPr>
+      <w:r>
+        <w:t>&lt;TopSinhVienCard</w:t>
+      </w:r>
+    </w:p>
+    <w:p>
+      <w:pPr>
+        <w:ind w:left="720"/>
+      </w:pPr>
+      <w:r>
+        <w:t xml:space="preserve">    sinhViens={top5SV}</w:t>
+      </w:r>
+    </w:p>
+    <w:p>
+      <w:pPr>
+        <w:ind w:left="720"/>
+      </w:pPr>
+      <w:r>
+        <w:t>/&gt;</w:t>
+      </w:r>
+    </w:p>
+    <w:p>
+      <w:pPr>
+        <w:ind w:left="720"/>
+      </w:pPr>
+      <w:r>
+        <w:t>AdminPage chỉ truyền dữ liệu.</w:t>
+      </w:r>
+    </w:p>
+    <w:p>
+      <w:pPr>
+        <w:ind w:left="720"/>
+      </w:pPr>
+      <w:r>
+        <w:t>Không render từng sinh viên.</w:t>
+      </w:r>
+    </w:p>
+    <w:p>
+      <w:pPr>
+        <w:ind w:left="720"/>
+      </w:pPr>
+      <w:r>
+        <w:pict w14:anchorId="2B13E147">
+          <v:rect id="_x0000_i1142" style="width:0;height:1.5pt" o:hralign="center" o:hrstd="t" o:hr="t" fillcolor="#a0a0a0" stroked="f"/>
+        </w:pict>
+      </w:r>
+    </w:p>
+    <w:p>
+      <w:pPr>
+        <w:pStyle w:val="Heading3"/>
+      </w:pPr>
+      <w:r>
+        <w:t>TopSinhVienCard</w:t>
+      </w:r>
+    </w:p>
+    <w:p>
+      <w:pPr>
+        <w:ind w:left="720"/>
+      </w:pPr>
+      <w:r>
+        <w:t>TopSinhVienCard là:</w:t>
+      </w:r>
+    </w:p>
+    <w:p>
+      <w:pPr>
+        <w:ind w:left="720"/>
+      </w:pPr>
+      <w:r>
+        <w:t>1 Widget Dashboard</w:t>
+      </w:r>
+    </w:p>
+    <w:p>
+      <w:pPr>
+        <w:ind w:left="720"/>
+      </w:pPr>
+      <w:r>
+        <w:t>không phải:</w:t>
+      </w:r>
+      <w:r>
+        <w:rPr>
+          <w:lang w:val="vi-VN"/>
+        </w:rPr>
+        <w:t xml:space="preserve"> </w:t>
+      </w:r>
+      <w:r>
+        <w:t>1 Sinh Viên</w:t>
+      </w:r>
+    </w:p>
+    <w:p>
+      <w:pPr>
+        <w:ind w:left="720"/>
+      </w:pPr>
+      <w:r>
+        <w:pict w14:anchorId="34B61BC3">
+          <v:rect id="_x0000_i1143" style="width:0;height:1.5pt" o:hralign="center" o:hrstd="t" o:hr="t" fillcolor="#a0a0a0" stroked="f"/>
+        </w:pict>
+      </w:r>
+    </w:p>
+    <w:p>
+      <w:pPr>
+        <w:numPr>
+          <w:ilvl w:val="0"/>
+          <w:numId w:val="7"/>
+        </w:numPr>
+        <w:rPr>
+          <w:b/>
+          <w:bCs/>
+        </w:rPr>
+      </w:pPr>
+      <w:r>
+        <w:rPr>
+          <w:b/>
+          <w:bCs/>
+        </w:rPr>
+        <w:t>Đúng</w:t>
+      </w:r>
+    </w:p>
+    <w:p>
+      <w:pPr>
+        <w:ind w:left="720"/>
+      </w:pPr>
+      <w:r>
+        <w:t>&lt;div className="top-student-card"&gt;</w:t>
+      </w:r>
+    </w:p>
+    <w:p>
+      <w:pPr>
+        <w:ind w:left="720"/>
+      </w:pPr>
+      <w:r>
+        <w:t xml:space="preserve">    {sinhViens.map(...)}</w:t>
+      </w:r>
+    </w:p>
+    <w:p>
+      <w:pPr>
+        <w:ind w:left="720"/>
+      </w:pPr>
+      <w:r>
+        <w:t>&lt;/div&gt;</w:t>
+      </w:r>
+    </w:p>
+    <w:p>
+      <w:pPr>
+        <w:ind w:left="720"/>
+      </w:pPr>
+      <w:r>
+        <w:pict w14:anchorId="4953DFCE">
+          <v:rect id="_x0000_i1144" style="width:0;height:1.5pt" o:hralign="center" o:hrstd="t" o:hr="t" fillcolor="#a0a0a0" stroked="f"/>
+        </w:pict>
+      </w:r>
+    </w:p>
+    <w:p>
+      <w:pPr>
+        <w:numPr>
+          <w:ilvl w:val="0"/>
+          <w:numId w:val="7"/>
+        </w:numPr>
+        <w:rPr>
+          <w:b/>
+          <w:bCs/>
+        </w:rPr>
+      </w:pPr>
+      <w:r>
+        <w:rPr>
+          <w:b/>
+          <w:bCs/>
+        </w:rPr>
+        <w:t>Sai</w:t>
+      </w:r>
+    </w:p>
+    <w:p>
+      <w:pPr>
+        <w:ind w:left="720"/>
+      </w:pPr>
+      <w:r>
+        <w:t>sinhViens.map( &lt;div className="top-student-card"&gt;)</w:t>
+      </w:r>
+    </w:p>
+    <w:p>
+      <w:pPr>
+        <w:ind w:left="720"/>
+      </w:pPr>
+      <w:r>
+        <w:t>Vì sẽ tạo:</w:t>
+      </w:r>
+      <w:r>
+        <w:rPr>
+          <w:lang w:val="vi-VN"/>
+        </w:rPr>
+        <w:t xml:space="preserve"> </w:t>
+      </w:r>
+      <w:r>
+        <w:t>5 Card</w:t>
+      </w:r>
+    </w:p>
+    <w:p>
+      <w:pPr>
+        <w:ind w:left="720"/>
+      </w:pPr>
+      <w:r>
+        <w:t>thay vì:</w:t>
+      </w:r>
+      <w:r>
+        <w:rPr>
+          <w:lang w:val="vi-VN"/>
+        </w:rPr>
+        <w:t xml:space="preserve"> </w:t>
+      </w:r>
+      <w:r>
+        <w:t>1 Card</w:t>
+      </w:r>
+    </w:p>
+    <w:p>
+      <w:pPr>
+        <w:ind w:left="720"/>
+      </w:pPr>
+      <w:r>
+        <w:t>chứa 5 dòng</w:t>
+      </w:r>
+    </w:p>
+    <w:p>
+      <w:pPr>
+        <w:ind w:left="720"/>
+      </w:pPr>
+      <w:r>
+        <w:pict w14:anchorId="31BDC51E">
+          <v:rect id="_x0000_i1145" style="width:0;height:1.5pt" o:hralign="center" o:hrstd="t" o:hr="t" fillcolor="#a0a0a0" stroked="f"/>
+        </w:pict>
+      </w:r>
+    </w:p>
+    <w:p>
+      <w:pPr>
+        <w:numPr>
+          <w:ilvl w:val="0"/>
+          <w:numId w:val="2"/>
+        </w:numPr>
+        <w:rPr>
+          <w:b/>
+          <w:bCs/>
+        </w:rPr>
+      </w:pPr>
+      <w:r>
+        <w:rPr>
+          <w:b/>
+          <w:bCs/>
+        </w:rPr>
+        <w:t>React Component Thinking</w:t>
+      </w:r>
+    </w:p>
+    <w:p>
+      <w:pPr>
+        <w:ind w:left="720"/>
+      </w:pPr>
+      <w:r>
+        <w:t>Nếu Component đại diện:</w:t>
+      </w:r>
+      <w:r>
+        <w:rPr>
+          <w:lang w:val="vi-VN"/>
+        </w:rPr>
+        <w:t xml:space="preserve"> </w:t>
+      </w:r>
+      <w:r>
+        <w:t>1 item</w:t>
+      </w:r>
+      <w:r>
+        <w:rPr>
+          <w:lang w:val="vi-VN"/>
+        </w:rPr>
+        <w:t xml:space="preserve"> -&gt; </w:t>
+      </w:r>
+      <w:r>
+        <w:t>map ở component cha</w:t>
+      </w:r>
+    </w:p>
+    <w:p>
+      <w:pPr>
+        <w:ind w:left="720"/>
+      </w:pPr>
+      <w:r>
+        <w:lastRenderedPageBreak/>
+        <w:t>Ví dụ:</w:t>
+      </w:r>
+      <w:r>
+        <w:rPr>
+          <w:lang w:val="vi-VN"/>
+        </w:rPr>
+        <w:t xml:space="preserve"> </w:t>
+      </w:r>
+      <w:r>
+        <w:t>DashboardCard</w:t>
+      </w:r>
+    </w:p>
+    <w:p>
+      <w:pPr>
+        <w:ind w:left="720"/>
+      </w:pPr>
+      <w:r>
+        <w:pict w14:anchorId="583FDD39">
+          <v:rect id="_x0000_i1146" style="width:0;height:1.5pt" o:hralign="center" o:hrstd="t" o:hr="t" fillcolor="#a0a0a0" stroked="f"/>
+        </w:pict>
+      </w:r>
+    </w:p>
+    <w:p>
+      <w:pPr>
+        <w:ind w:left="720"/>
+      </w:pPr>
+      <w:r>
+        <w:t>Nếu Component đại diện:</w:t>
+      </w:r>
+      <w:r>
+        <w:rPr>
+          <w:lang w:val="vi-VN"/>
+        </w:rPr>
+        <w:t xml:space="preserve"> </w:t>
+      </w:r>
+      <w:r>
+        <w:t xml:space="preserve">1 </w:t>
+      </w:r>
+      <w:r>
+        <w:t>widget</w:t>
+      </w:r>
+      <w:r>
+        <w:rPr>
+          <w:lang w:val="vi-VN"/>
+        </w:rPr>
+        <w:t>-&gt;</w:t>
+      </w:r>
+      <w:r>
+        <w:t>map bên trong component</w:t>
+      </w:r>
+    </w:p>
+    <w:p>
+      <w:pPr>
+        <w:ind w:left="720"/>
+      </w:pPr>
+      <w:r>
+        <w:t>Ví dụ:</w:t>
+      </w:r>
+      <w:r>
+        <w:rPr>
+          <w:lang w:val="vi-VN"/>
+        </w:rPr>
+        <w:t xml:space="preserve"> </w:t>
+      </w:r>
+      <w:r>
+        <w:t>TopSinhVienCard</w:t>
+      </w:r>
+    </w:p>
+    <w:p>
+      <w:pPr>
+        <w:ind w:left="720"/>
+      </w:pPr>
+      <w:r>
+        <w:pict w14:anchorId="2516BEEE">
+          <v:rect id="_x0000_i1147" style="width:0;height:1.5pt" o:hralign="center" o:hrstd="t" o:hr="t" fillcolor="#a0a0a0" stroked="f"/>
+        </w:pict>
+      </w:r>
+    </w:p>
+    <w:p>
+      <w:pPr>
+        <w:numPr>
+          <w:ilvl w:val="0"/>
+          <w:numId w:val="2"/>
+        </w:numPr>
+        <w:rPr>
+          <w:b/>
+          <w:bCs/>
+        </w:rPr>
+      </w:pPr>
+      <w:r>
+        <w:rPr>
+          <w:b/>
+          <w:bCs/>
+        </w:rPr>
+        <w:t>Dashboard Structure</w:t>
+      </w:r>
+    </w:p>
+    <w:p>
+      <w:pPr>
+        <w:ind w:left="720"/>
+      </w:pPr>
+      <w:r>
+        <w:t>Dashboard</w:t>
+      </w:r>
+    </w:p>
+    <w:p>
+      <w:pPr>
+        <w:ind w:left="720"/>
+      </w:pPr>
+      <w:r>
+        <w:t>├── DashboardCard</w:t>
+      </w:r>
+    </w:p>
+    <w:p>
+      <w:pPr>
+        <w:ind w:left="720"/>
+      </w:pPr>
+      <w:r>
+        <w:t>│   ├── Tổng sinh viên</w:t>
+      </w:r>
+    </w:p>
+    <w:p>
+      <w:pPr>
+        <w:ind w:left="720"/>
+      </w:pPr>
+      <w:r>
+        <w:t>│   ├── Điểm TB</w:t>
+      </w:r>
+    </w:p>
+    <w:p>
+      <w:pPr>
+        <w:ind w:left="720"/>
+      </w:pPr>
+      <w:r>
+        <w:t>│   ├── Điểm cao nhất</w:t>
+      </w:r>
+    </w:p>
+    <w:p>
+      <w:pPr>
+        <w:ind w:left="720"/>
+      </w:pPr>
+      <w:r>
+        <w:t>│   └── Sinh viên giỏi</w:t>
+      </w:r>
+    </w:p>
+    <w:p>
+      <w:pPr>
+        <w:ind w:left="720"/>
+      </w:pPr>
+      <w:r>
+        <w:t>│</w:t>
+      </w:r>
+    </w:p>
+    <w:p>
+      <w:pPr>
+        <w:ind w:left="720"/>
+      </w:pPr>
+      <w:r>
+        <w:t>└── TopSinhVienCard</w:t>
+      </w:r>
+    </w:p>
+    <w:p>
+      <w:pPr>
+        <w:ind w:left="720"/>
+      </w:pPr>
+      <w:r>
+        <w:t xml:space="preserve">    ├── Huy</w:t>
+      </w:r>
+    </w:p>
+    <w:p>
+      <w:pPr>
+        <w:ind w:left="720"/>
+      </w:pPr>
+      <w:r>
+        <w:t xml:space="preserve">    ├── Nhi</w:t>
+      </w:r>
+    </w:p>
+    <w:p>
+      <w:pPr>
+        <w:ind w:left="720"/>
+      </w:pPr>
+      <w:r>
+        <w:t xml:space="preserve">    ├── Ly</w:t>
+      </w:r>
+    </w:p>
+    <w:p>
+      <w:pPr>
+        <w:ind w:left="720"/>
+      </w:pPr>
+      <w:r>
+        <w:t xml:space="preserve">    ├── Vi</w:t>
+      </w:r>
+    </w:p>
+    <w:p>
+      <w:pPr>
+        <w:ind w:left="720"/>
+      </w:pPr>
+      <w:r>
+        <w:t xml:space="preserve">    └── Phúc</w:t>
+      </w:r>
+    </w:p>
+    <w:p>
+      <w:pPr>
+        <w:ind w:left="720"/>
+      </w:pPr>
+      <w:r>
+        <w:pict w14:anchorId="74A78786">
+          <v:rect id="_x0000_i1148" style="width:0;height:1.5pt" o:hralign="center" o:hrstd="t" o:hr="t" fillcolor="#a0a0a0" stroked="f"/>
+        </w:pict>
+      </w:r>
+    </w:p>
+    <w:p>
+      <w:pPr>
+        <w:numPr>
+          <w:ilvl w:val="0"/>
+          <w:numId w:val="2"/>
+        </w:numPr>
+        <w:rPr>
+          <w:b/>
+          <w:bCs/>
+        </w:rPr>
+      </w:pPr>
+      <w:r>
+        <w:rPr>
+          <w:b/>
+          <w:bCs/>
+        </w:rPr>
+        <w:t>Tư duy Production</w:t>
+      </w:r>
+    </w:p>
+    <w:p>
+      <w:pPr>
+        <w:ind w:left="720"/>
+      </w:pPr>
+      <w:r>
+        <w:t>Dashboard không chỉ hiển thị số liệu.</w:t>
+      </w:r>
+    </w:p>
+    <w:p>
+      <w:pPr>
+        <w:ind w:left="720"/>
+      </w:pPr>
+      <w:r>
+        <w:t>Dashboard gồm:</w:t>
+      </w:r>
+      <w:r>
+        <w:rPr>
+          <w:lang w:val="vi-VN"/>
+        </w:rPr>
+        <w:t xml:space="preserve"> </w:t>
+      </w:r>
+      <w:r>
+        <w:t xml:space="preserve">KPI </w:t>
+      </w:r>
+      <w:r>
+        <w:t>Cards</w:t>
+      </w:r>
+      <w:r>
+        <w:rPr>
+          <w:lang w:val="vi-VN"/>
+        </w:rPr>
+        <w:t>-&gt;</w:t>
+      </w:r>
+      <w:r>
+        <w:t xml:space="preserve">Ranking </w:t>
+      </w:r>
+      <w:r>
+        <w:t>Widget</w:t>
+      </w:r>
+      <w:r>
+        <w:rPr>
+          <w:lang w:val="vi-VN"/>
+        </w:rPr>
+        <w:t>-&gt;</w:t>
+      </w:r>
+      <w:r>
+        <w:t>Charts</w:t>
+      </w:r>
+      <w:r>
+        <w:rPr>
+          <w:lang w:val="vi-VN"/>
+        </w:rPr>
+        <w:t xml:space="preserve"> - &gt;</w:t>
+      </w:r>
+      <w:r>
+        <w:t>Recent Activities</w:t>
+      </w:r>
+    </w:p>
+    <w:p>
+      <w:pPr>
+        <w:ind w:left="720"/>
+        <w:rPr>
+          <w:lang w:val="vi-VN"/>
+        </w:rPr>
+      </w:pPr>
+      <w:r>
+        <w:t>Top 5 Sinh Viên là widget ranking đầu tiên trong hệ thống.</w:t>
+      </w:r>
+    </w:p>
+    <w:p>
+      <w:pPr>
+        <w:pStyle w:val="Heading1"/>
+        <w:rPr>
+          <w:lang w:val="vi-VN"/>
+        </w:rPr>
+      </w:pPr>
+      <w:r>
+        <w:t>MODULE 12 - PIE CHART HỌC LỰC</w:t>
+      </w:r>
+    </w:p>
+    <w:p>
+      <w:pPr>
+        <w:rPr>
+          <w:lang w:val="vi-VN"/>
+        </w:rPr>
+      </w:pPr>
+    </w:p>
+    <w:p>
+      <w:pPr>
+        <w:ind w:left="720"/>
       </w:pPr>
     </w:p>
     <w:sectPr>
@@ -6874,6 +9679,119 @@
     </w:lvl>
   </w:abstractNum>
   <w:abstractNum w:abstractNumId="1" w15:restartNumberingAfterBreak="0">
+    <w:nsid w:val="0A545C55"/>
+    <w:multiLevelType w:val="multilevel"/>
+    <w:tmpl w:val="FFF03256"/>
+    <w:lvl w:ilvl="0">
+      <w:start w:val="4"/>
+      <w:numFmt w:val="decimal"/>
+      <w:lvlText w:val="%1."/>
+      <w:lvlJc w:val="left"/>
+      <w:pPr>
+        <w:tabs>
+          <w:tab w:val="num" w:pos="720"/>
+        </w:tabs>
+        <w:ind w:left="720" w:hanging="360"/>
+      </w:pPr>
+    </w:lvl>
+    <w:lvl w:ilvl="1" w:tentative="1">
+      <w:start w:val="1"/>
+      <w:numFmt w:val="decimal"/>
+      <w:lvlText w:val="%2."/>
+      <w:lvlJc w:val="left"/>
+      <w:pPr>
+        <w:tabs>
+          <w:tab w:val="num" w:pos="1440"/>
+        </w:tabs>
+        <w:ind w:left="1440" w:hanging="360"/>
+      </w:pPr>
+    </w:lvl>
+    <w:lvl w:ilvl="2" w:tentative="1">
+      <w:start w:val="1"/>
+      <w:numFmt w:val="decimal"/>
+      <w:lvlText w:val="%3."/>
+      <w:lvlJc w:val="left"/>
+      <w:pPr>
+        <w:tabs>
+          <w:tab w:val="num" w:pos="2160"/>
+        </w:tabs>
+        <w:ind w:left="2160" w:hanging="360"/>
+      </w:pPr>
+    </w:lvl>
+    <w:lvl w:ilvl="3" w:tentative="1">
+      <w:start w:val="1"/>
+      <w:numFmt w:val="decimal"/>
+      <w:lvlText w:val="%4."/>
+      <w:lvlJc w:val="left"/>
+      <w:pPr>
+        <w:tabs>
+          <w:tab w:val="num" w:pos="2880"/>
+        </w:tabs>
+        <w:ind w:left="2880" w:hanging="360"/>
+      </w:pPr>
+    </w:lvl>
+    <w:lvl w:ilvl="4" w:tentative="1">
+      <w:start w:val="1"/>
+      <w:numFmt w:val="decimal"/>
+      <w:lvlText w:val="%5."/>
+      <w:lvlJc w:val="left"/>
+      <w:pPr>
+        <w:tabs>
+          <w:tab w:val="num" w:pos="3600"/>
+        </w:tabs>
+        <w:ind w:left="3600" w:hanging="360"/>
+      </w:pPr>
+    </w:lvl>
+    <w:lvl w:ilvl="5" w:tentative="1">
+      <w:start w:val="1"/>
+      <w:numFmt w:val="decimal"/>
+      <w:lvlText w:val="%6."/>
+      <w:lvlJc w:val="left"/>
+      <w:pPr>
+        <w:tabs>
+          <w:tab w:val="num" w:pos="4320"/>
+        </w:tabs>
+        <w:ind w:left="4320" w:hanging="360"/>
+      </w:pPr>
+    </w:lvl>
+    <w:lvl w:ilvl="6" w:tentative="1">
+      <w:start w:val="1"/>
+      <w:numFmt w:val="decimal"/>
+      <w:lvlText w:val="%7."/>
+      <w:lvlJc w:val="left"/>
+      <w:pPr>
+        <w:tabs>
+          <w:tab w:val="num" w:pos="5040"/>
+        </w:tabs>
+        <w:ind w:left="5040" w:hanging="360"/>
+      </w:pPr>
+    </w:lvl>
+    <w:lvl w:ilvl="7" w:tentative="1">
+      <w:start w:val="1"/>
+      <w:numFmt w:val="decimal"/>
+      <w:lvlText w:val="%8."/>
+      <w:lvlJc w:val="left"/>
+      <w:pPr>
+        <w:tabs>
+          <w:tab w:val="num" w:pos="5760"/>
+        </w:tabs>
+        <w:ind w:left="5760" w:hanging="360"/>
+      </w:pPr>
+    </w:lvl>
+    <w:lvl w:ilvl="8" w:tentative="1">
+      <w:start w:val="1"/>
+      <w:numFmt w:val="decimal"/>
+      <w:lvlText w:val="%9."/>
+      <w:lvlJc w:val="left"/>
+      <w:pPr>
+        <w:tabs>
+          <w:tab w:val="num" w:pos="6480"/>
+        </w:tabs>
+        <w:ind w:left="6480" w:hanging="360"/>
+      </w:pPr>
+    </w:lvl>
+  </w:abstractNum>
+  <w:abstractNum w:abstractNumId="2" w15:restartNumberingAfterBreak="0">
     <w:nsid w:val="11436643"/>
     <w:multiLevelType w:val="multilevel"/>
     <w:tmpl w:val="DCB6B0D8"/>
@@ -7022,7 +9940,120 @@
       </w:rPr>
     </w:lvl>
   </w:abstractNum>
-  <w:abstractNum w:abstractNumId="2" w15:restartNumberingAfterBreak="0">
+  <w:abstractNum w:abstractNumId="3" w15:restartNumberingAfterBreak="0">
+    <w:nsid w:val="236F0899"/>
+    <w:multiLevelType w:val="multilevel"/>
+    <w:tmpl w:val="FA60E36E"/>
+    <w:lvl w:ilvl="0">
+      <w:start w:val="3"/>
+      <w:numFmt w:val="decimal"/>
+      <w:lvlText w:val="%1."/>
+      <w:lvlJc w:val="left"/>
+      <w:pPr>
+        <w:tabs>
+          <w:tab w:val="num" w:pos="720"/>
+        </w:tabs>
+        <w:ind w:left="720" w:hanging="360"/>
+      </w:pPr>
+    </w:lvl>
+    <w:lvl w:ilvl="1" w:tentative="1">
+      <w:start w:val="1"/>
+      <w:numFmt w:val="decimal"/>
+      <w:lvlText w:val="%2."/>
+      <w:lvlJc w:val="left"/>
+      <w:pPr>
+        <w:tabs>
+          <w:tab w:val="num" w:pos="1440"/>
+        </w:tabs>
+        <w:ind w:left="1440" w:hanging="360"/>
+      </w:pPr>
+    </w:lvl>
+    <w:lvl w:ilvl="2" w:tentative="1">
+      <w:start w:val="1"/>
+      <w:numFmt w:val="decimal"/>
+      <w:lvlText w:val="%3."/>
+      <w:lvlJc w:val="left"/>
+      <w:pPr>
+        <w:tabs>
+          <w:tab w:val="num" w:pos="2160"/>
+        </w:tabs>
+        <w:ind w:left="2160" w:hanging="360"/>
+      </w:pPr>
+    </w:lvl>
+    <w:lvl w:ilvl="3" w:tentative="1">
+      <w:start w:val="1"/>
+      <w:numFmt w:val="decimal"/>
+      <w:lvlText w:val="%4."/>
+      <w:lvlJc w:val="left"/>
+      <w:pPr>
+        <w:tabs>
+          <w:tab w:val="num" w:pos="2880"/>
+        </w:tabs>
+        <w:ind w:left="2880" w:hanging="360"/>
+      </w:pPr>
+    </w:lvl>
+    <w:lvl w:ilvl="4" w:tentative="1">
+      <w:start w:val="1"/>
+      <w:numFmt w:val="decimal"/>
+      <w:lvlText w:val="%5."/>
+      <w:lvlJc w:val="left"/>
+      <w:pPr>
+        <w:tabs>
+          <w:tab w:val="num" w:pos="3600"/>
+        </w:tabs>
+        <w:ind w:left="3600" w:hanging="360"/>
+      </w:pPr>
+    </w:lvl>
+    <w:lvl w:ilvl="5" w:tentative="1">
+      <w:start w:val="1"/>
+      <w:numFmt w:val="decimal"/>
+      <w:lvlText w:val="%6."/>
+      <w:lvlJc w:val="left"/>
+      <w:pPr>
+        <w:tabs>
+          <w:tab w:val="num" w:pos="4320"/>
+        </w:tabs>
+        <w:ind w:left="4320" w:hanging="360"/>
+      </w:pPr>
+    </w:lvl>
+    <w:lvl w:ilvl="6" w:tentative="1">
+      <w:start w:val="1"/>
+      <w:numFmt w:val="decimal"/>
+      <w:lvlText w:val="%7."/>
+      <w:lvlJc w:val="left"/>
+      <w:pPr>
+        <w:tabs>
+          <w:tab w:val="num" w:pos="5040"/>
+        </w:tabs>
+        <w:ind w:left="5040" w:hanging="360"/>
+      </w:pPr>
+    </w:lvl>
+    <w:lvl w:ilvl="7" w:tentative="1">
+      <w:start w:val="1"/>
+      <w:numFmt w:val="decimal"/>
+      <w:lvlText w:val="%8."/>
+      <w:lvlJc w:val="left"/>
+      <w:pPr>
+        <w:tabs>
+          <w:tab w:val="num" w:pos="5760"/>
+        </w:tabs>
+        <w:ind w:left="5760" w:hanging="360"/>
+      </w:pPr>
+    </w:lvl>
+    <w:lvl w:ilvl="8" w:tentative="1">
+      <w:start w:val="1"/>
+      <w:numFmt w:val="decimal"/>
+      <w:lvlText w:val="%9."/>
+      <w:lvlJc w:val="left"/>
+      <w:pPr>
+        <w:tabs>
+          <w:tab w:val="num" w:pos="6480"/>
+        </w:tabs>
+        <w:ind w:left="6480" w:hanging="360"/>
+      </w:pPr>
+    </w:lvl>
+  </w:abstractNum>
+  <w:abstractNum w:abstractNumId="4" w15:restartNumberingAfterBreak="0">
     <w:nsid w:val="2812658D"/>
     <w:multiLevelType w:val="hybridMultilevel"/>
     <w:tmpl w:val="208E4D56"/>
@@ -7109,7 +10140,459 @@
       </w:pPr>
     </w:lvl>
   </w:abstractNum>
-  <w:abstractNum w:abstractNumId="3" w15:restartNumberingAfterBreak="0">
+  <w:abstractNum w:abstractNumId="5" w15:restartNumberingAfterBreak="0">
+    <w:nsid w:val="2A292607"/>
+    <w:multiLevelType w:val="multilevel"/>
+    <w:tmpl w:val="1B78446E"/>
+    <w:lvl w:ilvl="0">
+      <w:start w:val="1"/>
+      <w:numFmt w:val="decimal"/>
+      <w:lvlText w:val="%1."/>
+      <w:lvlJc w:val="left"/>
+      <w:pPr>
+        <w:tabs>
+          <w:tab w:val="num" w:pos="720"/>
+        </w:tabs>
+        <w:ind w:left="720" w:hanging="360"/>
+      </w:pPr>
+    </w:lvl>
+    <w:lvl w:ilvl="1" w:tentative="1">
+      <w:start w:val="1"/>
+      <w:numFmt w:val="decimal"/>
+      <w:lvlText w:val="%2."/>
+      <w:lvlJc w:val="left"/>
+      <w:pPr>
+        <w:tabs>
+          <w:tab w:val="num" w:pos="1440"/>
+        </w:tabs>
+        <w:ind w:left="1440" w:hanging="360"/>
+      </w:pPr>
+    </w:lvl>
+    <w:lvl w:ilvl="2" w:tentative="1">
+      <w:start w:val="1"/>
+      <w:numFmt w:val="decimal"/>
+      <w:lvlText w:val="%3."/>
+      <w:lvlJc w:val="left"/>
+      <w:pPr>
+        <w:tabs>
+          <w:tab w:val="num" w:pos="2160"/>
+        </w:tabs>
+        <w:ind w:left="2160" w:hanging="360"/>
+      </w:pPr>
+    </w:lvl>
+    <w:lvl w:ilvl="3" w:tentative="1">
+      <w:start w:val="1"/>
+      <w:numFmt w:val="decimal"/>
+      <w:lvlText w:val="%4."/>
+      <w:lvlJc w:val="left"/>
+      <w:pPr>
+        <w:tabs>
+          <w:tab w:val="num" w:pos="2880"/>
+        </w:tabs>
+        <w:ind w:left="2880" w:hanging="360"/>
+      </w:pPr>
+    </w:lvl>
+    <w:lvl w:ilvl="4" w:tentative="1">
+      <w:start w:val="1"/>
+      <w:numFmt w:val="decimal"/>
+      <w:lvlText w:val="%5."/>
+      <w:lvlJc w:val="left"/>
+      <w:pPr>
+        <w:tabs>
+          <w:tab w:val="num" w:pos="3600"/>
+        </w:tabs>
+        <w:ind w:left="3600" w:hanging="360"/>
+      </w:pPr>
+    </w:lvl>
+    <w:lvl w:ilvl="5" w:tentative="1">
+      <w:start w:val="1"/>
+      <w:numFmt w:val="decimal"/>
+      <w:lvlText w:val="%6."/>
+      <w:lvlJc w:val="left"/>
+      <w:pPr>
+        <w:tabs>
+          <w:tab w:val="num" w:pos="4320"/>
+        </w:tabs>
+        <w:ind w:left="4320" w:hanging="360"/>
+      </w:pPr>
+    </w:lvl>
+    <w:lvl w:ilvl="6" w:tentative="1">
+      <w:start w:val="1"/>
+      <w:numFmt w:val="decimal"/>
+      <w:lvlText w:val="%7."/>
+      <w:lvlJc w:val="left"/>
+      <w:pPr>
+        <w:tabs>
+          <w:tab w:val="num" w:pos="5040"/>
+        </w:tabs>
+        <w:ind w:left="5040" w:hanging="360"/>
+      </w:pPr>
+    </w:lvl>
+    <w:lvl w:ilvl="7" w:tentative="1">
+      <w:start w:val="1"/>
+      <w:numFmt w:val="decimal"/>
+      <w:lvlText w:val="%8."/>
+      <w:lvlJc w:val="left"/>
+      <w:pPr>
+        <w:tabs>
+          <w:tab w:val="num" w:pos="5760"/>
+        </w:tabs>
+        <w:ind w:left="5760" w:hanging="360"/>
+      </w:pPr>
+    </w:lvl>
+    <w:lvl w:ilvl="8" w:tentative="1">
+      <w:start w:val="1"/>
+      <w:numFmt w:val="decimal"/>
+      <w:lvlText w:val="%9."/>
+      <w:lvlJc w:val="left"/>
+      <w:pPr>
+        <w:tabs>
+          <w:tab w:val="num" w:pos="6480"/>
+        </w:tabs>
+        <w:ind w:left="6480" w:hanging="360"/>
+      </w:pPr>
+    </w:lvl>
+  </w:abstractNum>
+  <w:abstractNum w:abstractNumId="6" w15:restartNumberingAfterBreak="0">
+    <w:nsid w:val="2F965CFD"/>
+    <w:multiLevelType w:val="multilevel"/>
+    <w:tmpl w:val="5E2E78C6"/>
+    <w:lvl w:ilvl="0">
+      <w:start w:val="5"/>
+      <w:numFmt w:val="decimal"/>
+      <w:lvlText w:val="%1."/>
+      <w:lvlJc w:val="left"/>
+      <w:pPr>
+        <w:tabs>
+          <w:tab w:val="num" w:pos="720"/>
+        </w:tabs>
+        <w:ind w:left="720" w:hanging="360"/>
+      </w:pPr>
+    </w:lvl>
+    <w:lvl w:ilvl="1" w:tentative="1">
+      <w:start w:val="1"/>
+      <w:numFmt w:val="decimal"/>
+      <w:lvlText w:val="%2."/>
+      <w:lvlJc w:val="left"/>
+      <w:pPr>
+        <w:tabs>
+          <w:tab w:val="num" w:pos="1440"/>
+        </w:tabs>
+        <w:ind w:left="1440" w:hanging="360"/>
+      </w:pPr>
+    </w:lvl>
+    <w:lvl w:ilvl="2" w:tentative="1">
+      <w:start w:val="1"/>
+      <w:numFmt w:val="decimal"/>
+      <w:lvlText w:val="%3."/>
+      <w:lvlJc w:val="left"/>
+      <w:pPr>
+        <w:tabs>
+          <w:tab w:val="num" w:pos="2160"/>
+        </w:tabs>
+        <w:ind w:left="2160" w:hanging="360"/>
+      </w:pPr>
+    </w:lvl>
+    <w:lvl w:ilvl="3" w:tentative="1">
+      <w:start w:val="1"/>
+      <w:numFmt w:val="decimal"/>
+      <w:lvlText w:val="%4."/>
+      <w:lvlJc w:val="left"/>
+      <w:pPr>
+        <w:tabs>
+          <w:tab w:val="num" w:pos="2880"/>
+        </w:tabs>
+        <w:ind w:left="2880" w:hanging="360"/>
+      </w:pPr>
+    </w:lvl>
+    <w:lvl w:ilvl="4" w:tentative="1">
+      <w:start w:val="1"/>
+      <w:numFmt w:val="decimal"/>
+      <w:lvlText w:val="%5."/>
+      <w:lvlJc w:val="left"/>
+      <w:pPr>
+        <w:tabs>
+          <w:tab w:val="num" w:pos="3600"/>
+        </w:tabs>
+        <w:ind w:left="3600" w:hanging="360"/>
+      </w:pPr>
+    </w:lvl>
+    <w:lvl w:ilvl="5" w:tentative="1">
+      <w:start w:val="1"/>
+      <w:numFmt w:val="decimal"/>
+      <w:lvlText w:val="%6."/>
+      <w:lvlJc w:val="left"/>
+      <w:pPr>
+        <w:tabs>
+          <w:tab w:val="num" w:pos="4320"/>
+        </w:tabs>
+        <w:ind w:left="4320" w:hanging="360"/>
+      </w:pPr>
+    </w:lvl>
+    <w:lvl w:ilvl="6" w:tentative="1">
+      <w:start w:val="1"/>
+      <w:numFmt w:val="decimal"/>
+      <w:lvlText w:val="%7."/>
+      <w:lvlJc w:val="left"/>
+      <w:pPr>
+        <w:tabs>
+          <w:tab w:val="num" w:pos="5040"/>
+        </w:tabs>
+        <w:ind w:left="5040" w:hanging="360"/>
+      </w:pPr>
+    </w:lvl>
+    <w:lvl w:ilvl="7" w:tentative="1">
+      <w:start w:val="1"/>
+      <w:numFmt w:val="decimal"/>
+      <w:lvlText w:val="%8."/>
+      <w:lvlJc w:val="left"/>
+      <w:pPr>
+        <w:tabs>
+          <w:tab w:val="num" w:pos="5760"/>
+        </w:tabs>
+        <w:ind w:left="5760" w:hanging="360"/>
+      </w:pPr>
+    </w:lvl>
+    <w:lvl w:ilvl="8" w:tentative="1">
+      <w:start w:val="1"/>
+      <w:numFmt w:val="decimal"/>
+      <w:lvlText w:val="%9."/>
+      <w:lvlJc w:val="left"/>
+      <w:pPr>
+        <w:tabs>
+          <w:tab w:val="num" w:pos="6480"/>
+        </w:tabs>
+        <w:ind w:left="6480" w:hanging="360"/>
+      </w:pPr>
+    </w:lvl>
+  </w:abstractNum>
+  <w:abstractNum w:abstractNumId="7" w15:restartNumberingAfterBreak="0">
+    <w:nsid w:val="3DF927F4"/>
+    <w:multiLevelType w:val="multilevel"/>
+    <w:tmpl w:val="0BF2BAAC"/>
+    <w:lvl w:ilvl="0">
+      <w:start w:val="6"/>
+      <w:numFmt w:val="decimal"/>
+      <w:lvlText w:val="%1."/>
+      <w:lvlJc w:val="left"/>
+      <w:pPr>
+        <w:tabs>
+          <w:tab w:val="num" w:pos="720"/>
+        </w:tabs>
+        <w:ind w:left="720" w:hanging="360"/>
+      </w:pPr>
+    </w:lvl>
+    <w:lvl w:ilvl="1" w:tentative="1">
+      <w:start w:val="1"/>
+      <w:numFmt w:val="decimal"/>
+      <w:lvlText w:val="%2."/>
+      <w:lvlJc w:val="left"/>
+      <w:pPr>
+        <w:tabs>
+          <w:tab w:val="num" w:pos="1440"/>
+        </w:tabs>
+        <w:ind w:left="1440" w:hanging="360"/>
+      </w:pPr>
+    </w:lvl>
+    <w:lvl w:ilvl="2" w:tentative="1">
+      <w:start w:val="1"/>
+      <w:numFmt w:val="decimal"/>
+      <w:lvlText w:val="%3."/>
+      <w:lvlJc w:val="left"/>
+      <w:pPr>
+        <w:tabs>
+          <w:tab w:val="num" w:pos="2160"/>
+        </w:tabs>
+        <w:ind w:left="2160" w:hanging="360"/>
+      </w:pPr>
+    </w:lvl>
+    <w:lvl w:ilvl="3" w:tentative="1">
+      <w:start w:val="1"/>
+      <w:numFmt w:val="decimal"/>
+      <w:lvlText w:val="%4."/>
+      <w:lvlJc w:val="left"/>
+      <w:pPr>
+        <w:tabs>
+          <w:tab w:val="num" w:pos="2880"/>
+        </w:tabs>
+        <w:ind w:left="2880" w:hanging="360"/>
+      </w:pPr>
+    </w:lvl>
+    <w:lvl w:ilvl="4" w:tentative="1">
+      <w:start w:val="1"/>
+      <w:numFmt w:val="decimal"/>
+      <w:lvlText w:val="%5."/>
+      <w:lvlJc w:val="left"/>
+      <w:pPr>
+        <w:tabs>
+          <w:tab w:val="num" w:pos="3600"/>
+        </w:tabs>
+        <w:ind w:left="3600" w:hanging="360"/>
+      </w:pPr>
+    </w:lvl>
+    <w:lvl w:ilvl="5" w:tentative="1">
+      <w:start w:val="1"/>
+      <w:numFmt w:val="decimal"/>
+      <w:lvlText w:val="%6."/>
+      <w:lvlJc w:val="left"/>
+      <w:pPr>
+        <w:tabs>
+          <w:tab w:val="num" w:pos="4320"/>
+        </w:tabs>
+        <w:ind w:left="4320" w:hanging="360"/>
+      </w:pPr>
+    </w:lvl>
+    <w:lvl w:ilvl="6" w:tentative="1">
+      <w:start w:val="1"/>
+      <w:numFmt w:val="decimal"/>
+      <w:lvlText w:val="%7."/>
+      <w:lvlJc w:val="left"/>
+      <w:pPr>
+        <w:tabs>
+          <w:tab w:val="num" w:pos="5040"/>
+        </w:tabs>
+        <w:ind w:left="5040" w:hanging="360"/>
+      </w:pPr>
+    </w:lvl>
+    <w:lvl w:ilvl="7" w:tentative="1">
+      <w:start w:val="1"/>
+      <w:numFmt w:val="decimal"/>
+      <w:lvlText w:val="%8."/>
+      <w:lvlJc w:val="left"/>
+      <w:pPr>
+        <w:tabs>
+          <w:tab w:val="num" w:pos="5760"/>
+        </w:tabs>
+        <w:ind w:left="5760" w:hanging="360"/>
+      </w:pPr>
+    </w:lvl>
+    <w:lvl w:ilvl="8" w:tentative="1">
+      <w:start w:val="1"/>
+      <w:numFmt w:val="decimal"/>
+      <w:lvlText w:val="%9."/>
+      <w:lvlJc w:val="left"/>
+      <w:pPr>
+        <w:tabs>
+          <w:tab w:val="num" w:pos="6480"/>
+        </w:tabs>
+        <w:ind w:left="6480" w:hanging="360"/>
+      </w:pPr>
+    </w:lvl>
+  </w:abstractNum>
+  <w:abstractNum w:abstractNumId="8" w15:restartNumberingAfterBreak="0">
+    <w:nsid w:val="3E532CC7"/>
+    <w:multiLevelType w:val="multilevel"/>
+    <w:tmpl w:val="FB9C43B0"/>
+    <w:lvl w:ilvl="0">
+      <w:start w:val="2"/>
+      <w:numFmt w:val="decimal"/>
+      <w:lvlText w:val="%1."/>
+      <w:lvlJc w:val="left"/>
+      <w:pPr>
+        <w:tabs>
+          <w:tab w:val="num" w:pos="720"/>
+        </w:tabs>
+        <w:ind w:left="720" w:hanging="360"/>
+      </w:pPr>
+    </w:lvl>
+    <w:lvl w:ilvl="1" w:tentative="1">
+      <w:start w:val="1"/>
+      <w:numFmt w:val="decimal"/>
+      <w:lvlText w:val="%2."/>
+      <w:lvlJc w:val="left"/>
+      <w:pPr>
+        <w:tabs>
+          <w:tab w:val="num" w:pos="1440"/>
+        </w:tabs>
+        <w:ind w:left="1440" w:hanging="360"/>
+      </w:pPr>
+    </w:lvl>
+    <w:lvl w:ilvl="2" w:tentative="1">
+      <w:start w:val="1"/>
+      <w:numFmt w:val="decimal"/>
+      <w:lvlText w:val="%3."/>
+      <w:lvlJc w:val="left"/>
+      <w:pPr>
+        <w:tabs>
+          <w:tab w:val="num" w:pos="2160"/>
+        </w:tabs>
+        <w:ind w:left="2160" w:hanging="360"/>
+      </w:pPr>
+    </w:lvl>
+    <w:lvl w:ilvl="3" w:tentative="1">
+      <w:start w:val="1"/>
+      <w:numFmt w:val="decimal"/>
+      <w:lvlText w:val="%4."/>
+      <w:lvlJc w:val="left"/>
+      <w:pPr>
+        <w:tabs>
+          <w:tab w:val="num" w:pos="2880"/>
+        </w:tabs>
+        <w:ind w:left="2880" w:hanging="360"/>
+      </w:pPr>
+    </w:lvl>
+    <w:lvl w:ilvl="4" w:tentative="1">
+      <w:start w:val="1"/>
+      <w:numFmt w:val="decimal"/>
+      <w:lvlText w:val="%5."/>
+      <w:lvlJc w:val="left"/>
+      <w:pPr>
+        <w:tabs>
+          <w:tab w:val="num" w:pos="3600"/>
+        </w:tabs>
+        <w:ind w:left="3600" w:hanging="360"/>
+      </w:pPr>
+    </w:lvl>
+    <w:lvl w:ilvl="5" w:tentative="1">
+      <w:start w:val="1"/>
+      <w:numFmt w:val="decimal"/>
+      <w:lvlText w:val="%6."/>
+      <w:lvlJc w:val="left"/>
+      <w:pPr>
+        <w:tabs>
+          <w:tab w:val="num" w:pos="4320"/>
+        </w:tabs>
+        <w:ind w:left="4320" w:hanging="360"/>
+      </w:pPr>
+    </w:lvl>
+    <w:lvl w:ilvl="6" w:tentative="1">
+      <w:start w:val="1"/>
+      <w:numFmt w:val="decimal"/>
+      <w:lvlText w:val="%7."/>
+      <w:lvlJc w:val="left"/>
+      <w:pPr>
+        <w:tabs>
+          <w:tab w:val="num" w:pos="5040"/>
+        </w:tabs>
+        <w:ind w:left="5040" w:hanging="360"/>
+      </w:pPr>
+    </w:lvl>
+    <w:lvl w:ilvl="7" w:tentative="1">
+      <w:start w:val="1"/>
+      <w:numFmt w:val="decimal"/>
+      <w:lvlText w:val="%8."/>
+      <w:lvlJc w:val="left"/>
+      <w:pPr>
+        <w:tabs>
+          <w:tab w:val="num" w:pos="5760"/>
+        </w:tabs>
+        <w:ind w:left="5760" w:hanging="360"/>
+      </w:pPr>
+    </w:lvl>
+    <w:lvl w:ilvl="8" w:tentative="1">
+      <w:start w:val="1"/>
+      <w:numFmt w:val="decimal"/>
+      <w:lvlText w:val="%9."/>
+      <w:lvlJc w:val="left"/>
+      <w:pPr>
+        <w:tabs>
+          <w:tab w:val="num" w:pos="6480"/>
+        </w:tabs>
+        <w:ind w:left="6480" w:hanging="360"/>
+      </w:pPr>
+    </w:lvl>
+  </w:abstractNum>
+  <w:abstractNum w:abstractNumId="9" w15:restartNumberingAfterBreak="0">
     <w:nsid w:val="46737DB1"/>
     <w:multiLevelType w:val="hybridMultilevel"/>
     <w:tmpl w:val="A95E1742"/>
@@ -7196,7 +10679,7 @@
       </w:pPr>
     </w:lvl>
   </w:abstractNum>
-  <w:abstractNum w:abstractNumId="4" w15:restartNumberingAfterBreak="0">
+  <w:abstractNum w:abstractNumId="10" w15:restartNumberingAfterBreak="0">
     <w:nsid w:val="4AE62145"/>
     <w:multiLevelType w:val="multilevel"/>
     <w:tmpl w:val="CADE2EA2"/>
@@ -7343,11 +10826,124 @@
       </w:rPr>
     </w:lvl>
   </w:abstractNum>
-  <w:abstractNum w:abstractNumId="5" w15:restartNumberingAfterBreak="0">
+  <w:abstractNum w:abstractNumId="11" w15:restartNumberingAfterBreak="0">
+    <w:nsid w:val="4BAD7D35"/>
+    <w:multiLevelType w:val="multilevel"/>
+    <w:tmpl w:val="6D48D582"/>
+    <w:lvl w:ilvl="0">
+      <w:start w:val="1"/>
+      <w:numFmt w:val="decimal"/>
+      <w:lvlText w:val="%1."/>
+      <w:lvlJc w:val="left"/>
+      <w:pPr>
+        <w:tabs>
+          <w:tab w:val="num" w:pos="720"/>
+        </w:tabs>
+        <w:ind w:left="720" w:hanging="360"/>
+      </w:pPr>
+    </w:lvl>
+    <w:lvl w:ilvl="1" w:tentative="1">
+      <w:start w:val="1"/>
+      <w:numFmt w:val="decimal"/>
+      <w:lvlText w:val="%2."/>
+      <w:lvlJc w:val="left"/>
+      <w:pPr>
+        <w:tabs>
+          <w:tab w:val="num" w:pos="1440"/>
+        </w:tabs>
+        <w:ind w:left="1440" w:hanging="360"/>
+      </w:pPr>
+    </w:lvl>
+    <w:lvl w:ilvl="2" w:tentative="1">
+      <w:start w:val="1"/>
+      <w:numFmt w:val="decimal"/>
+      <w:lvlText w:val="%3."/>
+      <w:lvlJc w:val="left"/>
+      <w:pPr>
+        <w:tabs>
+          <w:tab w:val="num" w:pos="2160"/>
+        </w:tabs>
+        <w:ind w:left="2160" w:hanging="360"/>
+      </w:pPr>
+    </w:lvl>
+    <w:lvl w:ilvl="3" w:tentative="1">
+      <w:start w:val="1"/>
+      <w:numFmt w:val="decimal"/>
+      <w:lvlText w:val="%4."/>
+      <w:lvlJc w:val="left"/>
+      <w:pPr>
+        <w:tabs>
+          <w:tab w:val="num" w:pos="2880"/>
+        </w:tabs>
+        <w:ind w:left="2880" w:hanging="360"/>
+      </w:pPr>
+    </w:lvl>
+    <w:lvl w:ilvl="4" w:tentative="1">
+      <w:start w:val="1"/>
+      <w:numFmt w:val="decimal"/>
+      <w:lvlText w:val="%5."/>
+      <w:lvlJc w:val="left"/>
+      <w:pPr>
+        <w:tabs>
+          <w:tab w:val="num" w:pos="3600"/>
+        </w:tabs>
+        <w:ind w:left="3600" w:hanging="360"/>
+      </w:pPr>
+    </w:lvl>
+    <w:lvl w:ilvl="5" w:tentative="1">
+      <w:start w:val="1"/>
+      <w:numFmt w:val="decimal"/>
+      <w:lvlText w:val="%6."/>
+      <w:lvlJc w:val="left"/>
+      <w:pPr>
+        <w:tabs>
+          <w:tab w:val="num" w:pos="4320"/>
+        </w:tabs>
+        <w:ind w:left="4320" w:hanging="360"/>
+      </w:pPr>
+    </w:lvl>
+    <w:lvl w:ilvl="6" w:tentative="1">
+      <w:start w:val="1"/>
+      <w:numFmt w:val="decimal"/>
+      <w:lvlText w:val="%7."/>
+      <w:lvlJc w:val="left"/>
+      <w:pPr>
+        <w:tabs>
+          <w:tab w:val="num" w:pos="5040"/>
+        </w:tabs>
+        <w:ind w:left="5040" w:hanging="360"/>
+      </w:pPr>
+    </w:lvl>
+    <w:lvl w:ilvl="7" w:tentative="1">
+      <w:start w:val="1"/>
+      <w:numFmt w:val="decimal"/>
+      <w:lvlText w:val="%8."/>
+      <w:lvlJc w:val="left"/>
+      <w:pPr>
+        <w:tabs>
+          <w:tab w:val="num" w:pos="5760"/>
+        </w:tabs>
+        <w:ind w:left="5760" w:hanging="360"/>
+      </w:pPr>
+    </w:lvl>
+    <w:lvl w:ilvl="8" w:tentative="1">
+      <w:start w:val="1"/>
+      <w:numFmt w:val="decimal"/>
+      <w:lvlText w:val="%9."/>
+      <w:lvlJc w:val="left"/>
+      <w:pPr>
+        <w:tabs>
+          <w:tab w:val="num" w:pos="6480"/>
+        </w:tabs>
+        <w:ind w:left="6480" w:hanging="360"/>
+      </w:pPr>
+    </w:lvl>
+  </w:abstractNum>
+  <w:abstractNum w:abstractNumId="12" w15:restartNumberingAfterBreak="0">
     <w:nsid w:val="5314000D"/>
     <w:multiLevelType w:val="hybridMultilevel"/>
-    <w:tmpl w:val="58841CEA"/>
-    <w:lvl w:ilvl="0" w:tplc="097AE4CA">
+    <w:tmpl w:val="6B16C3C8"/>
+    <w:lvl w:ilvl="0" w:tplc="5C9E89E2">
       <w:start w:val="1"/>
       <w:numFmt w:val="upperRoman"/>
       <w:pStyle w:val="Heading1"/>
@@ -7430,7 +11026,382 @@
       </w:pPr>
     </w:lvl>
   </w:abstractNum>
-  <w:abstractNum w:abstractNumId="6" w15:restartNumberingAfterBreak="0">
+  <w:abstractNum w:abstractNumId="13" w15:restartNumberingAfterBreak="0">
+    <w:nsid w:val="5E1809E8"/>
+    <w:multiLevelType w:val="multilevel"/>
+    <w:tmpl w:val="6A665A6C"/>
+    <w:lvl w:ilvl="0">
+      <w:start w:val="2"/>
+      <w:numFmt w:val="decimal"/>
+      <w:lvlText w:val="%1."/>
+      <w:lvlJc w:val="left"/>
+      <w:pPr>
+        <w:tabs>
+          <w:tab w:val="num" w:pos="720"/>
+        </w:tabs>
+        <w:ind w:left="720" w:hanging="360"/>
+      </w:pPr>
+    </w:lvl>
+    <w:lvl w:ilvl="1" w:tentative="1">
+      <w:start w:val="1"/>
+      <w:numFmt w:val="decimal"/>
+      <w:lvlText w:val="%2."/>
+      <w:lvlJc w:val="left"/>
+      <w:pPr>
+        <w:tabs>
+          <w:tab w:val="num" w:pos="1440"/>
+        </w:tabs>
+        <w:ind w:left="1440" w:hanging="360"/>
+      </w:pPr>
+    </w:lvl>
+    <w:lvl w:ilvl="2" w:tentative="1">
+      <w:start w:val="1"/>
+      <w:numFmt w:val="decimal"/>
+      <w:lvlText w:val="%3."/>
+      <w:lvlJc w:val="left"/>
+      <w:pPr>
+        <w:tabs>
+          <w:tab w:val="num" w:pos="2160"/>
+        </w:tabs>
+        <w:ind w:left="2160" w:hanging="360"/>
+      </w:pPr>
+    </w:lvl>
+    <w:lvl w:ilvl="3" w:tentative="1">
+      <w:start w:val="1"/>
+      <w:numFmt w:val="decimal"/>
+      <w:lvlText w:val="%4."/>
+      <w:lvlJc w:val="left"/>
+      <w:pPr>
+        <w:tabs>
+          <w:tab w:val="num" w:pos="2880"/>
+        </w:tabs>
+        <w:ind w:left="2880" w:hanging="360"/>
+      </w:pPr>
+    </w:lvl>
+    <w:lvl w:ilvl="4" w:tentative="1">
+      <w:start w:val="1"/>
+      <w:numFmt w:val="decimal"/>
+      <w:lvlText w:val="%5."/>
+      <w:lvlJc w:val="left"/>
+      <w:pPr>
+        <w:tabs>
+          <w:tab w:val="num" w:pos="3600"/>
+        </w:tabs>
+        <w:ind w:left="3600" w:hanging="360"/>
+      </w:pPr>
+    </w:lvl>
+    <w:lvl w:ilvl="5" w:tentative="1">
+      <w:start w:val="1"/>
+      <w:numFmt w:val="decimal"/>
+      <w:lvlText w:val="%6."/>
+      <w:lvlJc w:val="left"/>
+      <w:pPr>
+        <w:tabs>
+          <w:tab w:val="num" w:pos="4320"/>
+        </w:tabs>
+        <w:ind w:left="4320" w:hanging="360"/>
+      </w:pPr>
+    </w:lvl>
+    <w:lvl w:ilvl="6" w:tentative="1">
+      <w:start w:val="1"/>
+      <w:numFmt w:val="decimal"/>
+      <w:lvlText w:val="%7."/>
+      <w:lvlJc w:val="left"/>
+      <w:pPr>
+        <w:tabs>
+          <w:tab w:val="num" w:pos="5040"/>
+        </w:tabs>
+        <w:ind w:left="5040" w:hanging="360"/>
+      </w:pPr>
+    </w:lvl>
+    <w:lvl w:ilvl="7" w:tentative="1">
+      <w:start w:val="1"/>
+      <w:numFmt w:val="decimal"/>
+      <w:lvlText w:val="%8."/>
+      <w:lvlJc w:val="left"/>
+      <w:pPr>
+        <w:tabs>
+          <w:tab w:val="num" w:pos="5760"/>
+        </w:tabs>
+        <w:ind w:left="5760" w:hanging="360"/>
+      </w:pPr>
+    </w:lvl>
+    <w:lvl w:ilvl="8" w:tentative="1">
+      <w:start w:val="1"/>
+      <w:numFmt w:val="decimal"/>
+      <w:lvlText w:val="%9."/>
+      <w:lvlJc w:val="left"/>
+      <w:pPr>
+        <w:tabs>
+          <w:tab w:val="num" w:pos="6480"/>
+        </w:tabs>
+        <w:ind w:left="6480" w:hanging="360"/>
+      </w:pPr>
+    </w:lvl>
+  </w:abstractNum>
+  <w:abstractNum w:abstractNumId="14" w15:restartNumberingAfterBreak="0">
+    <w:nsid w:val="5EA7671C"/>
+    <w:multiLevelType w:val="multilevel"/>
+    <w:tmpl w:val="E2D0F3D8"/>
+    <w:lvl w:ilvl="0">
+      <w:start w:val="1"/>
+      <w:numFmt w:val="decimal"/>
+      <w:lvlText w:val="%1."/>
+      <w:lvlJc w:val="left"/>
+      <w:pPr>
+        <w:tabs>
+          <w:tab w:val="num" w:pos="720"/>
+        </w:tabs>
+        <w:ind w:left="720" w:hanging="360"/>
+      </w:pPr>
+    </w:lvl>
+    <w:lvl w:ilvl="1" w:tentative="1">
+      <w:start w:val="1"/>
+      <w:numFmt w:val="decimal"/>
+      <w:lvlText w:val="%2."/>
+      <w:lvlJc w:val="left"/>
+      <w:pPr>
+        <w:tabs>
+          <w:tab w:val="num" w:pos="1440"/>
+        </w:tabs>
+        <w:ind w:left="1440" w:hanging="360"/>
+      </w:pPr>
+    </w:lvl>
+    <w:lvl w:ilvl="2" w:tentative="1">
+      <w:start w:val="1"/>
+      <w:numFmt w:val="decimal"/>
+      <w:lvlText w:val="%3."/>
+      <w:lvlJc w:val="left"/>
+      <w:pPr>
+        <w:tabs>
+          <w:tab w:val="num" w:pos="2160"/>
+        </w:tabs>
+        <w:ind w:left="2160" w:hanging="360"/>
+      </w:pPr>
+    </w:lvl>
+    <w:lvl w:ilvl="3" w:tentative="1">
+      <w:start w:val="1"/>
+      <w:numFmt w:val="decimal"/>
+      <w:lvlText w:val="%4."/>
+      <w:lvlJc w:val="left"/>
+      <w:pPr>
+        <w:tabs>
+          <w:tab w:val="num" w:pos="2880"/>
+        </w:tabs>
+        <w:ind w:left="2880" w:hanging="360"/>
+      </w:pPr>
+    </w:lvl>
+    <w:lvl w:ilvl="4" w:tentative="1">
+      <w:start w:val="1"/>
+      <w:numFmt w:val="decimal"/>
+      <w:lvlText w:val="%5."/>
+      <w:lvlJc w:val="left"/>
+      <w:pPr>
+        <w:tabs>
+          <w:tab w:val="num" w:pos="3600"/>
+        </w:tabs>
+        <w:ind w:left="3600" w:hanging="360"/>
+      </w:pPr>
+    </w:lvl>
+    <w:lvl w:ilvl="5" w:tentative="1">
+      <w:start w:val="1"/>
+      <w:numFmt w:val="decimal"/>
+      <w:lvlText w:val="%6."/>
+      <w:lvlJc w:val="left"/>
+      <w:pPr>
+        <w:tabs>
+          <w:tab w:val="num" w:pos="4320"/>
+        </w:tabs>
+        <w:ind w:left="4320" w:hanging="360"/>
+      </w:pPr>
+    </w:lvl>
+    <w:lvl w:ilvl="6" w:tentative="1">
+      <w:start w:val="1"/>
+      <w:numFmt w:val="decimal"/>
+      <w:lvlText w:val="%7."/>
+      <w:lvlJc w:val="left"/>
+      <w:pPr>
+        <w:tabs>
+          <w:tab w:val="num" w:pos="5040"/>
+        </w:tabs>
+        <w:ind w:left="5040" w:hanging="360"/>
+      </w:pPr>
+    </w:lvl>
+    <w:lvl w:ilvl="7" w:tentative="1">
+      <w:start w:val="1"/>
+      <w:numFmt w:val="decimal"/>
+      <w:lvlText w:val="%8."/>
+      <w:lvlJc w:val="left"/>
+      <w:pPr>
+        <w:tabs>
+          <w:tab w:val="num" w:pos="5760"/>
+        </w:tabs>
+        <w:ind w:left="5760" w:hanging="360"/>
+      </w:pPr>
+    </w:lvl>
+    <w:lvl w:ilvl="8" w:tentative="1">
+      <w:start w:val="1"/>
+      <w:numFmt w:val="decimal"/>
+      <w:lvlText w:val="%9."/>
+      <w:lvlJc w:val="left"/>
+      <w:pPr>
+        <w:tabs>
+          <w:tab w:val="num" w:pos="6480"/>
+        </w:tabs>
+        <w:ind w:left="6480" w:hanging="360"/>
+      </w:pPr>
+    </w:lvl>
+  </w:abstractNum>
+  <w:abstractNum w:abstractNumId="15" w15:restartNumberingAfterBreak="0">
+    <w:nsid w:val="6F3F0F6D"/>
+    <w:multiLevelType w:val="multilevel"/>
+    <w:tmpl w:val="E30E361A"/>
+    <w:lvl w:ilvl="0">
+      <w:start w:val="1"/>
+      <w:numFmt w:val="bullet"/>
+      <w:lvlText w:val=""/>
+      <w:lvlJc w:val="left"/>
+      <w:pPr>
+        <w:tabs>
+          <w:tab w:val="num" w:pos="720"/>
+        </w:tabs>
+        <w:ind w:left="720" w:hanging="360"/>
+      </w:pPr>
+      <w:rPr>
+        <w:rFonts w:ascii="Symbol" w:hAnsi="Symbol" w:hint="default"/>
+        <w:sz w:val="20"/>
+      </w:rPr>
+    </w:lvl>
+    <w:lvl w:ilvl="1" w:tentative="1">
+      <w:start w:val="1"/>
+      <w:numFmt w:val="bullet"/>
+      <w:lvlText w:val="o"/>
+      <w:lvlJc w:val="left"/>
+      <w:pPr>
+        <w:tabs>
+          <w:tab w:val="num" w:pos="1440"/>
+        </w:tabs>
+        <w:ind w:left="1440" w:hanging="360"/>
+      </w:pPr>
+      <w:rPr>
+        <w:rFonts w:ascii="Courier New" w:hAnsi="Courier New" w:hint="default"/>
+        <w:sz w:val="20"/>
+      </w:rPr>
+    </w:lvl>
+    <w:lvl w:ilvl="2" w:tentative="1">
+      <w:start w:val="1"/>
+      <w:numFmt w:val="bullet"/>
+      <w:lvlText w:val=""/>
+      <w:lvlJc w:val="left"/>
+      <w:pPr>
+        <w:tabs>
+          <w:tab w:val="num" w:pos="2160"/>
+        </w:tabs>
+        <w:ind w:left="2160" w:hanging="360"/>
+      </w:pPr>
+      <w:rPr>
+        <w:rFonts w:ascii="Wingdings" w:hAnsi="Wingdings" w:hint="default"/>
+        <w:sz w:val="20"/>
+      </w:rPr>
+    </w:lvl>
+    <w:lvl w:ilvl="3" w:tentative="1">
+      <w:start w:val="1"/>
+      <w:numFmt w:val="bullet"/>
+      <w:lvlText w:val=""/>
+      <w:lvlJc w:val="left"/>
+      <w:pPr>
+        <w:tabs>
+          <w:tab w:val="num" w:pos="2880"/>
+        </w:tabs>
+        <w:ind w:left="2880" w:hanging="360"/>
+      </w:pPr>
+      <w:rPr>
+        <w:rFonts w:ascii="Wingdings" w:hAnsi="Wingdings" w:hint="default"/>
+        <w:sz w:val="20"/>
+      </w:rPr>
+    </w:lvl>
+    <w:lvl w:ilvl="4" w:tentative="1">
+      <w:start w:val="1"/>
+      <w:numFmt w:val="bullet"/>
+      <w:lvlText w:val=""/>
+      <w:lvlJc w:val="left"/>
+      <w:pPr>
+        <w:tabs>
+          <w:tab w:val="num" w:pos="3600"/>
+        </w:tabs>
+        <w:ind w:left="3600" w:hanging="360"/>
+      </w:pPr>
+      <w:rPr>
+        <w:rFonts w:ascii="Wingdings" w:hAnsi="Wingdings" w:hint="default"/>
+        <w:sz w:val="20"/>
+      </w:rPr>
+    </w:lvl>
+    <w:lvl w:ilvl="5" w:tentative="1">
+      <w:start w:val="1"/>
+      <w:numFmt w:val="bullet"/>
+      <w:lvlText w:val=""/>
+      <w:lvlJc w:val="left"/>
+      <w:pPr>
+        <w:tabs>
+          <w:tab w:val="num" w:pos="4320"/>
+        </w:tabs>
+        <w:ind w:left="4320" w:hanging="360"/>
+      </w:pPr>
+      <w:rPr>
+        <w:rFonts w:ascii="Wingdings" w:hAnsi="Wingdings" w:hint="default"/>
+        <w:sz w:val="20"/>
+      </w:rPr>
+    </w:lvl>
+    <w:lvl w:ilvl="6" w:tentative="1">
+      <w:start w:val="1"/>
+      <w:numFmt w:val="bullet"/>
+      <w:lvlText w:val=""/>
+      <w:lvlJc w:val="left"/>
+      <w:pPr>
+        <w:tabs>
+          <w:tab w:val="num" w:pos="5040"/>
+        </w:tabs>
+        <w:ind w:left="5040" w:hanging="360"/>
+      </w:pPr>
+      <w:rPr>
+        <w:rFonts w:ascii="Wingdings" w:hAnsi="Wingdings" w:hint="default"/>
+        <w:sz w:val="20"/>
+      </w:rPr>
+    </w:lvl>
+    <w:lvl w:ilvl="7" w:tentative="1">
+      <w:start w:val="1"/>
+      <w:numFmt w:val="bullet"/>
+      <w:lvlText w:val=""/>
+      <w:lvlJc w:val="left"/>
+      <w:pPr>
+        <w:tabs>
+          <w:tab w:val="num" w:pos="5760"/>
+        </w:tabs>
+        <w:ind w:left="5760" w:hanging="360"/>
+      </w:pPr>
+      <w:rPr>
+        <w:rFonts w:ascii="Wingdings" w:hAnsi="Wingdings" w:hint="default"/>
+        <w:sz w:val="20"/>
+      </w:rPr>
+    </w:lvl>
+    <w:lvl w:ilvl="8" w:tentative="1">
+      <w:start w:val="1"/>
+      <w:numFmt w:val="bullet"/>
+      <w:lvlText w:val=""/>
+      <w:lvlJc w:val="left"/>
+      <w:pPr>
+        <w:tabs>
+          <w:tab w:val="num" w:pos="6480"/>
+        </w:tabs>
+        <w:ind w:left="6480" w:hanging="360"/>
+      </w:pPr>
+      <w:rPr>
+        <w:rFonts w:ascii="Wingdings" w:hAnsi="Wingdings" w:hint="default"/>
+        <w:sz w:val="20"/>
+      </w:rPr>
+    </w:lvl>
+  </w:abstractNum>
+  <w:abstractNum w:abstractNumId="16" w15:restartNumberingAfterBreak="0">
     <w:nsid w:val="71A350A1"/>
     <w:multiLevelType w:val="multilevel"/>
     <w:tmpl w:val="D4D46A66"/>
@@ -7580,34 +11551,94 @@
     </w:lvl>
   </w:abstractNum>
   <w:num w:numId="1" w16cid:durableId="1731537013">
-    <w:abstractNumId w:val="5"/>
+    <w:abstractNumId w:val="12"/>
   </w:num>
   <w:num w:numId="2" w16cid:durableId="1905555835">
+    <w:abstractNumId w:val="4"/>
+  </w:num>
+  <w:num w:numId="3" w16cid:durableId="639000178">
+    <w:abstractNumId w:val="10"/>
+  </w:num>
+  <w:num w:numId="4" w16cid:durableId="1967810139">
     <w:abstractNumId w:val="2"/>
   </w:num>
-  <w:num w:numId="3" w16cid:durableId="639000178">
-    <w:abstractNumId w:val="4"/>
-  </w:num>
-  <w:num w:numId="4" w16cid:durableId="1967810139">
-    <w:abstractNumId w:val="1"/>
-  </w:num>
   <w:num w:numId="5" w16cid:durableId="609750883">
-    <w:abstractNumId w:val="6"/>
+    <w:abstractNumId w:val="16"/>
   </w:num>
   <w:num w:numId="6" w16cid:durableId="2058894359">
     <w:abstractNumId w:val="0"/>
   </w:num>
   <w:num w:numId="7" w16cid:durableId="712660261">
-    <w:abstractNumId w:val="3"/>
+    <w:abstractNumId w:val="9"/>
   </w:num>
   <w:num w:numId="8" w16cid:durableId="16583857">
-    <w:abstractNumId w:val="2"/>
+    <w:abstractNumId w:val="4"/>
     <w:lvlOverride w:ilvl="0">
       <w:startOverride w:val="1"/>
     </w:lvlOverride>
   </w:num>
   <w:num w:numId="9" w16cid:durableId="936131272">
-    <w:abstractNumId w:val="2"/>
+    <w:abstractNumId w:val="4"/>
+    <w:lvlOverride w:ilvl="0">
+      <w:startOverride w:val="1"/>
+    </w:lvlOverride>
+  </w:num>
+  <w:num w:numId="10" w16cid:durableId="1803499908">
+    <w:abstractNumId w:val="15"/>
+  </w:num>
+  <w:num w:numId="11" w16cid:durableId="803742219">
+    <w:abstractNumId w:val="11"/>
+  </w:num>
+  <w:num w:numId="12" w16cid:durableId="93135654">
+    <w:abstractNumId w:val="8"/>
+  </w:num>
+  <w:num w:numId="13" w16cid:durableId="1459832194">
+    <w:abstractNumId w:val="5"/>
+  </w:num>
+  <w:num w:numId="14" w16cid:durableId="861670632">
+    <w:abstractNumId w:val="14"/>
+  </w:num>
+  <w:num w:numId="15" w16cid:durableId="924190203">
+    <w:abstractNumId w:val="13"/>
+  </w:num>
+  <w:num w:numId="16" w16cid:durableId="1103303847">
+    <w:abstractNumId w:val="3"/>
+  </w:num>
+  <w:num w:numId="17" w16cid:durableId="1198274741">
+    <w:abstractNumId w:val="1"/>
+  </w:num>
+  <w:num w:numId="18" w16cid:durableId="1440950616">
+    <w:abstractNumId w:val="6"/>
+  </w:num>
+  <w:num w:numId="19" w16cid:durableId="1960914263">
+    <w:abstractNumId w:val="7"/>
+  </w:num>
+  <w:num w:numId="20" w16cid:durableId="609825268">
+    <w:abstractNumId w:val="4"/>
+    <w:lvlOverride w:ilvl="0">
+      <w:startOverride w:val="1"/>
+    </w:lvlOverride>
+  </w:num>
+  <w:num w:numId="21" w16cid:durableId="1692804990">
+    <w:abstractNumId w:val="9"/>
+    <w:lvlOverride w:ilvl="0">
+      <w:startOverride w:val="1"/>
+    </w:lvlOverride>
+  </w:num>
+  <w:num w:numId="22" w16cid:durableId="1835804542">
+    <w:abstractNumId w:val="9"/>
+    <w:lvlOverride w:ilvl="0">
+      <w:startOverride w:val="1"/>
+    </w:lvlOverride>
+  </w:num>
+  <w:num w:numId="23" w16cid:durableId="70201890">
+    <w:abstractNumId w:val="9"/>
+    <w:lvlOverride w:ilvl="0">
+      <w:startOverride w:val="1"/>
+    </w:lvlOverride>
+  </w:num>
+  <w:num w:numId="24" w16cid:durableId="1701511683">
+    <w:abstractNumId w:val="9"/>
     <w:lvlOverride w:ilvl="0">
       <w:startOverride w:val="1"/>
     </w:lvlOverride>

</xml_diff>

<commit_message>
add backend trend sinh Vien
</commit_message>
<xml_diff>
--- a/demo/Mô tả chức năng.docx
+++ b/demo/Mô tả chức năng.docx
@@ -9507,11 +9507,1033 @@
     </w:p>
     <w:p>
       <w:pPr>
-        <w:rPr>
-          <w:lang w:val="vi-VN"/>
-        </w:rPr>
-      </w:pPr>
-    </w:p>
+        <w:ind w:left="720"/>
+        <w:rPr>
+          <w:b/>
+          <w:bCs/>
+        </w:rPr>
+      </w:pPr>
+      <w:r>
+        <w:rPr>
+          <w:b/>
+          <w:bCs/>
+        </w:rPr>
+        <w:t>MỤC TIÊU</w:t>
+      </w:r>
+    </w:p>
+    <w:p>
+      <w:r>
+        <w:t>Hiển thị tỷ lệ học lực sinh viên trên Dashboard.</w:t>
+      </w:r>
+    </w:p>
+    <w:p>
+      <w:r>
+        <w:t>Ví dụ:</w:t>
+      </w:r>
+      <w:r>
+        <w:rPr>
+          <w:lang w:val="vi-VN"/>
+        </w:rPr>
+        <w:t xml:space="preserve"> </w:t>
+      </w:r>
+      <w:r>
+        <w:t>Giỏi</w:t>
+      </w:r>
+      <w:r>
+        <w:rPr>
+          <w:lang w:val="vi-VN"/>
+        </w:rPr>
+        <w:t xml:space="preserve">, </w:t>
+      </w:r>
+      <w:r>
+        <w:t>Khá</w:t>
+      </w:r>
+      <w:r>
+        <w:rPr>
+          <w:lang w:val="vi-VN"/>
+        </w:rPr>
+        <w:t xml:space="preserve">, </w:t>
+      </w:r>
+      <w:r>
+        <w:t xml:space="preserve">Trung </w:t>
+      </w:r>
+      <w:r>
+        <w:t>Bình</w:t>
+      </w:r>
+      <w:r>
+        <w:rPr>
+          <w:lang w:val="vi-VN"/>
+        </w:rPr>
+        <w:t>,</w:t>
+      </w:r>
+      <w:r>
+        <w:rPr>
+          <w:lang w:val="vi-VN"/>
+        </w:rPr>
+        <w:t xml:space="preserve"> </w:t>
+      </w:r>
+      <w:r>
+        <w:t>Yếu</w:t>
+      </w:r>
+    </w:p>
+    <w:p>
+      <w:r>
+        <w:t>Tư duy Dashboard:</w:t>
+      </w:r>
+      <w:r>
+        <w:rPr>
+          <w:lang w:val="vi-VN"/>
+        </w:rPr>
+        <w:t xml:space="preserve"> </w:t>
+      </w:r>
+      <w:r>
+        <w:t xml:space="preserve">KPI </w:t>
+      </w:r>
+      <w:r>
+        <w:t>Card</w:t>
+      </w:r>
+      <w:r>
+        <w:rPr>
+          <w:lang w:val="vi-VN"/>
+        </w:rPr>
+        <w:t>-&gt;</w:t>
+      </w:r>
+      <w:r>
+        <w:t xml:space="preserve">Ranking </w:t>
+      </w:r>
+      <w:r>
+        <w:t>Widget</w:t>
+      </w:r>
+      <w:r>
+        <w:rPr>
+          <w:lang w:val="vi-VN"/>
+        </w:rPr>
+        <w:t>-&gt;</w:t>
+      </w:r>
+      <w:r>
+        <w:t>Chart Visualization</w:t>
+      </w:r>
+    </w:p>
+    <w:p>
+      <w:pPr>
+        <w:pBdr>
+          <w:bottom w:val="double" w:sz="6" w:space="1" w:color="auto"/>
+        </w:pBdr>
+      </w:pPr>
+      <w:r>
+        <w:lastRenderedPageBreak/>
+        <w:t>Chart giúp đọc dữ liệu nhanh hơn số liệu thuần.</w:t>
+      </w:r>
+    </w:p>
+    <w:p>
+      <w:pPr>
+        <w:pStyle w:val="Heading2"/>
+        <w:numPr>
+          <w:ilvl w:val="0"/>
+          <w:numId w:val="36"/>
+        </w:numPr>
+      </w:pPr>
+      <w:r>
+        <w:t>BACKEND</w:t>
+      </w:r>
+    </w:p>
+    <w:p>
+      <w:pPr>
+        <w:pStyle w:val="Heading3"/>
+        <w:numPr>
+          <w:ilvl w:val="0"/>
+          <w:numId w:val="37"/>
+        </w:numPr>
+      </w:pPr>
+      <w:r>
+        <w:t>Repository</w:t>
+      </w:r>
+    </w:p>
+    <w:p>
+      <w:r>
+        <w:t>Thêm các Aggregate Query:</w:t>
+      </w:r>
+    </w:p>
+    <w:p>
+      <w:pPr>
+        <w:rPr>
+          <w:b/>
+          <w:bCs/>
+        </w:rPr>
+      </w:pPr>
+      <w:r>
+        <w:rPr>
+          <w:b/>
+          <w:bCs/>
+        </w:rPr>
+        <w:t>Sinh viên Giỏi:</w:t>
+      </w:r>
+    </w:p>
+    <w:p>
+      <w:pPr>
+        <w:ind w:left="720"/>
+      </w:pPr>
+      <w:r>
+        <w:t>SELECT COUNT(s)</w:t>
+      </w:r>
+      <w:r>
+        <w:br/>
+        <w:t>WHERE s.dtb &gt;= 8</w:t>
+      </w:r>
+    </w:p>
+    <w:p>
+      <w:pPr>
+        <w:rPr>
+          <w:b/>
+          <w:bCs/>
+        </w:rPr>
+      </w:pPr>
+      <w:r>
+        <w:rPr>
+          <w:b/>
+          <w:bCs/>
+        </w:rPr>
+        <w:t>Sinh viên Khá:</w:t>
+      </w:r>
+    </w:p>
+    <w:p>
+      <w:pPr>
+        <w:ind w:left="720"/>
+      </w:pPr>
+      <w:r>
+        <w:t>SELECT COUNT(s)</w:t>
+      </w:r>
+      <w:r>
+        <w:br/>
+        <w:t>WHERE s.dtb &gt;= 6.5</w:t>
+      </w:r>
+      <w:r>
+        <w:br/>
+        <w:t>AND s.dtb &lt; 8</w:t>
+      </w:r>
+    </w:p>
+    <w:p>
+      <w:pPr>
+        <w:rPr>
+          <w:b/>
+          <w:bCs/>
+        </w:rPr>
+      </w:pPr>
+      <w:r>
+        <w:rPr>
+          <w:b/>
+          <w:bCs/>
+        </w:rPr>
+        <w:t>Sinh viên Trung Bình:</w:t>
+      </w:r>
+    </w:p>
+    <w:p>
+      <w:pPr>
+        <w:ind w:left="720"/>
+      </w:pPr>
+      <w:r>
+        <w:t>SELECT COUNT(s)</w:t>
+      </w:r>
+      <w:r>
+        <w:br/>
+        <w:t>WHERE s.dtb &gt;= 5</w:t>
+      </w:r>
+      <w:r>
+        <w:br/>
+        <w:t>AND s.dtb &lt; 6.5</w:t>
+      </w:r>
+    </w:p>
+    <w:p>
+      <w:pPr>
+        <w:rPr>
+          <w:b/>
+          <w:bCs/>
+        </w:rPr>
+      </w:pPr>
+      <w:r>
+        <w:rPr>
+          <w:b/>
+          <w:bCs/>
+        </w:rPr>
+        <w:t>Sinh viên Yếu:</w:t>
+      </w:r>
+    </w:p>
+    <w:p>
+      <w:pPr>
+        <w:ind w:left="720"/>
+      </w:pPr>
+      <w:r>
+        <w:t>SELECT COUNT(s)</w:t>
+      </w:r>
+      <w:r>
+        <w:br/>
+        <w:t>WHERE s.dtb &lt; 5</w:t>
+      </w:r>
+    </w:p>
+    <w:p>
+      <w:pPr>
+        <w:pBdr>
+          <w:bottom w:val="double" w:sz="6" w:space="1" w:color="auto"/>
+        </w:pBdr>
+      </w:pPr>
+      <w:r>
+        <w:t>Từ khóa:</w:t>
+      </w:r>
+      <w:r>
+        <w:rPr>
+          <w:lang w:val="vi-VN"/>
+        </w:rPr>
+        <w:t xml:space="preserve"> </w:t>
+      </w:r>
+      <w:r>
+        <w:t>COUNT()</w:t>
+      </w:r>
+      <w:r>
+        <w:rPr>
+          <w:lang w:val="vi-VN"/>
+        </w:rPr>
+        <w:t xml:space="preserve"> </w:t>
+      </w:r>
+      <w:r>
+        <w:t>WHERE</w:t>
+      </w:r>
+    </w:p>
+    <w:p>
+      <w:pPr>
+        <w:pStyle w:val="Heading3"/>
+      </w:pPr>
+      <w:r>
+        <w:t>DashboardResponse</w:t>
+      </w:r>
+    </w:p>
+    <w:p>
+      <w:pPr>
+        <w:pBdr>
+          <w:bottom w:val="double" w:sz="6" w:space="1" w:color="auto"/>
+        </w:pBdr>
+      </w:pPr>
+      <w:r>
+        <w:rPr>
+          <w:b/>
+          <w:bCs/>
+        </w:rPr>
+        <w:t>Thêm:</w:t>
+      </w:r>
+      <w:r>
+        <w:rPr>
+          <w:b/>
+          <w:bCs/>
+          <w:lang w:val="vi-VN"/>
+        </w:rPr>
+        <w:t xml:space="preserve"> </w:t>
+      </w:r>
+      <w:r>
+        <w:t>sinhVienKha;</w:t>
+      </w:r>
+      <w:r>
+        <w:t xml:space="preserve"> </w:t>
+      </w:r>
+      <w:r>
+        <w:t>sinhVienTrungBinh;</w:t>
+      </w:r>
+      <w:r>
+        <w:t xml:space="preserve"> </w:t>
+      </w:r>
+      <w:r>
+        <w:t>sinhVienYeu;</w:t>
+      </w:r>
+    </w:p>
+    <w:p>
+      <w:pPr>
+        <w:pStyle w:val="Heading3"/>
+      </w:pPr>
+      <w:r>
+        <w:t>Service</w:t>
+      </w:r>
+    </w:p>
+    <w:p>
+      <w:r>
+        <w:t>Flow:</w:t>
+      </w:r>
+    </w:p>
+    <w:p>
+      <w:r>
+        <w:t>Repository</w:t>
+      </w:r>
+      <w:r>
+        <w:rPr>
+          <w:lang w:val="vi-VN"/>
+        </w:rPr>
+        <w:t>-&gt;</w:t>
+      </w:r>
+      <w:r>
+        <w:t>COUNT()</w:t>
+      </w:r>
+      <w:r>
+        <w:rPr>
+          <w:lang w:val="vi-VN"/>
+        </w:rPr>
+        <w:t>-&gt;</w:t>
+      </w:r>
+      <w:r>
+        <w:t>Dashboa</w:t>
+      </w:r>
+      <w:r>
+        <w:t>rdResponse</w:t>
+      </w:r>
+      <w:r>
+        <w:rPr>
+          <w:lang w:val="vi-VN"/>
+        </w:rPr>
+        <w:t>-&gt;</w:t>
+      </w:r>
+      <w:r>
+        <w:t>Frontend</w:t>
+      </w:r>
+    </w:p>
+    <w:p>
+      <w:r>
+        <w:t>Ví dụ:</w:t>
+      </w:r>
+    </w:p>
+    <w:p>
+      <w:pPr>
+        <w:pBdr>
+          <w:bottom w:val="double" w:sz="6" w:space="1" w:color="auto"/>
+        </w:pBdr>
+        <w:ind w:left="720"/>
+      </w:pPr>
+      <w:r>
+        <w:t>response.setSinhVienKha(...)</w:t>
+      </w:r>
+      <w:r>
+        <w:br/>
+        <w:t>response.setSinhVienTrungBinh(...)</w:t>
+      </w:r>
+      <w:r>
+        <w:br/>
+        <w:t>response.setSinhVienYeu(...)</w:t>
+      </w:r>
+    </w:p>
+    <w:p>
+      <w:pPr>
+        <w:pStyle w:val="Heading2"/>
+      </w:pPr>
+      <w:r>
+        <w:t>FRONTEND</w:t>
+      </w:r>
+    </w:p>
+    <w:p>
+      <w:pPr>
+        <w:pStyle w:val="Heading3"/>
+        <w:numPr>
+          <w:ilvl w:val="0"/>
+          <w:numId w:val="38"/>
+        </w:numPr>
+      </w:pPr>
+      <w:r>
+        <w:t>HocLucChart.jsx</w:t>
+      </w:r>
+    </w:p>
+    <w:p>
+      <w:pPr>
+        <w:pBdr>
+          <w:bottom w:val="double" w:sz="6" w:space="1" w:color="auto"/>
+        </w:pBdr>
+      </w:pPr>
+      <w:r>
+        <w:rPr>
+          <w:b/>
+          <w:bCs/>
+        </w:rPr>
+        <w:t>Mục tiêu:</w:t>
+      </w:r>
+      <w:r>
+        <w:rPr>
+          <w:lang w:val="vi-VN"/>
+        </w:rPr>
+        <w:t xml:space="preserve"> </w:t>
+      </w:r>
+      <w:r>
+        <w:t>Tách riêng phần biểu đồ.</w:t>
+      </w:r>
+      <w:r>
+        <w:rPr>
+          <w:lang w:val="vi-VN"/>
+        </w:rPr>
+        <w:t xml:space="preserve"> </w:t>
+      </w:r>
+      <w:r>
+        <w:t>Không viết trực tiếp trong AdminPage.</w:t>
+      </w:r>
+    </w:p>
+    <w:p>
+      <w:pPr>
+        <w:pStyle w:val="Heading4"/>
+      </w:pPr>
+      <w:r>
+        <w:lastRenderedPageBreak/>
+        <w:t>Data Mapping</w:t>
+      </w:r>
+    </w:p>
+    <w:p>
+      <w:pPr>
+        <w:rPr>
+          <w:b/>
+          <w:bCs/>
+          <w:i/>
+          <w:iCs/>
+        </w:rPr>
+      </w:pPr>
+      <w:r>
+        <w:rPr>
+          <w:b/>
+          <w:bCs/>
+          <w:i/>
+          <w:iCs/>
+        </w:rPr>
+        <w:t>Từ DashboardResponse:</w:t>
+      </w:r>
+    </w:p>
+    <w:p>
+      <w:pPr>
+        <w:ind w:left="720"/>
+      </w:pPr>
+      <w:r>
+        <w:t>[</w:t>
+      </w:r>
+      <w:r>
+        <w:br/>
+        <w:t>{ name: "Giỏi", value: ... },</w:t>
+      </w:r>
+      <w:r>
+        <w:br/>
+        <w:t>{ name: "Khá", value: ... },</w:t>
+      </w:r>
+      <w:r>
+        <w:br/>
+        <w:t>{ name: "Trung Bình", value: ... },</w:t>
+      </w:r>
+      <w:r>
+        <w:br/>
+        <w:t>{ name: "Yếu", value: ... }</w:t>
+      </w:r>
+      <w:r>
+        <w:br/>
+        <w:t>]</w:t>
+      </w:r>
+    </w:p>
+    <w:p>
+      <w:r>
+        <w:t>Tư duy React:</w:t>
+      </w:r>
+    </w:p>
+    <w:p>
+      <w:pPr>
+        <w:pBdr>
+          <w:bottom w:val="double" w:sz="6" w:space="1" w:color="auto"/>
+        </w:pBdr>
+      </w:pPr>
+      <w:r>
+        <w:t xml:space="preserve">Backend trả dữ </w:t>
+      </w:r>
+      <w:r>
+        <w:t>liệu</w:t>
+      </w:r>
+      <w:r>
+        <w:rPr>
+          <w:lang w:val="vi-VN"/>
+        </w:rPr>
+        <w:t>-&gt;</w:t>
+      </w:r>
+      <w:r>
+        <w:t xml:space="preserve">Frontend map dữ </w:t>
+      </w:r>
+      <w:r>
+        <w:t>liệu</w:t>
+      </w:r>
+      <w:r>
+        <w:rPr>
+          <w:lang w:val="vi-VN"/>
+        </w:rPr>
+        <w:t>-&gt;</w:t>
+      </w:r>
+      <w:r>
+        <w:t>Chart render</w:t>
+      </w:r>
+    </w:p>
+    <w:p>
+      <w:pPr>
+        <w:pStyle w:val="Heading4"/>
+      </w:pPr>
+      <w:r>
+        <w:t>PieChart</w:t>
+      </w:r>
+    </w:p>
+    <w:p>
+      <w:pPr>
+        <w:pBdr>
+          <w:bottom w:val="double" w:sz="6" w:space="1" w:color="auto"/>
+        </w:pBdr>
+      </w:pPr>
+      <w:r>
+        <w:t>Component:</w:t>
+      </w:r>
+      <w:r>
+        <w:rPr>
+          <w:lang w:val="vi-VN"/>
+        </w:rPr>
+        <w:t xml:space="preserve"> </w:t>
+      </w:r>
+      <w:r>
+        <w:t>Là khung biểu đồ.</w:t>
+      </w:r>
+    </w:p>
+    <w:p>
+      <w:pPr>
+        <w:pStyle w:val="Heading4"/>
+      </w:pPr>
+      <w:r>
+        <w:t>Pie</w:t>
+      </w:r>
+    </w:p>
+    <w:p>
+      <w:r>
+        <w:t>Là phần hình tròn.</w:t>
+      </w:r>
+    </w:p>
+    <w:p>
+      <w:pPr>
+        <w:pBdr>
+          <w:bottom w:val="double" w:sz="6" w:space="1" w:color="auto"/>
+        </w:pBdr>
+      </w:pPr>
+      <w:r>
+        <w:rPr>
+          <w:b/>
+          <w:bCs/>
+        </w:rPr>
+        <w:t>Thuộc tính quan trọng</w:t>
+      </w:r>
+      <w:r>
+        <w:t>:</w:t>
+      </w:r>
+      <w:r>
+        <w:rPr>
+          <w:lang w:val="vi-VN"/>
+        </w:rPr>
+        <w:t xml:space="preserve"> </w:t>
+      </w:r>
+      <w:r>
+        <w:t>Data</w:t>
+      </w:r>
+      <w:r>
+        <w:rPr>
+          <w:lang w:val="vi-VN"/>
+        </w:rPr>
+        <w:t>,</w:t>
+      </w:r>
+      <w:r>
+        <w:t>dataKey</w:t>
+      </w:r>
+      <w:r>
+        <w:rPr>
+          <w:lang w:val="vi-VN"/>
+        </w:rPr>
+        <w:t>,</w:t>
+      </w:r>
+      <w:r>
+        <w:t>nameKey</w:t>
+      </w:r>
+    </w:p>
+    <w:p>
+      <w:pPr>
+        <w:pStyle w:val="Heading4"/>
+      </w:pPr>
+      <w:r>
+        <w:t>Tooltip</w:t>
+      </w:r>
+    </w:p>
+    <w:p>
+      <w:r>
+        <w:t>Chức năng:</w:t>
+      </w:r>
+      <w:r>
+        <w:rPr>
+          <w:lang w:val="vi-VN"/>
+        </w:rPr>
+        <w:t xml:space="preserve"> </w:t>
+      </w:r>
+      <w:r>
+        <w:t>Hover</w:t>
+      </w:r>
+      <w:r>
+        <w:rPr>
+          <w:lang w:val="vi-VN"/>
+        </w:rPr>
+        <w:t xml:space="preserve"> -&gt;</w:t>
+      </w:r>
+      <w:r>
+        <w:t>Hiện dữ liệu</w:t>
+      </w:r>
+    </w:p>
+    <w:p>
+      <w:r>
+        <w:t>Ví dụ:</w:t>
+      </w:r>
+      <w:r>
+        <w:rPr>
+          <w:lang w:val="vi-VN"/>
+        </w:rPr>
+        <w:t xml:space="preserve"> </w:t>
+      </w:r>
+      <w:r>
+        <w:t>Giỏi : 10</w:t>
+      </w:r>
+    </w:p>
+    <w:p>
+      <w:pPr>
+        <w:pBdr>
+          <w:bottom w:val="double" w:sz="6" w:space="1" w:color="auto"/>
+        </w:pBdr>
+      </w:pPr>
+      <w:r>
+        <w:t>Tư duy Production:Dashboard gần như luôn có Tooltip.</w:t>
+      </w:r>
+    </w:p>
+    <w:p>
+      <w:pPr>
+        <w:pStyle w:val="Heading4"/>
+      </w:pPr>
+      <w:r>
+        <w:t>Cell</w:t>
+      </w:r>
+    </w:p>
+    <w:p>
+      <w:r>
+        <w:t>Chức năng:Tô màu từng phần Pie Chart.</w:t>
+      </w:r>
+    </w:p>
+    <w:p>
+      <w:pPr>
+        <w:rPr>
+          <w:i/>
+          <w:iCs/>
+        </w:rPr>
+      </w:pPr>
+      <w:r>
+        <w:rPr>
+          <w:i/>
+          <w:iCs/>
+        </w:rPr>
+        <w:t>Ví dụ:</w:t>
+      </w:r>
+    </w:p>
+    <w:p>
+      <w:pPr>
+        <w:ind w:left="720"/>
+      </w:pPr>
+      <w:r>
+        <w:t>Giỏi -&gt; Xanh lá</w:t>
+      </w:r>
+      <w:r>
+        <w:br/>
+        <w:t>Khá -&gt; Xanh dương</w:t>
+      </w:r>
+      <w:r>
+        <w:br/>
+        <w:t>Trung Bình-&gt; Cam</w:t>
+      </w:r>
+      <w:r>
+        <w:br/>
+        <w:t>Yếu -&gt; Đỏ</w:t>
+      </w:r>
+    </w:p>
+    <w:p>
+      <w:pPr>
+        <w:pBdr>
+          <w:bottom w:val="double" w:sz="6" w:space="1" w:color="auto"/>
+        </w:pBdr>
+      </w:pPr>
+      <w:r>
+        <w:t>Flow:</w:t>
+      </w:r>
+      <w:r>
+        <w:rPr>
+          <w:lang w:val="vi-VN"/>
+        </w:rPr>
+        <w:t xml:space="preserve"> </w:t>
+      </w:r>
+      <w:r>
+        <w:t>Data</w:t>
+      </w:r>
+      <w:r>
+        <w:rPr>
+          <w:lang w:val="vi-VN"/>
+        </w:rPr>
+        <w:t>-&gt;</w:t>
+      </w:r>
+      <w:r>
+        <w:t>map()</w:t>
+      </w:r>
+      <w:r>
+        <w:rPr>
+          <w:lang w:val="vi-VN"/>
+        </w:rPr>
+        <w:t>-&gt;</w:t>
+      </w:r>
+      <w:r>
+        <w:t>Cell</w:t>
+      </w:r>
+      <w:r>
+        <w:rPr>
+          <w:lang w:val="vi-VN"/>
+        </w:rPr>
+        <w:t>-&gt;</w:t>
+      </w:r>
+      <w:r>
+        <w:t>fill(color)</w:t>
+      </w:r>
+    </w:p>
+    <w:p>
+      <w:pPr>
+        <w:pStyle w:val="Heading2"/>
+      </w:pPr>
+      <w:r>
+        <w:lastRenderedPageBreak/>
+        <w:t>NHỮNG ĐIỀU LUÔN NHỚ</w:t>
+      </w:r>
+    </w:p>
+    <w:p>
+      <w:pPr>
+        <w:pStyle w:val="Heading3"/>
+      </w:pPr>
+      <w:r>
+        <w:t>PieChart</w:t>
+      </w:r>
+      <w:r>
+        <w:rPr>
+          <w:lang w:val="vi-VN"/>
+        </w:rPr>
+        <w:t xml:space="preserve"> : </w:t>
+      </w:r>
+      <w:r>
+        <w:rPr>
+          <w:color w:val="EE0000"/>
+        </w:rPr>
+        <w:t>Khung biểu đồ</w:t>
+      </w:r>
+    </w:p>
+    <w:p>
+      <w:pPr>
+        <w:pStyle w:val="Heading3"/>
+      </w:pPr>
+      <w:r>
+        <w:t>Pie</w:t>
+      </w:r>
+      <w:r>
+        <w:rPr>
+          <w:lang w:val="vi-VN"/>
+        </w:rPr>
+        <w:t xml:space="preserve"> : </w:t>
+      </w:r>
+      <w:r>
+        <w:rPr>
+          <w:color w:val="EE0000"/>
+        </w:rPr>
+        <w:t>Biểu đồ tròn</w:t>
+      </w:r>
+    </w:p>
+    <w:p>
+      <w:pPr>
+        <w:pStyle w:val="Heading3"/>
+      </w:pPr>
+      <w:r>
+        <w:t>Tooltip</w:t>
+      </w:r>
+      <w:r>
+        <w:rPr>
+          <w:lang w:val="vi-VN"/>
+        </w:rPr>
+        <w:t xml:space="preserve"> : </w:t>
+      </w:r>
+      <w:r>
+        <w:rPr>
+          <w:color w:val="EE0000"/>
+        </w:rPr>
+        <w:t>Hover hiện dữ liệu</w:t>
+      </w:r>
+    </w:p>
+    <w:p>
+      <w:pPr>
+        <w:pStyle w:val="Heading3"/>
+      </w:pPr>
+      <w:r>
+        <w:t>Cell</w:t>
+      </w:r>
+      <w:r>
+        <w:rPr>
+          <w:lang w:val="vi-VN"/>
+        </w:rPr>
+        <w:t xml:space="preserve">: </w:t>
+      </w:r>
+      <w:r>
+        <w:rPr>
+          <w:color w:val="EE0000"/>
+        </w:rPr>
+        <w:t>Tô màu từng phần</w:t>
+      </w:r>
+    </w:p>
+    <w:p>
+      <w:pPr>
+        <w:pStyle w:val="Heading3"/>
+      </w:pPr>
+      <w:r>
+        <w:t>Chart chỉ hiển thị.</w:t>
+      </w:r>
+      <w:r>
+        <w:rPr>
+          <w:lang w:val="vi-VN"/>
+        </w:rPr>
+        <w:t xml:space="preserve"> </w:t>
+      </w:r>
+      <w:r>
+        <w:t>Backend mới là nơi tính toán.</w:t>
+      </w:r>
+    </w:p>
+    <w:p>
+      <w:pPr>
+        <w:pStyle w:val="Heading3"/>
+      </w:pPr>
+      <w:r>
+        <w:t>Dashboard nên:</w:t>
+      </w:r>
+    </w:p>
+    <w:p>
+      <w:r>
+        <w:t>KPI</w:t>
+      </w:r>
+      <w:r>
+        <w:rPr>
+          <w:lang w:val="vi-VN"/>
+        </w:rPr>
+        <w:t xml:space="preserve"> + </w:t>
+      </w:r>
+      <w:r>
+        <w:t>Ranking</w:t>
+      </w:r>
+      <w:r>
+        <w:rPr>
+          <w:lang w:val="vi-VN"/>
+        </w:rPr>
+        <w:t xml:space="preserve"> + </w:t>
+      </w:r>
+      <w:r>
+        <w:t>Chart</w:t>
+      </w:r>
+    </w:p>
+    <w:p>
+      <w:pPr>
+        <w:pBdr>
+          <w:bottom w:val="double" w:sz="6" w:space="1" w:color="auto"/>
+        </w:pBdr>
+      </w:pPr>
+      <w:r>
+        <w:t>Không chỉ có Card.</w:t>
+      </w:r>
+    </w:p>
+    <w:p>
+      <w:pPr>
+        <w:pStyle w:val="Heading3"/>
+      </w:pPr>
+      <w:r>
+        <w:t>SƠ ĐỒ NHỚ NHANH</w:t>
+      </w:r>
+    </w:p>
+    <w:p>
+      <w:r>
+        <w:t>Database</w:t>
+      </w:r>
+      <w:r>
+        <w:rPr>
+          <w:lang w:val="vi-VN"/>
+        </w:rPr>
+        <w:t>-&gt;</w:t>
+      </w:r>
+      <w:r>
+        <w:t>COUNT()</w:t>
+      </w:r>
+      <w:r>
+        <w:rPr>
+          <w:lang w:val="vi-VN"/>
+        </w:rPr>
+        <w:t>-&gt;</w:t>
+      </w:r>
+      <w:r>
+        <w:t>Dashboa</w:t>
+      </w:r>
+      <w:r>
+        <w:t>rdResponse</w:t>
+      </w:r>
+      <w:r>
+        <w:rPr>
+          <w:lang w:val="vi-VN"/>
+        </w:rPr>
+        <w:t>-&gt;</w:t>
+      </w:r>
+      <w:r>
+        <w:t>H</w:t>
+      </w:r>
+      <w:r>
+        <w:t>ocLucChart</w:t>
+      </w:r>
+      <w:r>
+        <w:rPr>
+          <w:lang w:val="vi-VN"/>
+        </w:rPr>
+        <w:t>-&gt;</w:t>
+      </w:r>
+      <w:r>
+        <w:t>PieChart</w:t>
+      </w:r>
+      <w:r>
+        <w:rPr>
+          <w:lang w:val="vi-VN"/>
+        </w:rPr>
+        <w:t>-&gt;</w:t>
+      </w:r>
+      <w:r>
+        <w:t>Pie</w:t>
+      </w:r>
+      <w:r>
+        <w:rPr>
+          <w:lang w:val="vi-VN"/>
+        </w:rPr>
+        <w:t>-&gt;</w:t>
+      </w:r>
+      <w:r>
+        <w:t>Cell</w:t>
+      </w:r>
+      <w:r>
+        <w:rPr>
+          <w:lang w:val="vi-VN"/>
+        </w:rPr>
+        <w:t>-&gt;</w:t>
+      </w:r>
+      <w:r>
+        <w:t>Tooltip</w:t>
+      </w:r>
+      <w:r>
+        <w:rPr>
+          <w:lang w:val="vi-VN"/>
+        </w:rPr>
+        <w:t>-&gt;</w:t>
+      </w:r>
+      <w:r>
+        <w:t>Dashboard Analytics</w:t>
+      </w:r>
+    </w:p>
+    <w:p/>
     <w:p>
       <w:pPr>
         <w:ind w:left="720"/>
@@ -9530,6 +10552,458 @@
 <file path=word/numbering.xml><?xml version="1.0" encoding="utf-8"?>
 <w:numbering xmlns:wpc="http://schemas.microsoft.com/office/word/2010/wordprocessingCanvas" xmlns:cx="http://schemas.microsoft.com/office/drawing/2014/chartex" xmlns:cx1="http://schemas.microsoft.com/office/drawing/2015/9/8/chartex" xmlns:cx2="http://schemas.microsoft.com/office/drawing/2015/10/21/chartex" xmlns:cx3="http://schemas.microsoft.com/office/drawing/2016/5/9/chartex" xmlns:cx4="http://schemas.microsoft.com/office/drawing/2016/5/10/chartex" xmlns:cx5="http://schemas.microsoft.com/office/drawing/2016/5/11/chartex" xmlns:cx6="http://schemas.microsoft.com/office/drawing/2016/5/12/chartex" xmlns:cx7="http://schemas.microsoft.com/office/drawing/2016/5/13/chartex" xmlns:cx8="http://schemas.microsoft.com/office/drawing/2016/5/14/chartex" xmlns:mc="http://schemas.openxmlformats.org/markup-compatibility/2006" xmlns:aink="http://schemas.microsoft.com/office/drawing/2016/ink" xmlns:am3d="http://schemas.microsoft.com/office/drawing/2017/model3d" xmlns:o="urn:schemas-microsoft-com:office:office" xmlns:oel="http://schemas.microsoft.com/office/2019/extlst" xmlns:r="http://schemas.openxmlformats.org/officeDocument/2006/relationships" xmlns:m="http://schemas.openxmlformats.org/officeDocument/2006/math" xmlns:v="urn:schemas-microsoft-com:vml" xmlns:wp14="http://schemas.microsoft.com/office/word/2010/wordprocessingDrawing" xmlns:wp="http://schemas.openxmlformats.org/drawingml/2006/wordprocessingDrawing" xmlns:w10="urn:schemas-microsoft-com:office:word" xmlns:w="http://schemas.openxmlformats.org/wordprocessingml/2006/main" xmlns:w14="http://schemas.microsoft.com/office/word/2010/wordml" xmlns:w15="http://schemas.microsoft.com/office/word/2012/wordml" xmlns:w16cex="http://schemas.microsoft.com/office/word/2018/wordml/cex" xmlns:w16cid="http://schemas.microsoft.com/office/word/2016/wordml/cid" xmlns:w16="http://schemas.microsoft.com/office/word/2018/wordml" xmlns:w16du="http://schemas.microsoft.com/office/word/2023/wordml/word16du" xmlns:w16sdtdh="http://schemas.microsoft.com/office/word/2020/wordml/sdtdatahash" xmlns:w16sdtfl="http://schemas.microsoft.com/office/word/2024/wordml/sdtformatlock" xmlns:w16se="http://schemas.microsoft.com/office/word/2015/wordml/symex" xmlns:wpg="http://schemas.microsoft.com/office/word/2010/wordprocessingGroup" xmlns:wpi="http://schemas.microsoft.com/office/word/2010/wordprocessingInk" xmlns:wne="http://schemas.microsoft.com/office/word/2006/wordml" xmlns:wps="http://schemas.microsoft.com/office/word/2010/wordprocessingShape" mc:Ignorable="w14 w15 w16se w16cid w16 w16cex w16sdtdh w16sdtfl w16du wp14">
   <w:abstractNum w:abstractNumId="0" w15:restartNumberingAfterBreak="0">
+    <w:nsid w:val="00D2175A"/>
+    <w:multiLevelType w:val="multilevel"/>
+    <w:tmpl w:val="020E38FC"/>
+    <w:lvl w:ilvl="0">
+      <w:start w:val="2"/>
+      <w:numFmt w:val="decimal"/>
+      <w:lvlText w:val="%1."/>
+      <w:lvlJc w:val="left"/>
+      <w:pPr>
+        <w:tabs>
+          <w:tab w:val="num" w:pos="720"/>
+        </w:tabs>
+        <w:ind w:left="720" w:hanging="360"/>
+      </w:pPr>
+    </w:lvl>
+    <w:lvl w:ilvl="1" w:tentative="1">
+      <w:start w:val="1"/>
+      <w:numFmt w:val="decimal"/>
+      <w:lvlText w:val="%2."/>
+      <w:lvlJc w:val="left"/>
+      <w:pPr>
+        <w:tabs>
+          <w:tab w:val="num" w:pos="1440"/>
+        </w:tabs>
+        <w:ind w:left="1440" w:hanging="360"/>
+      </w:pPr>
+    </w:lvl>
+    <w:lvl w:ilvl="2" w:tentative="1">
+      <w:start w:val="1"/>
+      <w:numFmt w:val="decimal"/>
+      <w:lvlText w:val="%3."/>
+      <w:lvlJc w:val="left"/>
+      <w:pPr>
+        <w:tabs>
+          <w:tab w:val="num" w:pos="2160"/>
+        </w:tabs>
+        <w:ind w:left="2160" w:hanging="360"/>
+      </w:pPr>
+    </w:lvl>
+    <w:lvl w:ilvl="3" w:tentative="1">
+      <w:start w:val="1"/>
+      <w:numFmt w:val="decimal"/>
+      <w:lvlText w:val="%4."/>
+      <w:lvlJc w:val="left"/>
+      <w:pPr>
+        <w:tabs>
+          <w:tab w:val="num" w:pos="2880"/>
+        </w:tabs>
+        <w:ind w:left="2880" w:hanging="360"/>
+      </w:pPr>
+    </w:lvl>
+    <w:lvl w:ilvl="4" w:tentative="1">
+      <w:start w:val="1"/>
+      <w:numFmt w:val="decimal"/>
+      <w:lvlText w:val="%5."/>
+      <w:lvlJc w:val="left"/>
+      <w:pPr>
+        <w:tabs>
+          <w:tab w:val="num" w:pos="3600"/>
+        </w:tabs>
+        <w:ind w:left="3600" w:hanging="360"/>
+      </w:pPr>
+    </w:lvl>
+    <w:lvl w:ilvl="5" w:tentative="1">
+      <w:start w:val="1"/>
+      <w:numFmt w:val="decimal"/>
+      <w:lvlText w:val="%6."/>
+      <w:lvlJc w:val="left"/>
+      <w:pPr>
+        <w:tabs>
+          <w:tab w:val="num" w:pos="4320"/>
+        </w:tabs>
+        <w:ind w:left="4320" w:hanging="360"/>
+      </w:pPr>
+    </w:lvl>
+    <w:lvl w:ilvl="6" w:tentative="1">
+      <w:start w:val="1"/>
+      <w:numFmt w:val="decimal"/>
+      <w:lvlText w:val="%7."/>
+      <w:lvlJc w:val="left"/>
+      <w:pPr>
+        <w:tabs>
+          <w:tab w:val="num" w:pos="5040"/>
+        </w:tabs>
+        <w:ind w:left="5040" w:hanging="360"/>
+      </w:pPr>
+    </w:lvl>
+    <w:lvl w:ilvl="7" w:tentative="1">
+      <w:start w:val="1"/>
+      <w:numFmt w:val="decimal"/>
+      <w:lvlText w:val="%8."/>
+      <w:lvlJc w:val="left"/>
+      <w:pPr>
+        <w:tabs>
+          <w:tab w:val="num" w:pos="5760"/>
+        </w:tabs>
+        <w:ind w:left="5760" w:hanging="360"/>
+      </w:pPr>
+    </w:lvl>
+    <w:lvl w:ilvl="8" w:tentative="1">
+      <w:start w:val="1"/>
+      <w:numFmt w:val="decimal"/>
+      <w:lvlText w:val="%9."/>
+      <w:lvlJc w:val="left"/>
+      <w:pPr>
+        <w:tabs>
+          <w:tab w:val="num" w:pos="6480"/>
+        </w:tabs>
+        <w:ind w:left="6480" w:hanging="360"/>
+      </w:pPr>
+    </w:lvl>
+  </w:abstractNum>
+  <w:abstractNum w:abstractNumId="1" w15:restartNumberingAfterBreak="0">
+    <w:nsid w:val="00FE4F0B"/>
+    <w:multiLevelType w:val="multilevel"/>
+    <w:tmpl w:val="48EC0D0A"/>
+    <w:lvl w:ilvl="0">
+      <w:start w:val="3"/>
+      <w:numFmt w:val="decimal"/>
+      <w:lvlText w:val="%1."/>
+      <w:lvlJc w:val="left"/>
+      <w:pPr>
+        <w:tabs>
+          <w:tab w:val="num" w:pos="720"/>
+        </w:tabs>
+        <w:ind w:left="720" w:hanging="360"/>
+      </w:pPr>
+    </w:lvl>
+    <w:lvl w:ilvl="1" w:tentative="1">
+      <w:start w:val="1"/>
+      <w:numFmt w:val="decimal"/>
+      <w:lvlText w:val="%2."/>
+      <w:lvlJc w:val="left"/>
+      <w:pPr>
+        <w:tabs>
+          <w:tab w:val="num" w:pos="1440"/>
+        </w:tabs>
+        <w:ind w:left="1440" w:hanging="360"/>
+      </w:pPr>
+    </w:lvl>
+    <w:lvl w:ilvl="2" w:tentative="1">
+      <w:start w:val="1"/>
+      <w:numFmt w:val="decimal"/>
+      <w:lvlText w:val="%3."/>
+      <w:lvlJc w:val="left"/>
+      <w:pPr>
+        <w:tabs>
+          <w:tab w:val="num" w:pos="2160"/>
+        </w:tabs>
+        <w:ind w:left="2160" w:hanging="360"/>
+      </w:pPr>
+    </w:lvl>
+    <w:lvl w:ilvl="3" w:tentative="1">
+      <w:start w:val="1"/>
+      <w:numFmt w:val="decimal"/>
+      <w:lvlText w:val="%4."/>
+      <w:lvlJc w:val="left"/>
+      <w:pPr>
+        <w:tabs>
+          <w:tab w:val="num" w:pos="2880"/>
+        </w:tabs>
+        <w:ind w:left="2880" w:hanging="360"/>
+      </w:pPr>
+    </w:lvl>
+    <w:lvl w:ilvl="4" w:tentative="1">
+      <w:start w:val="1"/>
+      <w:numFmt w:val="decimal"/>
+      <w:lvlText w:val="%5."/>
+      <w:lvlJc w:val="left"/>
+      <w:pPr>
+        <w:tabs>
+          <w:tab w:val="num" w:pos="3600"/>
+        </w:tabs>
+        <w:ind w:left="3600" w:hanging="360"/>
+      </w:pPr>
+    </w:lvl>
+    <w:lvl w:ilvl="5" w:tentative="1">
+      <w:start w:val="1"/>
+      <w:numFmt w:val="decimal"/>
+      <w:lvlText w:val="%6."/>
+      <w:lvlJc w:val="left"/>
+      <w:pPr>
+        <w:tabs>
+          <w:tab w:val="num" w:pos="4320"/>
+        </w:tabs>
+        <w:ind w:left="4320" w:hanging="360"/>
+      </w:pPr>
+    </w:lvl>
+    <w:lvl w:ilvl="6" w:tentative="1">
+      <w:start w:val="1"/>
+      <w:numFmt w:val="decimal"/>
+      <w:lvlText w:val="%7."/>
+      <w:lvlJc w:val="left"/>
+      <w:pPr>
+        <w:tabs>
+          <w:tab w:val="num" w:pos="5040"/>
+        </w:tabs>
+        <w:ind w:left="5040" w:hanging="360"/>
+      </w:pPr>
+    </w:lvl>
+    <w:lvl w:ilvl="7" w:tentative="1">
+      <w:start w:val="1"/>
+      <w:numFmt w:val="decimal"/>
+      <w:lvlText w:val="%8."/>
+      <w:lvlJc w:val="left"/>
+      <w:pPr>
+        <w:tabs>
+          <w:tab w:val="num" w:pos="5760"/>
+        </w:tabs>
+        <w:ind w:left="5760" w:hanging="360"/>
+      </w:pPr>
+    </w:lvl>
+    <w:lvl w:ilvl="8" w:tentative="1">
+      <w:start w:val="1"/>
+      <w:numFmt w:val="decimal"/>
+      <w:lvlText w:val="%9."/>
+      <w:lvlJc w:val="left"/>
+      <w:pPr>
+        <w:tabs>
+          <w:tab w:val="num" w:pos="6480"/>
+        </w:tabs>
+        <w:ind w:left="6480" w:hanging="360"/>
+      </w:pPr>
+    </w:lvl>
+  </w:abstractNum>
+  <w:abstractNum w:abstractNumId="2" w15:restartNumberingAfterBreak="0">
+    <w:nsid w:val="042E0192"/>
+    <w:multiLevelType w:val="multilevel"/>
+    <w:tmpl w:val="C95080F6"/>
+    <w:lvl w:ilvl="0">
+      <w:start w:val="4"/>
+      <w:numFmt w:val="decimal"/>
+      <w:lvlText w:val="%1."/>
+      <w:lvlJc w:val="left"/>
+      <w:pPr>
+        <w:tabs>
+          <w:tab w:val="num" w:pos="720"/>
+        </w:tabs>
+        <w:ind w:left="720" w:hanging="360"/>
+      </w:pPr>
+    </w:lvl>
+    <w:lvl w:ilvl="1" w:tentative="1">
+      <w:start w:val="1"/>
+      <w:numFmt w:val="decimal"/>
+      <w:lvlText w:val="%2."/>
+      <w:lvlJc w:val="left"/>
+      <w:pPr>
+        <w:tabs>
+          <w:tab w:val="num" w:pos="1440"/>
+        </w:tabs>
+        <w:ind w:left="1440" w:hanging="360"/>
+      </w:pPr>
+    </w:lvl>
+    <w:lvl w:ilvl="2" w:tentative="1">
+      <w:start w:val="1"/>
+      <w:numFmt w:val="decimal"/>
+      <w:lvlText w:val="%3."/>
+      <w:lvlJc w:val="left"/>
+      <w:pPr>
+        <w:tabs>
+          <w:tab w:val="num" w:pos="2160"/>
+        </w:tabs>
+        <w:ind w:left="2160" w:hanging="360"/>
+      </w:pPr>
+    </w:lvl>
+    <w:lvl w:ilvl="3" w:tentative="1">
+      <w:start w:val="1"/>
+      <w:numFmt w:val="decimal"/>
+      <w:lvlText w:val="%4."/>
+      <w:lvlJc w:val="left"/>
+      <w:pPr>
+        <w:tabs>
+          <w:tab w:val="num" w:pos="2880"/>
+        </w:tabs>
+        <w:ind w:left="2880" w:hanging="360"/>
+      </w:pPr>
+    </w:lvl>
+    <w:lvl w:ilvl="4" w:tentative="1">
+      <w:start w:val="1"/>
+      <w:numFmt w:val="decimal"/>
+      <w:lvlText w:val="%5."/>
+      <w:lvlJc w:val="left"/>
+      <w:pPr>
+        <w:tabs>
+          <w:tab w:val="num" w:pos="3600"/>
+        </w:tabs>
+        <w:ind w:left="3600" w:hanging="360"/>
+      </w:pPr>
+    </w:lvl>
+    <w:lvl w:ilvl="5" w:tentative="1">
+      <w:start w:val="1"/>
+      <w:numFmt w:val="decimal"/>
+      <w:lvlText w:val="%6."/>
+      <w:lvlJc w:val="left"/>
+      <w:pPr>
+        <w:tabs>
+          <w:tab w:val="num" w:pos="4320"/>
+        </w:tabs>
+        <w:ind w:left="4320" w:hanging="360"/>
+      </w:pPr>
+    </w:lvl>
+    <w:lvl w:ilvl="6" w:tentative="1">
+      <w:start w:val="1"/>
+      <w:numFmt w:val="decimal"/>
+      <w:lvlText w:val="%7."/>
+      <w:lvlJc w:val="left"/>
+      <w:pPr>
+        <w:tabs>
+          <w:tab w:val="num" w:pos="5040"/>
+        </w:tabs>
+        <w:ind w:left="5040" w:hanging="360"/>
+      </w:pPr>
+    </w:lvl>
+    <w:lvl w:ilvl="7" w:tentative="1">
+      <w:start w:val="1"/>
+      <w:numFmt w:val="decimal"/>
+      <w:lvlText w:val="%8."/>
+      <w:lvlJc w:val="left"/>
+      <w:pPr>
+        <w:tabs>
+          <w:tab w:val="num" w:pos="5760"/>
+        </w:tabs>
+        <w:ind w:left="5760" w:hanging="360"/>
+      </w:pPr>
+    </w:lvl>
+    <w:lvl w:ilvl="8" w:tentative="1">
+      <w:start w:val="1"/>
+      <w:numFmt w:val="decimal"/>
+      <w:lvlText w:val="%9."/>
+      <w:lvlJc w:val="left"/>
+      <w:pPr>
+        <w:tabs>
+          <w:tab w:val="num" w:pos="6480"/>
+        </w:tabs>
+        <w:ind w:left="6480" w:hanging="360"/>
+      </w:pPr>
+    </w:lvl>
+  </w:abstractNum>
+  <w:abstractNum w:abstractNumId="3" w15:restartNumberingAfterBreak="0">
+    <w:nsid w:val="08AC653F"/>
+    <w:multiLevelType w:val="multilevel"/>
+    <w:tmpl w:val="EF042084"/>
+    <w:lvl w:ilvl="0">
+      <w:start w:val="4"/>
+      <w:numFmt w:val="decimal"/>
+      <w:lvlText w:val="%1."/>
+      <w:lvlJc w:val="left"/>
+      <w:pPr>
+        <w:tabs>
+          <w:tab w:val="num" w:pos="720"/>
+        </w:tabs>
+        <w:ind w:left="720" w:hanging="360"/>
+      </w:pPr>
+    </w:lvl>
+    <w:lvl w:ilvl="1" w:tentative="1">
+      <w:start w:val="1"/>
+      <w:numFmt w:val="decimal"/>
+      <w:lvlText w:val="%2."/>
+      <w:lvlJc w:val="left"/>
+      <w:pPr>
+        <w:tabs>
+          <w:tab w:val="num" w:pos="1440"/>
+        </w:tabs>
+        <w:ind w:left="1440" w:hanging="360"/>
+      </w:pPr>
+    </w:lvl>
+    <w:lvl w:ilvl="2" w:tentative="1">
+      <w:start w:val="1"/>
+      <w:numFmt w:val="decimal"/>
+      <w:lvlText w:val="%3."/>
+      <w:lvlJc w:val="left"/>
+      <w:pPr>
+        <w:tabs>
+          <w:tab w:val="num" w:pos="2160"/>
+        </w:tabs>
+        <w:ind w:left="2160" w:hanging="360"/>
+      </w:pPr>
+    </w:lvl>
+    <w:lvl w:ilvl="3" w:tentative="1">
+      <w:start w:val="1"/>
+      <w:numFmt w:val="decimal"/>
+      <w:lvlText w:val="%4."/>
+      <w:lvlJc w:val="left"/>
+      <w:pPr>
+        <w:tabs>
+          <w:tab w:val="num" w:pos="2880"/>
+        </w:tabs>
+        <w:ind w:left="2880" w:hanging="360"/>
+      </w:pPr>
+    </w:lvl>
+    <w:lvl w:ilvl="4" w:tentative="1">
+      <w:start w:val="1"/>
+      <w:numFmt w:val="decimal"/>
+      <w:lvlText w:val="%5."/>
+      <w:lvlJc w:val="left"/>
+      <w:pPr>
+        <w:tabs>
+          <w:tab w:val="num" w:pos="3600"/>
+        </w:tabs>
+        <w:ind w:left="3600" w:hanging="360"/>
+      </w:pPr>
+    </w:lvl>
+    <w:lvl w:ilvl="5" w:tentative="1">
+      <w:start w:val="1"/>
+      <w:numFmt w:val="decimal"/>
+      <w:lvlText w:val="%6."/>
+      <w:lvlJc w:val="left"/>
+      <w:pPr>
+        <w:tabs>
+          <w:tab w:val="num" w:pos="4320"/>
+        </w:tabs>
+        <w:ind w:left="4320" w:hanging="360"/>
+      </w:pPr>
+    </w:lvl>
+    <w:lvl w:ilvl="6" w:tentative="1">
+      <w:start w:val="1"/>
+      <w:numFmt w:val="decimal"/>
+      <w:lvlText w:val="%7."/>
+      <w:lvlJc w:val="left"/>
+      <w:pPr>
+        <w:tabs>
+          <w:tab w:val="num" w:pos="5040"/>
+        </w:tabs>
+        <w:ind w:left="5040" w:hanging="360"/>
+      </w:pPr>
+    </w:lvl>
+    <w:lvl w:ilvl="7" w:tentative="1">
+      <w:start w:val="1"/>
+      <w:numFmt w:val="decimal"/>
+      <w:lvlText w:val="%8."/>
+      <w:lvlJc w:val="left"/>
+      <w:pPr>
+        <w:tabs>
+          <w:tab w:val="num" w:pos="5760"/>
+        </w:tabs>
+        <w:ind w:left="5760" w:hanging="360"/>
+      </w:pPr>
+    </w:lvl>
+    <w:lvl w:ilvl="8" w:tentative="1">
+      <w:start w:val="1"/>
+      <w:numFmt w:val="decimal"/>
+      <w:lvlText w:val="%9."/>
+      <w:lvlJc w:val="left"/>
+      <w:pPr>
+        <w:tabs>
+          <w:tab w:val="num" w:pos="6480"/>
+        </w:tabs>
+        <w:ind w:left="6480" w:hanging="360"/>
+      </w:pPr>
+    </w:lvl>
+  </w:abstractNum>
+  <w:abstractNum w:abstractNumId="4" w15:restartNumberingAfterBreak="0">
     <w:nsid w:val="095C511F"/>
     <w:multiLevelType w:val="multilevel"/>
     <w:tmpl w:val="990C0916"/>
@@ -9678,7 +11152,7 @@
       </w:rPr>
     </w:lvl>
   </w:abstractNum>
-  <w:abstractNum w:abstractNumId="1" w15:restartNumberingAfterBreak="0">
+  <w:abstractNum w:abstractNumId="5" w15:restartNumberingAfterBreak="0">
     <w:nsid w:val="0A545C55"/>
     <w:multiLevelType w:val="multilevel"/>
     <w:tmpl w:val="FFF03256"/>
@@ -9791,7 +11265,120 @@
       </w:pPr>
     </w:lvl>
   </w:abstractNum>
-  <w:abstractNum w:abstractNumId="2" w15:restartNumberingAfterBreak="0">
+  <w:abstractNum w:abstractNumId="6" w15:restartNumberingAfterBreak="0">
+    <w:nsid w:val="0E894CF3"/>
+    <w:multiLevelType w:val="multilevel"/>
+    <w:tmpl w:val="A2F2A21A"/>
+    <w:lvl w:ilvl="0">
+      <w:start w:val="3"/>
+      <w:numFmt w:val="decimal"/>
+      <w:lvlText w:val="%1."/>
+      <w:lvlJc w:val="left"/>
+      <w:pPr>
+        <w:tabs>
+          <w:tab w:val="num" w:pos="720"/>
+        </w:tabs>
+        <w:ind w:left="720" w:hanging="360"/>
+      </w:pPr>
+    </w:lvl>
+    <w:lvl w:ilvl="1" w:tentative="1">
+      <w:start w:val="1"/>
+      <w:numFmt w:val="decimal"/>
+      <w:lvlText w:val="%2."/>
+      <w:lvlJc w:val="left"/>
+      <w:pPr>
+        <w:tabs>
+          <w:tab w:val="num" w:pos="1440"/>
+        </w:tabs>
+        <w:ind w:left="1440" w:hanging="360"/>
+      </w:pPr>
+    </w:lvl>
+    <w:lvl w:ilvl="2" w:tentative="1">
+      <w:start w:val="1"/>
+      <w:numFmt w:val="decimal"/>
+      <w:lvlText w:val="%3."/>
+      <w:lvlJc w:val="left"/>
+      <w:pPr>
+        <w:tabs>
+          <w:tab w:val="num" w:pos="2160"/>
+        </w:tabs>
+        <w:ind w:left="2160" w:hanging="360"/>
+      </w:pPr>
+    </w:lvl>
+    <w:lvl w:ilvl="3" w:tentative="1">
+      <w:start w:val="1"/>
+      <w:numFmt w:val="decimal"/>
+      <w:lvlText w:val="%4."/>
+      <w:lvlJc w:val="left"/>
+      <w:pPr>
+        <w:tabs>
+          <w:tab w:val="num" w:pos="2880"/>
+        </w:tabs>
+        <w:ind w:left="2880" w:hanging="360"/>
+      </w:pPr>
+    </w:lvl>
+    <w:lvl w:ilvl="4" w:tentative="1">
+      <w:start w:val="1"/>
+      <w:numFmt w:val="decimal"/>
+      <w:lvlText w:val="%5."/>
+      <w:lvlJc w:val="left"/>
+      <w:pPr>
+        <w:tabs>
+          <w:tab w:val="num" w:pos="3600"/>
+        </w:tabs>
+        <w:ind w:left="3600" w:hanging="360"/>
+      </w:pPr>
+    </w:lvl>
+    <w:lvl w:ilvl="5" w:tentative="1">
+      <w:start w:val="1"/>
+      <w:numFmt w:val="decimal"/>
+      <w:lvlText w:val="%6."/>
+      <w:lvlJc w:val="left"/>
+      <w:pPr>
+        <w:tabs>
+          <w:tab w:val="num" w:pos="4320"/>
+        </w:tabs>
+        <w:ind w:left="4320" w:hanging="360"/>
+      </w:pPr>
+    </w:lvl>
+    <w:lvl w:ilvl="6" w:tentative="1">
+      <w:start w:val="1"/>
+      <w:numFmt w:val="decimal"/>
+      <w:lvlText w:val="%7."/>
+      <w:lvlJc w:val="left"/>
+      <w:pPr>
+        <w:tabs>
+          <w:tab w:val="num" w:pos="5040"/>
+        </w:tabs>
+        <w:ind w:left="5040" w:hanging="360"/>
+      </w:pPr>
+    </w:lvl>
+    <w:lvl w:ilvl="7" w:tentative="1">
+      <w:start w:val="1"/>
+      <w:numFmt w:val="decimal"/>
+      <w:lvlText w:val="%8."/>
+      <w:lvlJc w:val="left"/>
+      <w:pPr>
+        <w:tabs>
+          <w:tab w:val="num" w:pos="5760"/>
+        </w:tabs>
+        <w:ind w:left="5760" w:hanging="360"/>
+      </w:pPr>
+    </w:lvl>
+    <w:lvl w:ilvl="8" w:tentative="1">
+      <w:start w:val="1"/>
+      <w:numFmt w:val="decimal"/>
+      <w:lvlText w:val="%9."/>
+      <w:lvlJc w:val="left"/>
+      <w:pPr>
+        <w:tabs>
+          <w:tab w:val="num" w:pos="6480"/>
+        </w:tabs>
+        <w:ind w:left="6480" w:hanging="360"/>
+      </w:pPr>
+    </w:lvl>
+  </w:abstractNum>
+  <w:abstractNum w:abstractNumId="7" w15:restartNumberingAfterBreak="0">
     <w:nsid w:val="11436643"/>
     <w:multiLevelType w:val="multilevel"/>
     <w:tmpl w:val="DCB6B0D8"/>
@@ -9940,7 +11527,207 @@
       </w:rPr>
     </w:lvl>
   </w:abstractNum>
-  <w:abstractNum w:abstractNumId="3" w15:restartNumberingAfterBreak="0">
+  <w:abstractNum w:abstractNumId="8" w15:restartNumberingAfterBreak="0">
+    <w:nsid w:val="11E36A81"/>
+    <w:multiLevelType w:val="hybridMultilevel"/>
+    <w:tmpl w:val="3DC2AB04"/>
+    <w:lvl w:ilvl="0" w:tplc="C5BA0334">
+      <w:start w:val="1"/>
+      <w:numFmt w:val="lowerRoman"/>
+      <w:pStyle w:val="Heading4"/>
+      <w:lvlText w:val="%1."/>
+      <w:lvlJc w:val="right"/>
+      <w:pPr>
+        <w:ind w:left="720" w:hanging="360"/>
+      </w:pPr>
+    </w:lvl>
+    <w:lvl w:ilvl="1" w:tplc="08090019" w:tentative="1">
+      <w:start w:val="1"/>
+      <w:numFmt w:val="lowerLetter"/>
+      <w:lvlText w:val="%2."/>
+      <w:lvlJc w:val="left"/>
+      <w:pPr>
+        <w:ind w:left="1440" w:hanging="360"/>
+      </w:pPr>
+    </w:lvl>
+    <w:lvl w:ilvl="2" w:tplc="0809001B" w:tentative="1">
+      <w:start w:val="1"/>
+      <w:numFmt w:val="lowerRoman"/>
+      <w:lvlText w:val="%3."/>
+      <w:lvlJc w:val="right"/>
+      <w:pPr>
+        <w:ind w:left="2160" w:hanging="180"/>
+      </w:pPr>
+    </w:lvl>
+    <w:lvl w:ilvl="3" w:tplc="0809000F" w:tentative="1">
+      <w:start w:val="1"/>
+      <w:numFmt w:val="decimal"/>
+      <w:lvlText w:val="%4."/>
+      <w:lvlJc w:val="left"/>
+      <w:pPr>
+        <w:ind w:left="2880" w:hanging="360"/>
+      </w:pPr>
+    </w:lvl>
+    <w:lvl w:ilvl="4" w:tplc="08090019" w:tentative="1">
+      <w:start w:val="1"/>
+      <w:numFmt w:val="lowerLetter"/>
+      <w:lvlText w:val="%5."/>
+      <w:lvlJc w:val="left"/>
+      <w:pPr>
+        <w:ind w:left="3600" w:hanging="360"/>
+      </w:pPr>
+    </w:lvl>
+    <w:lvl w:ilvl="5" w:tplc="0809001B" w:tentative="1">
+      <w:start w:val="1"/>
+      <w:numFmt w:val="lowerRoman"/>
+      <w:lvlText w:val="%6."/>
+      <w:lvlJc w:val="right"/>
+      <w:pPr>
+        <w:ind w:left="4320" w:hanging="180"/>
+      </w:pPr>
+    </w:lvl>
+    <w:lvl w:ilvl="6" w:tplc="0809000F" w:tentative="1">
+      <w:start w:val="1"/>
+      <w:numFmt w:val="decimal"/>
+      <w:lvlText w:val="%7."/>
+      <w:lvlJc w:val="left"/>
+      <w:pPr>
+        <w:ind w:left="5040" w:hanging="360"/>
+      </w:pPr>
+    </w:lvl>
+    <w:lvl w:ilvl="7" w:tplc="08090019" w:tentative="1">
+      <w:start w:val="1"/>
+      <w:numFmt w:val="lowerLetter"/>
+      <w:lvlText w:val="%8."/>
+      <w:lvlJc w:val="left"/>
+      <w:pPr>
+        <w:ind w:left="5760" w:hanging="360"/>
+      </w:pPr>
+    </w:lvl>
+    <w:lvl w:ilvl="8" w:tplc="0809001B" w:tentative="1">
+      <w:start w:val="1"/>
+      <w:numFmt w:val="lowerRoman"/>
+      <w:lvlText w:val="%9."/>
+      <w:lvlJc w:val="right"/>
+      <w:pPr>
+        <w:ind w:left="6480" w:hanging="180"/>
+      </w:pPr>
+    </w:lvl>
+  </w:abstractNum>
+  <w:abstractNum w:abstractNumId="9" w15:restartNumberingAfterBreak="0">
+    <w:nsid w:val="1AC41835"/>
+    <w:multiLevelType w:val="multilevel"/>
+    <w:tmpl w:val="E0E41F1A"/>
+    <w:lvl w:ilvl="0">
+      <w:start w:val="5"/>
+      <w:numFmt w:val="decimal"/>
+      <w:lvlText w:val="%1."/>
+      <w:lvlJc w:val="left"/>
+      <w:pPr>
+        <w:tabs>
+          <w:tab w:val="num" w:pos="720"/>
+        </w:tabs>
+        <w:ind w:left="720" w:hanging="360"/>
+      </w:pPr>
+    </w:lvl>
+    <w:lvl w:ilvl="1" w:tentative="1">
+      <w:start w:val="1"/>
+      <w:numFmt w:val="decimal"/>
+      <w:lvlText w:val="%2."/>
+      <w:lvlJc w:val="left"/>
+      <w:pPr>
+        <w:tabs>
+          <w:tab w:val="num" w:pos="1440"/>
+        </w:tabs>
+        <w:ind w:left="1440" w:hanging="360"/>
+      </w:pPr>
+    </w:lvl>
+    <w:lvl w:ilvl="2" w:tentative="1">
+      <w:start w:val="1"/>
+      <w:numFmt w:val="decimal"/>
+      <w:lvlText w:val="%3."/>
+      <w:lvlJc w:val="left"/>
+      <w:pPr>
+        <w:tabs>
+          <w:tab w:val="num" w:pos="2160"/>
+        </w:tabs>
+        <w:ind w:left="2160" w:hanging="360"/>
+      </w:pPr>
+    </w:lvl>
+    <w:lvl w:ilvl="3" w:tentative="1">
+      <w:start w:val="1"/>
+      <w:numFmt w:val="decimal"/>
+      <w:lvlText w:val="%4."/>
+      <w:lvlJc w:val="left"/>
+      <w:pPr>
+        <w:tabs>
+          <w:tab w:val="num" w:pos="2880"/>
+        </w:tabs>
+        <w:ind w:left="2880" w:hanging="360"/>
+      </w:pPr>
+    </w:lvl>
+    <w:lvl w:ilvl="4" w:tentative="1">
+      <w:start w:val="1"/>
+      <w:numFmt w:val="decimal"/>
+      <w:lvlText w:val="%5."/>
+      <w:lvlJc w:val="left"/>
+      <w:pPr>
+        <w:tabs>
+          <w:tab w:val="num" w:pos="3600"/>
+        </w:tabs>
+        <w:ind w:left="3600" w:hanging="360"/>
+      </w:pPr>
+    </w:lvl>
+    <w:lvl w:ilvl="5" w:tentative="1">
+      <w:start w:val="1"/>
+      <w:numFmt w:val="decimal"/>
+      <w:lvlText w:val="%6."/>
+      <w:lvlJc w:val="left"/>
+      <w:pPr>
+        <w:tabs>
+          <w:tab w:val="num" w:pos="4320"/>
+        </w:tabs>
+        <w:ind w:left="4320" w:hanging="360"/>
+      </w:pPr>
+    </w:lvl>
+    <w:lvl w:ilvl="6" w:tentative="1">
+      <w:start w:val="1"/>
+      <w:numFmt w:val="decimal"/>
+      <w:lvlText w:val="%7."/>
+      <w:lvlJc w:val="left"/>
+      <w:pPr>
+        <w:tabs>
+          <w:tab w:val="num" w:pos="5040"/>
+        </w:tabs>
+        <w:ind w:left="5040" w:hanging="360"/>
+      </w:pPr>
+    </w:lvl>
+    <w:lvl w:ilvl="7" w:tentative="1">
+      <w:start w:val="1"/>
+      <w:numFmt w:val="decimal"/>
+      <w:lvlText w:val="%8."/>
+      <w:lvlJc w:val="left"/>
+      <w:pPr>
+        <w:tabs>
+          <w:tab w:val="num" w:pos="5760"/>
+        </w:tabs>
+        <w:ind w:left="5760" w:hanging="360"/>
+      </w:pPr>
+    </w:lvl>
+    <w:lvl w:ilvl="8" w:tentative="1">
+      <w:start w:val="1"/>
+      <w:numFmt w:val="decimal"/>
+      <w:lvlText w:val="%9."/>
+      <w:lvlJc w:val="left"/>
+      <w:pPr>
+        <w:tabs>
+          <w:tab w:val="num" w:pos="6480"/>
+        </w:tabs>
+        <w:ind w:left="6480" w:hanging="360"/>
+      </w:pPr>
+    </w:lvl>
+  </w:abstractNum>
+  <w:abstractNum w:abstractNumId="10" w15:restartNumberingAfterBreak="0">
     <w:nsid w:val="236F0899"/>
     <w:multiLevelType w:val="multilevel"/>
     <w:tmpl w:val="FA60E36E"/>
@@ -10053,7 +11840,156 @@
       </w:pPr>
     </w:lvl>
   </w:abstractNum>
-  <w:abstractNum w:abstractNumId="4" w15:restartNumberingAfterBreak="0">
+  <w:abstractNum w:abstractNumId="11" w15:restartNumberingAfterBreak="0">
+    <w:nsid w:val="25CA7B13"/>
+    <w:multiLevelType w:val="multilevel"/>
+    <w:tmpl w:val="C6EE52EA"/>
+    <w:lvl w:ilvl="0">
+      <w:start w:val="1"/>
+      <w:numFmt w:val="bullet"/>
+      <w:lvlText w:val=""/>
+      <w:lvlJc w:val="left"/>
+      <w:pPr>
+        <w:tabs>
+          <w:tab w:val="num" w:pos="720"/>
+        </w:tabs>
+        <w:ind w:left="720" w:hanging="360"/>
+      </w:pPr>
+      <w:rPr>
+        <w:rFonts w:ascii="Symbol" w:hAnsi="Symbol" w:hint="default"/>
+        <w:sz w:val="20"/>
+      </w:rPr>
+    </w:lvl>
+    <w:lvl w:ilvl="1" w:tentative="1">
+      <w:start w:val="1"/>
+      <w:numFmt w:val="bullet"/>
+      <w:lvlText w:val="o"/>
+      <w:lvlJc w:val="left"/>
+      <w:pPr>
+        <w:tabs>
+          <w:tab w:val="num" w:pos="1440"/>
+        </w:tabs>
+        <w:ind w:left="1440" w:hanging="360"/>
+      </w:pPr>
+      <w:rPr>
+        <w:rFonts w:ascii="Courier New" w:hAnsi="Courier New" w:hint="default"/>
+        <w:sz w:val="20"/>
+      </w:rPr>
+    </w:lvl>
+    <w:lvl w:ilvl="2" w:tentative="1">
+      <w:start w:val="1"/>
+      <w:numFmt w:val="bullet"/>
+      <w:lvlText w:val=""/>
+      <w:lvlJc w:val="left"/>
+      <w:pPr>
+        <w:tabs>
+          <w:tab w:val="num" w:pos="2160"/>
+        </w:tabs>
+        <w:ind w:left="2160" w:hanging="360"/>
+      </w:pPr>
+      <w:rPr>
+        <w:rFonts w:ascii="Wingdings" w:hAnsi="Wingdings" w:hint="default"/>
+        <w:sz w:val="20"/>
+      </w:rPr>
+    </w:lvl>
+    <w:lvl w:ilvl="3" w:tentative="1">
+      <w:start w:val="1"/>
+      <w:numFmt w:val="bullet"/>
+      <w:lvlText w:val=""/>
+      <w:lvlJc w:val="left"/>
+      <w:pPr>
+        <w:tabs>
+          <w:tab w:val="num" w:pos="2880"/>
+        </w:tabs>
+        <w:ind w:left="2880" w:hanging="360"/>
+      </w:pPr>
+      <w:rPr>
+        <w:rFonts w:ascii="Wingdings" w:hAnsi="Wingdings" w:hint="default"/>
+        <w:sz w:val="20"/>
+      </w:rPr>
+    </w:lvl>
+    <w:lvl w:ilvl="4" w:tentative="1">
+      <w:start w:val="1"/>
+      <w:numFmt w:val="bullet"/>
+      <w:lvlText w:val=""/>
+      <w:lvlJc w:val="left"/>
+      <w:pPr>
+        <w:tabs>
+          <w:tab w:val="num" w:pos="3600"/>
+        </w:tabs>
+        <w:ind w:left="3600" w:hanging="360"/>
+      </w:pPr>
+      <w:rPr>
+        <w:rFonts w:ascii="Wingdings" w:hAnsi="Wingdings" w:hint="default"/>
+        <w:sz w:val="20"/>
+      </w:rPr>
+    </w:lvl>
+    <w:lvl w:ilvl="5" w:tentative="1">
+      <w:start w:val="1"/>
+      <w:numFmt w:val="bullet"/>
+      <w:lvlText w:val=""/>
+      <w:lvlJc w:val="left"/>
+      <w:pPr>
+        <w:tabs>
+          <w:tab w:val="num" w:pos="4320"/>
+        </w:tabs>
+        <w:ind w:left="4320" w:hanging="360"/>
+      </w:pPr>
+      <w:rPr>
+        <w:rFonts w:ascii="Wingdings" w:hAnsi="Wingdings" w:hint="default"/>
+        <w:sz w:val="20"/>
+      </w:rPr>
+    </w:lvl>
+    <w:lvl w:ilvl="6" w:tentative="1">
+      <w:start w:val="1"/>
+      <w:numFmt w:val="bullet"/>
+      <w:lvlText w:val=""/>
+      <w:lvlJc w:val="left"/>
+      <w:pPr>
+        <w:tabs>
+          <w:tab w:val="num" w:pos="5040"/>
+        </w:tabs>
+        <w:ind w:left="5040" w:hanging="360"/>
+      </w:pPr>
+      <w:rPr>
+        <w:rFonts w:ascii="Wingdings" w:hAnsi="Wingdings" w:hint="default"/>
+        <w:sz w:val="20"/>
+      </w:rPr>
+    </w:lvl>
+    <w:lvl w:ilvl="7" w:tentative="1">
+      <w:start w:val="1"/>
+      <w:numFmt w:val="bullet"/>
+      <w:lvlText w:val=""/>
+      <w:lvlJc w:val="left"/>
+      <w:pPr>
+        <w:tabs>
+          <w:tab w:val="num" w:pos="5760"/>
+        </w:tabs>
+        <w:ind w:left="5760" w:hanging="360"/>
+      </w:pPr>
+      <w:rPr>
+        <w:rFonts w:ascii="Wingdings" w:hAnsi="Wingdings" w:hint="default"/>
+        <w:sz w:val="20"/>
+      </w:rPr>
+    </w:lvl>
+    <w:lvl w:ilvl="8" w:tentative="1">
+      <w:start w:val="1"/>
+      <w:numFmt w:val="bullet"/>
+      <w:lvlText w:val=""/>
+      <w:lvlJc w:val="left"/>
+      <w:pPr>
+        <w:tabs>
+          <w:tab w:val="num" w:pos="6480"/>
+        </w:tabs>
+        <w:ind w:left="6480" w:hanging="360"/>
+      </w:pPr>
+      <w:rPr>
+        <w:rFonts w:ascii="Wingdings" w:hAnsi="Wingdings" w:hint="default"/>
+        <w:sz w:val="20"/>
+      </w:rPr>
+    </w:lvl>
+  </w:abstractNum>
+  <w:abstractNum w:abstractNumId="12" w15:restartNumberingAfterBreak="0">
     <w:nsid w:val="2812658D"/>
     <w:multiLevelType w:val="hybridMultilevel"/>
     <w:tmpl w:val="208E4D56"/>
@@ -10140,7 +12076,7 @@
       </w:pPr>
     </w:lvl>
   </w:abstractNum>
-  <w:abstractNum w:abstractNumId="5" w15:restartNumberingAfterBreak="0">
+  <w:abstractNum w:abstractNumId="13" w15:restartNumberingAfterBreak="0">
     <w:nsid w:val="2A292607"/>
     <w:multiLevelType w:val="multilevel"/>
     <w:tmpl w:val="1B78446E"/>
@@ -10253,7 +12189,7 @@
       </w:pPr>
     </w:lvl>
   </w:abstractNum>
-  <w:abstractNum w:abstractNumId="6" w15:restartNumberingAfterBreak="0">
+  <w:abstractNum w:abstractNumId="14" w15:restartNumberingAfterBreak="0">
     <w:nsid w:val="2F965CFD"/>
     <w:multiLevelType w:val="multilevel"/>
     <w:tmpl w:val="5E2E78C6"/>
@@ -10366,7 +12302,7 @@
       </w:pPr>
     </w:lvl>
   </w:abstractNum>
-  <w:abstractNum w:abstractNumId="7" w15:restartNumberingAfterBreak="0">
+  <w:abstractNum w:abstractNumId="15" w15:restartNumberingAfterBreak="0">
     <w:nsid w:val="3DF927F4"/>
     <w:multiLevelType w:val="multilevel"/>
     <w:tmpl w:val="0BF2BAAC"/>
@@ -10479,7 +12415,7 @@
       </w:pPr>
     </w:lvl>
   </w:abstractNum>
-  <w:abstractNum w:abstractNumId="8" w15:restartNumberingAfterBreak="0">
+  <w:abstractNum w:abstractNumId="16" w15:restartNumberingAfterBreak="0">
     <w:nsid w:val="3E532CC7"/>
     <w:multiLevelType w:val="multilevel"/>
     <w:tmpl w:val="FB9C43B0"/>
@@ -10592,7 +12528,7 @@
       </w:pPr>
     </w:lvl>
   </w:abstractNum>
-  <w:abstractNum w:abstractNumId="9" w15:restartNumberingAfterBreak="0">
+  <w:abstractNum w:abstractNumId="17" w15:restartNumberingAfterBreak="0">
     <w:nsid w:val="46737DB1"/>
     <w:multiLevelType w:val="hybridMultilevel"/>
     <w:tmpl w:val="A95E1742"/>
@@ -10679,7 +12615,120 @@
       </w:pPr>
     </w:lvl>
   </w:abstractNum>
-  <w:abstractNum w:abstractNumId="10" w15:restartNumberingAfterBreak="0">
+  <w:abstractNum w:abstractNumId="18" w15:restartNumberingAfterBreak="0">
+    <w:nsid w:val="46864E9D"/>
+    <w:multiLevelType w:val="multilevel"/>
+    <w:tmpl w:val="5AC492D4"/>
+    <w:lvl w:ilvl="0">
+      <w:start w:val="2"/>
+      <w:numFmt w:val="decimal"/>
+      <w:lvlText w:val="%1."/>
+      <w:lvlJc w:val="left"/>
+      <w:pPr>
+        <w:tabs>
+          <w:tab w:val="num" w:pos="720"/>
+        </w:tabs>
+        <w:ind w:left="720" w:hanging="360"/>
+      </w:pPr>
+    </w:lvl>
+    <w:lvl w:ilvl="1" w:tentative="1">
+      <w:start w:val="1"/>
+      <w:numFmt w:val="decimal"/>
+      <w:lvlText w:val="%2."/>
+      <w:lvlJc w:val="left"/>
+      <w:pPr>
+        <w:tabs>
+          <w:tab w:val="num" w:pos="1440"/>
+        </w:tabs>
+        <w:ind w:left="1440" w:hanging="360"/>
+      </w:pPr>
+    </w:lvl>
+    <w:lvl w:ilvl="2" w:tentative="1">
+      <w:start w:val="1"/>
+      <w:numFmt w:val="decimal"/>
+      <w:lvlText w:val="%3."/>
+      <w:lvlJc w:val="left"/>
+      <w:pPr>
+        <w:tabs>
+          <w:tab w:val="num" w:pos="2160"/>
+        </w:tabs>
+        <w:ind w:left="2160" w:hanging="360"/>
+      </w:pPr>
+    </w:lvl>
+    <w:lvl w:ilvl="3" w:tentative="1">
+      <w:start w:val="1"/>
+      <w:numFmt w:val="decimal"/>
+      <w:lvlText w:val="%4."/>
+      <w:lvlJc w:val="left"/>
+      <w:pPr>
+        <w:tabs>
+          <w:tab w:val="num" w:pos="2880"/>
+        </w:tabs>
+        <w:ind w:left="2880" w:hanging="360"/>
+      </w:pPr>
+    </w:lvl>
+    <w:lvl w:ilvl="4" w:tentative="1">
+      <w:start w:val="1"/>
+      <w:numFmt w:val="decimal"/>
+      <w:lvlText w:val="%5."/>
+      <w:lvlJc w:val="left"/>
+      <w:pPr>
+        <w:tabs>
+          <w:tab w:val="num" w:pos="3600"/>
+        </w:tabs>
+        <w:ind w:left="3600" w:hanging="360"/>
+      </w:pPr>
+    </w:lvl>
+    <w:lvl w:ilvl="5" w:tentative="1">
+      <w:start w:val="1"/>
+      <w:numFmt w:val="decimal"/>
+      <w:lvlText w:val="%6."/>
+      <w:lvlJc w:val="left"/>
+      <w:pPr>
+        <w:tabs>
+          <w:tab w:val="num" w:pos="4320"/>
+        </w:tabs>
+        <w:ind w:left="4320" w:hanging="360"/>
+      </w:pPr>
+    </w:lvl>
+    <w:lvl w:ilvl="6" w:tentative="1">
+      <w:start w:val="1"/>
+      <w:numFmt w:val="decimal"/>
+      <w:lvlText w:val="%7."/>
+      <w:lvlJc w:val="left"/>
+      <w:pPr>
+        <w:tabs>
+          <w:tab w:val="num" w:pos="5040"/>
+        </w:tabs>
+        <w:ind w:left="5040" w:hanging="360"/>
+      </w:pPr>
+    </w:lvl>
+    <w:lvl w:ilvl="7" w:tentative="1">
+      <w:start w:val="1"/>
+      <w:numFmt w:val="decimal"/>
+      <w:lvlText w:val="%8."/>
+      <w:lvlJc w:val="left"/>
+      <w:pPr>
+        <w:tabs>
+          <w:tab w:val="num" w:pos="5760"/>
+        </w:tabs>
+        <w:ind w:left="5760" w:hanging="360"/>
+      </w:pPr>
+    </w:lvl>
+    <w:lvl w:ilvl="8" w:tentative="1">
+      <w:start w:val="1"/>
+      <w:numFmt w:val="decimal"/>
+      <w:lvlText w:val="%9."/>
+      <w:lvlJc w:val="left"/>
+      <w:pPr>
+        <w:tabs>
+          <w:tab w:val="num" w:pos="6480"/>
+        </w:tabs>
+        <w:ind w:left="6480" w:hanging="360"/>
+      </w:pPr>
+    </w:lvl>
+  </w:abstractNum>
+  <w:abstractNum w:abstractNumId="19" w15:restartNumberingAfterBreak="0">
     <w:nsid w:val="4AE62145"/>
     <w:multiLevelType w:val="multilevel"/>
     <w:tmpl w:val="CADE2EA2"/>
@@ -10826,7 +12875,7 @@
       </w:rPr>
     </w:lvl>
   </w:abstractNum>
-  <w:abstractNum w:abstractNumId="11" w15:restartNumberingAfterBreak="0">
+  <w:abstractNum w:abstractNumId="20" w15:restartNumberingAfterBreak="0">
     <w:nsid w:val="4BAD7D35"/>
     <w:multiLevelType w:val="multilevel"/>
     <w:tmpl w:val="6D48D582"/>
@@ -10939,7 +12988,7 @@
       </w:pPr>
     </w:lvl>
   </w:abstractNum>
-  <w:abstractNum w:abstractNumId="12" w15:restartNumberingAfterBreak="0">
+  <w:abstractNum w:abstractNumId="21" w15:restartNumberingAfterBreak="0">
     <w:nsid w:val="5314000D"/>
     <w:multiLevelType w:val="hybridMultilevel"/>
     <w:tmpl w:val="6B16C3C8"/>
@@ -11026,7 +13075,120 @@
       </w:pPr>
     </w:lvl>
   </w:abstractNum>
-  <w:abstractNum w:abstractNumId="13" w15:restartNumberingAfterBreak="0">
+  <w:abstractNum w:abstractNumId="22" w15:restartNumberingAfterBreak="0">
+    <w:nsid w:val="5C433293"/>
+    <w:multiLevelType w:val="multilevel"/>
+    <w:tmpl w:val="CBA4FCFE"/>
+    <w:lvl w:ilvl="0">
+      <w:start w:val="5"/>
+      <w:numFmt w:val="decimal"/>
+      <w:lvlText w:val="%1."/>
+      <w:lvlJc w:val="left"/>
+      <w:pPr>
+        <w:tabs>
+          <w:tab w:val="num" w:pos="720"/>
+        </w:tabs>
+        <w:ind w:left="720" w:hanging="360"/>
+      </w:pPr>
+    </w:lvl>
+    <w:lvl w:ilvl="1" w:tentative="1">
+      <w:start w:val="1"/>
+      <w:numFmt w:val="decimal"/>
+      <w:lvlText w:val="%2."/>
+      <w:lvlJc w:val="left"/>
+      <w:pPr>
+        <w:tabs>
+          <w:tab w:val="num" w:pos="1440"/>
+        </w:tabs>
+        <w:ind w:left="1440" w:hanging="360"/>
+      </w:pPr>
+    </w:lvl>
+    <w:lvl w:ilvl="2" w:tentative="1">
+      <w:start w:val="1"/>
+      <w:numFmt w:val="decimal"/>
+      <w:lvlText w:val="%3."/>
+      <w:lvlJc w:val="left"/>
+      <w:pPr>
+        <w:tabs>
+          <w:tab w:val="num" w:pos="2160"/>
+        </w:tabs>
+        <w:ind w:left="2160" w:hanging="360"/>
+      </w:pPr>
+    </w:lvl>
+    <w:lvl w:ilvl="3" w:tentative="1">
+      <w:start w:val="1"/>
+      <w:numFmt w:val="decimal"/>
+      <w:lvlText w:val="%4."/>
+      <w:lvlJc w:val="left"/>
+      <w:pPr>
+        <w:tabs>
+          <w:tab w:val="num" w:pos="2880"/>
+        </w:tabs>
+        <w:ind w:left="2880" w:hanging="360"/>
+      </w:pPr>
+    </w:lvl>
+    <w:lvl w:ilvl="4" w:tentative="1">
+      <w:start w:val="1"/>
+      <w:numFmt w:val="decimal"/>
+      <w:lvlText w:val="%5."/>
+      <w:lvlJc w:val="left"/>
+      <w:pPr>
+        <w:tabs>
+          <w:tab w:val="num" w:pos="3600"/>
+        </w:tabs>
+        <w:ind w:left="3600" w:hanging="360"/>
+      </w:pPr>
+    </w:lvl>
+    <w:lvl w:ilvl="5" w:tentative="1">
+      <w:start w:val="1"/>
+      <w:numFmt w:val="decimal"/>
+      <w:lvlText w:val="%6."/>
+      <w:lvlJc w:val="left"/>
+      <w:pPr>
+        <w:tabs>
+          <w:tab w:val="num" w:pos="4320"/>
+        </w:tabs>
+        <w:ind w:left="4320" w:hanging="360"/>
+      </w:pPr>
+    </w:lvl>
+    <w:lvl w:ilvl="6" w:tentative="1">
+      <w:start w:val="1"/>
+      <w:numFmt w:val="decimal"/>
+      <w:lvlText w:val="%7."/>
+      <w:lvlJc w:val="left"/>
+      <w:pPr>
+        <w:tabs>
+          <w:tab w:val="num" w:pos="5040"/>
+        </w:tabs>
+        <w:ind w:left="5040" w:hanging="360"/>
+      </w:pPr>
+    </w:lvl>
+    <w:lvl w:ilvl="7" w:tentative="1">
+      <w:start w:val="1"/>
+      <w:numFmt w:val="decimal"/>
+      <w:lvlText w:val="%8."/>
+      <w:lvlJc w:val="left"/>
+      <w:pPr>
+        <w:tabs>
+          <w:tab w:val="num" w:pos="5760"/>
+        </w:tabs>
+        <w:ind w:left="5760" w:hanging="360"/>
+      </w:pPr>
+    </w:lvl>
+    <w:lvl w:ilvl="8" w:tentative="1">
+      <w:start w:val="1"/>
+      <w:numFmt w:val="decimal"/>
+      <w:lvlText w:val="%9."/>
+      <w:lvlJc w:val="left"/>
+      <w:pPr>
+        <w:tabs>
+          <w:tab w:val="num" w:pos="6480"/>
+        </w:tabs>
+        <w:ind w:left="6480" w:hanging="360"/>
+      </w:pPr>
+    </w:lvl>
+  </w:abstractNum>
+  <w:abstractNum w:abstractNumId="23" w15:restartNumberingAfterBreak="0">
     <w:nsid w:val="5E1809E8"/>
     <w:multiLevelType w:val="multilevel"/>
     <w:tmpl w:val="6A665A6C"/>
@@ -11139,7 +13301,7 @@
       </w:pPr>
     </w:lvl>
   </w:abstractNum>
-  <w:abstractNum w:abstractNumId="14" w15:restartNumberingAfterBreak="0">
+  <w:abstractNum w:abstractNumId="24" w15:restartNumberingAfterBreak="0">
     <w:nsid w:val="5EA7671C"/>
     <w:multiLevelType w:val="multilevel"/>
     <w:tmpl w:val="E2D0F3D8"/>
@@ -11252,7 +13414,233 @@
       </w:pPr>
     </w:lvl>
   </w:abstractNum>
-  <w:abstractNum w:abstractNumId="15" w15:restartNumberingAfterBreak="0">
+  <w:abstractNum w:abstractNumId="25" w15:restartNumberingAfterBreak="0">
+    <w:nsid w:val="5EF52AA8"/>
+    <w:multiLevelType w:val="multilevel"/>
+    <w:tmpl w:val="553666D0"/>
+    <w:lvl w:ilvl="0">
+      <w:start w:val="6"/>
+      <w:numFmt w:val="decimal"/>
+      <w:lvlText w:val="%1."/>
+      <w:lvlJc w:val="left"/>
+      <w:pPr>
+        <w:tabs>
+          <w:tab w:val="num" w:pos="720"/>
+        </w:tabs>
+        <w:ind w:left="720" w:hanging="360"/>
+      </w:pPr>
+    </w:lvl>
+    <w:lvl w:ilvl="1" w:tentative="1">
+      <w:start w:val="1"/>
+      <w:numFmt w:val="decimal"/>
+      <w:lvlText w:val="%2."/>
+      <w:lvlJc w:val="left"/>
+      <w:pPr>
+        <w:tabs>
+          <w:tab w:val="num" w:pos="1440"/>
+        </w:tabs>
+        <w:ind w:left="1440" w:hanging="360"/>
+      </w:pPr>
+    </w:lvl>
+    <w:lvl w:ilvl="2" w:tentative="1">
+      <w:start w:val="1"/>
+      <w:numFmt w:val="decimal"/>
+      <w:lvlText w:val="%3."/>
+      <w:lvlJc w:val="left"/>
+      <w:pPr>
+        <w:tabs>
+          <w:tab w:val="num" w:pos="2160"/>
+        </w:tabs>
+        <w:ind w:left="2160" w:hanging="360"/>
+      </w:pPr>
+    </w:lvl>
+    <w:lvl w:ilvl="3" w:tentative="1">
+      <w:start w:val="1"/>
+      <w:numFmt w:val="decimal"/>
+      <w:lvlText w:val="%4."/>
+      <w:lvlJc w:val="left"/>
+      <w:pPr>
+        <w:tabs>
+          <w:tab w:val="num" w:pos="2880"/>
+        </w:tabs>
+        <w:ind w:left="2880" w:hanging="360"/>
+      </w:pPr>
+    </w:lvl>
+    <w:lvl w:ilvl="4" w:tentative="1">
+      <w:start w:val="1"/>
+      <w:numFmt w:val="decimal"/>
+      <w:lvlText w:val="%5."/>
+      <w:lvlJc w:val="left"/>
+      <w:pPr>
+        <w:tabs>
+          <w:tab w:val="num" w:pos="3600"/>
+        </w:tabs>
+        <w:ind w:left="3600" w:hanging="360"/>
+      </w:pPr>
+    </w:lvl>
+    <w:lvl w:ilvl="5" w:tentative="1">
+      <w:start w:val="1"/>
+      <w:numFmt w:val="decimal"/>
+      <w:lvlText w:val="%6."/>
+      <w:lvlJc w:val="left"/>
+      <w:pPr>
+        <w:tabs>
+          <w:tab w:val="num" w:pos="4320"/>
+        </w:tabs>
+        <w:ind w:left="4320" w:hanging="360"/>
+      </w:pPr>
+    </w:lvl>
+    <w:lvl w:ilvl="6" w:tentative="1">
+      <w:start w:val="1"/>
+      <w:numFmt w:val="decimal"/>
+      <w:lvlText w:val="%7."/>
+      <w:lvlJc w:val="left"/>
+      <w:pPr>
+        <w:tabs>
+          <w:tab w:val="num" w:pos="5040"/>
+        </w:tabs>
+        <w:ind w:left="5040" w:hanging="360"/>
+      </w:pPr>
+    </w:lvl>
+    <w:lvl w:ilvl="7" w:tentative="1">
+      <w:start w:val="1"/>
+      <w:numFmt w:val="decimal"/>
+      <w:lvlText w:val="%8."/>
+      <w:lvlJc w:val="left"/>
+      <w:pPr>
+        <w:tabs>
+          <w:tab w:val="num" w:pos="5760"/>
+        </w:tabs>
+        <w:ind w:left="5760" w:hanging="360"/>
+      </w:pPr>
+    </w:lvl>
+    <w:lvl w:ilvl="8" w:tentative="1">
+      <w:start w:val="1"/>
+      <w:numFmt w:val="decimal"/>
+      <w:lvlText w:val="%9."/>
+      <w:lvlJc w:val="left"/>
+      <w:pPr>
+        <w:tabs>
+          <w:tab w:val="num" w:pos="6480"/>
+        </w:tabs>
+        <w:ind w:left="6480" w:hanging="360"/>
+      </w:pPr>
+    </w:lvl>
+  </w:abstractNum>
+  <w:abstractNum w:abstractNumId="26" w15:restartNumberingAfterBreak="0">
+    <w:nsid w:val="65FC4BEC"/>
+    <w:multiLevelType w:val="multilevel"/>
+    <w:tmpl w:val="A5620ED4"/>
+    <w:lvl w:ilvl="0">
+      <w:start w:val="1"/>
+      <w:numFmt w:val="decimal"/>
+      <w:lvlText w:val="%1."/>
+      <w:lvlJc w:val="left"/>
+      <w:pPr>
+        <w:tabs>
+          <w:tab w:val="num" w:pos="720"/>
+        </w:tabs>
+        <w:ind w:left="720" w:hanging="360"/>
+      </w:pPr>
+    </w:lvl>
+    <w:lvl w:ilvl="1" w:tentative="1">
+      <w:start w:val="1"/>
+      <w:numFmt w:val="decimal"/>
+      <w:lvlText w:val="%2."/>
+      <w:lvlJc w:val="left"/>
+      <w:pPr>
+        <w:tabs>
+          <w:tab w:val="num" w:pos="1440"/>
+        </w:tabs>
+        <w:ind w:left="1440" w:hanging="360"/>
+      </w:pPr>
+    </w:lvl>
+    <w:lvl w:ilvl="2" w:tentative="1">
+      <w:start w:val="1"/>
+      <w:numFmt w:val="decimal"/>
+      <w:lvlText w:val="%3."/>
+      <w:lvlJc w:val="left"/>
+      <w:pPr>
+        <w:tabs>
+          <w:tab w:val="num" w:pos="2160"/>
+        </w:tabs>
+        <w:ind w:left="2160" w:hanging="360"/>
+      </w:pPr>
+    </w:lvl>
+    <w:lvl w:ilvl="3" w:tentative="1">
+      <w:start w:val="1"/>
+      <w:numFmt w:val="decimal"/>
+      <w:lvlText w:val="%4."/>
+      <w:lvlJc w:val="left"/>
+      <w:pPr>
+        <w:tabs>
+          <w:tab w:val="num" w:pos="2880"/>
+        </w:tabs>
+        <w:ind w:left="2880" w:hanging="360"/>
+      </w:pPr>
+    </w:lvl>
+    <w:lvl w:ilvl="4" w:tentative="1">
+      <w:start w:val="1"/>
+      <w:numFmt w:val="decimal"/>
+      <w:lvlText w:val="%5."/>
+      <w:lvlJc w:val="left"/>
+      <w:pPr>
+        <w:tabs>
+          <w:tab w:val="num" w:pos="3600"/>
+        </w:tabs>
+        <w:ind w:left="3600" w:hanging="360"/>
+      </w:pPr>
+    </w:lvl>
+    <w:lvl w:ilvl="5" w:tentative="1">
+      <w:start w:val="1"/>
+      <w:numFmt w:val="decimal"/>
+      <w:lvlText w:val="%6."/>
+      <w:lvlJc w:val="left"/>
+      <w:pPr>
+        <w:tabs>
+          <w:tab w:val="num" w:pos="4320"/>
+        </w:tabs>
+        <w:ind w:left="4320" w:hanging="360"/>
+      </w:pPr>
+    </w:lvl>
+    <w:lvl w:ilvl="6" w:tentative="1">
+      <w:start w:val="1"/>
+      <w:numFmt w:val="decimal"/>
+      <w:lvlText w:val="%7."/>
+      <w:lvlJc w:val="left"/>
+      <w:pPr>
+        <w:tabs>
+          <w:tab w:val="num" w:pos="5040"/>
+        </w:tabs>
+        <w:ind w:left="5040" w:hanging="360"/>
+      </w:pPr>
+    </w:lvl>
+    <w:lvl w:ilvl="7" w:tentative="1">
+      <w:start w:val="1"/>
+      <w:numFmt w:val="decimal"/>
+      <w:lvlText w:val="%8."/>
+      <w:lvlJc w:val="left"/>
+      <w:pPr>
+        <w:tabs>
+          <w:tab w:val="num" w:pos="5760"/>
+        </w:tabs>
+        <w:ind w:left="5760" w:hanging="360"/>
+      </w:pPr>
+    </w:lvl>
+    <w:lvl w:ilvl="8" w:tentative="1">
+      <w:start w:val="1"/>
+      <w:numFmt w:val="decimal"/>
+      <w:lvlText w:val="%9."/>
+      <w:lvlJc w:val="left"/>
+      <w:pPr>
+        <w:tabs>
+          <w:tab w:val="num" w:pos="6480"/>
+        </w:tabs>
+        <w:ind w:left="6480" w:hanging="360"/>
+      </w:pPr>
+    </w:lvl>
+  </w:abstractNum>
+  <w:abstractNum w:abstractNumId="27" w15:restartNumberingAfterBreak="0">
     <w:nsid w:val="6F3F0F6D"/>
     <w:multiLevelType w:val="multilevel"/>
     <w:tmpl w:val="E30E361A"/>
@@ -11401,7 +13789,7 @@
       </w:rPr>
     </w:lvl>
   </w:abstractNum>
-  <w:abstractNum w:abstractNumId="16" w15:restartNumberingAfterBreak="0">
+  <w:abstractNum w:abstractNumId="28" w15:restartNumberingAfterBreak="0">
     <w:nsid w:val="71A350A1"/>
     <w:multiLevelType w:val="multilevel"/>
     <w:tmpl w:val="D4D46A66"/>
@@ -11551,97 +13939,151 @@
     </w:lvl>
   </w:abstractNum>
   <w:num w:numId="1" w16cid:durableId="1731537013">
+    <w:abstractNumId w:val="21"/>
+  </w:num>
+  <w:num w:numId="2" w16cid:durableId="1905555835">
     <w:abstractNumId w:val="12"/>
   </w:num>
-  <w:num w:numId="2" w16cid:durableId="1905555835">
+  <w:num w:numId="3" w16cid:durableId="639000178">
+    <w:abstractNumId w:val="19"/>
+  </w:num>
+  <w:num w:numId="4" w16cid:durableId="1967810139">
+    <w:abstractNumId w:val="7"/>
+  </w:num>
+  <w:num w:numId="5" w16cid:durableId="609750883">
+    <w:abstractNumId w:val="28"/>
+  </w:num>
+  <w:num w:numId="6" w16cid:durableId="2058894359">
     <w:abstractNumId w:val="4"/>
   </w:num>
-  <w:num w:numId="3" w16cid:durableId="639000178">
-    <w:abstractNumId w:val="10"/>
-  </w:num>
-  <w:num w:numId="4" w16cid:durableId="1967810139">
-    <w:abstractNumId w:val="2"/>
-  </w:num>
-  <w:num w:numId="5" w16cid:durableId="609750883">
-    <w:abstractNumId w:val="16"/>
-  </w:num>
-  <w:num w:numId="6" w16cid:durableId="2058894359">
-    <w:abstractNumId w:val="0"/>
-  </w:num>
   <w:num w:numId="7" w16cid:durableId="712660261">
-    <w:abstractNumId w:val="9"/>
+    <w:abstractNumId w:val="17"/>
   </w:num>
   <w:num w:numId="8" w16cid:durableId="16583857">
-    <w:abstractNumId w:val="4"/>
+    <w:abstractNumId w:val="12"/>
     <w:lvlOverride w:ilvl="0">
       <w:startOverride w:val="1"/>
     </w:lvlOverride>
   </w:num>
   <w:num w:numId="9" w16cid:durableId="936131272">
-    <w:abstractNumId w:val="4"/>
+    <w:abstractNumId w:val="12"/>
     <w:lvlOverride w:ilvl="0">
       <w:startOverride w:val="1"/>
     </w:lvlOverride>
   </w:num>
   <w:num w:numId="10" w16cid:durableId="1803499908">
+    <w:abstractNumId w:val="27"/>
+  </w:num>
+  <w:num w:numId="11" w16cid:durableId="803742219">
+    <w:abstractNumId w:val="20"/>
+  </w:num>
+  <w:num w:numId="12" w16cid:durableId="93135654">
+    <w:abstractNumId w:val="16"/>
+  </w:num>
+  <w:num w:numId="13" w16cid:durableId="1459832194">
+    <w:abstractNumId w:val="13"/>
+  </w:num>
+  <w:num w:numId="14" w16cid:durableId="861670632">
+    <w:abstractNumId w:val="24"/>
+  </w:num>
+  <w:num w:numId="15" w16cid:durableId="924190203">
+    <w:abstractNumId w:val="23"/>
+  </w:num>
+  <w:num w:numId="16" w16cid:durableId="1103303847">
+    <w:abstractNumId w:val="10"/>
+  </w:num>
+  <w:num w:numId="17" w16cid:durableId="1198274741">
+    <w:abstractNumId w:val="5"/>
+  </w:num>
+  <w:num w:numId="18" w16cid:durableId="1440950616">
+    <w:abstractNumId w:val="14"/>
+  </w:num>
+  <w:num w:numId="19" w16cid:durableId="1960914263">
     <w:abstractNumId w:val="15"/>
   </w:num>
-  <w:num w:numId="11" w16cid:durableId="803742219">
-    <w:abstractNumId w:val="11"/>
-  </w:num>
-  <w:num w:numId="12" w16cid:durableId="93135654">
-    <w:abstractNumId w:val="8"/>
-  </w:num>
-  <w:num w:numId="13" w16cid:durableId="1459832194">
-    <w:abstractNumId w:val="5"/>
-  </w:num>
-  <w:num w:numId="14" w16cid:durableId="861670632">
-    <w:abstractNumId w:val="14"/>
-  </w:num>
-  <w:num w:numId="15" w16cid:durableId="924190203">
-    <w:abstractNumId w:val="13"/>
-  </w:num>
-  <w:num w:numId="16" w16cid:durableId="1103303847">
-    <w:abstractNumId w:val="3"/>
-  </w:num>
-  <w:num w:numId="17" w16cid:durableId="1198274741">
-    <w:abstractNumId w:val="1"/>
-  </w:num>
-  <w:num w:numId="18" w16cid:durableId="1440950616">
-    <w:abstractNumId w:val="6"/>
-  </w:num>
-  <w:num w:numId="19" w16cid:durableId="1960914263">
-    <w:abstractNumId w:val="7"/>
-  </w:num>
   <w:num w:numId="20" w16cid:durableId="609825268">
-    <w:abstractNumId w:val="4"/>
+    <w:abstractNumId w:val="12"/>
     <w:lvlOverride w:ilvl="0">
       <w:startOverride w:val="1"/>
     </w:lvlOverride>
   </w:num>
   <w:num w:numId="21" w16cid:durableId="1692804990">
-    <w:abstractNumId w:val="9"/>
+    <w:abstractNumId w:val="17"/>
     <w:lvlOverride w:ilvl="0">
       <w:startOverride w:val="1"/>
     </w:lvlOverride>
   </w:num>
   <w:num w:numId="22" w16cid:durableId="1835804542">
-    <w:abstractNumId w:val="9"/>
+    <w:abstractNumId w:val="17"/>
     <w:lvlOverride w:ilvl="0">
       <w:startOverride w:val="1"/>
     </w:lvlOverride>
   </w:num>
   <w:num w:numId="23" w16cid:durableId="70201890">
-    <w:abstractNumId w:val="9"/>
+    <w:abstractNumId w:val="17"/>
     <w:lvlOverride w:ilvl="0">
       <w:startOverride w:val="1"/>
     </w:lvlOverride>
   </w:num>
   <w:num w:numId="24" w16cid:durableId="1701511683">
-    <w:abstractNumId w:val="9"/>
+    <w:abstractNumId w:val="17"/>
     <w:lvlOverride w:ilvl="0">
       <w:startOverride w:val="1"/>
     </w:lvlOverride>
+  </w:num>
+  <w:num w:numId="25" w16cid:durableId="590547285">
+    <w:abstractNumId w:val="26"/>
+  </w:num>
+  <w:num w:numId="26" w16cid:durableId="834145066">
+    <w:abstractNumId w:val="11"/>
+  </w:num>
+  <w:num w:numId="27" w16cid:durableId="1469128218">
+    <w:abstractNumId w:val="0"/>
+  </w:num>
+  <w:num w:numId="28" w16cid:durableId="371805832">
+    <w:abstractNumId w:val="6"/>
+  </w:num>
+  <w:num w:numId="29" w16cid:durableId="1458068751">
+    <w:abstractNumId w:val="3"/>
+  </w:num>
+  <w:num w:numId="30" w16cid:durableId="965619040">
+    <w:abstractNumId w:val="18"/>
+  </w:num>
+  <w:num w:numId="31" w16cid:durableId="989988083">
+    <w:abstractNumId w:val="1"/>
+  </w:num>
+  <w:num w:numId="32" w16cid:durableId="1995142522">
+    <w:abstractNumId w:val="2"/>
+  </w:num>
+  <w:num w:numId="33" w16cid:durableId="1354456936">
+    <w:abstractNumId w:val="9"/>
+  </w:num>
+  <w:num w:numId="34" w16cid:durableId="1557009170">
+    <w:abstractNumId w:val="25"/>
+  </w:num>
+  <w:num w:numId="35" w16cid:durableId="828864731">
+    <w:abstractNumId w:val="22"/>
+  </w:num>
+  <w:num w:numId="36" w16cid:durableId="132455903">
+    <w:abstractNumId w:val="12"/>
+    <w:lvlOverride w:ilvl="0">
+      <w:startOverride w:val="1"/>
+    </w:lvlOverride>
+  </w:num>
+  <w:num w:numId="37" w16cid:durableId="597521444">
+    <w:abstractNumId w:val="17"/>
+    <w:lvlOverride w:ilvl="0">
+      <w:startOverride w:val="1"/>
+    </w:lvlOverride>
+  </w:num>
+  <w:num w:numId="38" w16cid:durableId="1360887201">
+    <w:abstractNumId w:val="17"/>
+    <w:lvlOverride w:ilvl="0">
+      <w:startOverride w:val="1"/>
+    </w:lvlOverride>
+  </w:num>
+  <w:num w:numId="39" w16cid:durableId="538664853">
+    <w:abstractNumId w:val="8"/>
   </w:num>
 </w:numbering>
 </file>
@@ -12137,21 +14579,24 @@
     <w:next w:val="Normal"/>
     <w:link w:val="Heading4Char"/>
     <w:uiPriority w:val="9"/>
-    <w:semiHidden/>
     <w:unhideWhenUsed/>
     <w:qFormat/>
-    <w:rsid w:val="00503EE1"/>
+    <w:rsid w:val="0032797E"/>
     <w:pPr>
       <w:keepNext/>
       <w:keepLines/>
+      <w:numPr>
+        <w:numId w:val="39"/>
+      </w:numPr>
       <w:spacing w:before="80" w:after="40"/>
       <w:outlineLvl w:val="3"/>
     </w:pPr>
     <w:rPr>
       <w:rFonts w:eastAsiaTheme="majorEastAsia" w:cstheme="majorBidi"/>
+      <w:b/>
       <w:i/>
       <w:iCs/>
-      <w:color w:val="2F5496" w:themeColor="accent1" w:themeShade="BF"/>
+      <w:color w:val="000000" w:themeColor="text1"/>
     </w:rPr>
   </w:style>
   <w:style w:type="paragraph" w:styleId="Heading5">
@@ -12337,13 +14782,13 @@
     <w:basedOn w:val="DefaultParagraphFont"/>
     <w:link w:val="Heading4"/>
     <w:uiPriority w:val="9"/>
-    <w:semiHidden/>
-    <w:rsid w:val="00503EE1"/>
+    <w:rsid w:val="0032797E"/>
     <w:rPr>
-      <w:rFonts w:eastAsiaTheme="majorEastAsia" w:cstheme="majorBidi"/>
+      <w:rFonts w:ascii="Times New Roman" w:eastAsiaTheme="majorEastAsia" w:hAnsi="Times New Roman" w:cstheme="majorBidi"/>
+      <w:b/>
       <w:i/>
       <w:iCs/>
-      <w:color w:val="2F5496" w:themeColor="accent1" w:themeShade="BF"/>
+      <w:color w:val="000000" w:themeColor="text1"/>
     </w:rPr>
   </w:style>
   <w:style w:type="character" w:customStyle="1" w:styleId="Heading5Char">

</xml_diff>